<commit_message>
agrego con las pruebas AAA aplicadas al sprint 3 y la documentacion
</commit_message>
<xml_diff>
--- a/docs/sprint 3/sprint 3.docx
+++ b/docs/sprint 3/sprint 3.docx
@@ -1,6 +1,6 @@
 
 <file path=word/document.xml><?xml version="1.0" encoding="utf-8"?>
-<w:document xmlns:wpc="http://schemas.microsoft.com/office/word/2010/wordprocessingCanvas" xmlns:cx="http://schemas.microsoft.com/office/drawing/2014/chartex" xmlns:cx1="http://schemas.microsoft.com/office/drawing/2015/9/8/chartex" xmlns:cx2="http://schemas.microsoft.com/office/drawing/2015/10/21/chartex" xmlns:cx3="http://schemas.microsoft.com/office/drawing/2016/5/9/chartex" xmlns:cx4="http://schemas.microsoft.com/office/drawing/2016/5/10/chartex" xmlns:cx5="http://schemas.microsoft.com/office/drawing/2016/5/11/chartex" xmlns:cx6="http://schemas.microsoft.com/office/drawing/2016/5/12/chartex" xmlns:cx7="http://schemas.microsoft.com/office/drawing/2016/5/13/chartex" xmlns:cx8="http://schemas.microsoft.com/office/drawing/2016/5/14/chartex" xmlns:mc="http://schemas.openxmlformats.org/markup-compatibility/2006" xmlns:aink="http://schemas.microsoft.com/office/drawing/2016/ink" xmlns:am3d="http://schemas.microsoft.com/office/drawing/2017/model3d" xmlns:o="urn:schemas-microsoft-com:office:office" xmlns:r="http://schemas.openxmlformats.org/officeDocument/2006/relationships" xmlns:m="http://schemas.openxmlformats.org/officeDocument/2006/math" xmlns:v="urn:schemas-microsoft-com:vml" xmlns:wp14="http://schemas.microsoft.com/office/word/2010/wordprocessingDrawing" xmlns:wp="http://schemas.openxmlformats.org/drawingml/2006/wordprocessingDrawing" xmlns:w10="urn:schemas-microsoft-com:office:word" xmlns:w="http://schemas.openxmlformats.org/wordprocessingml/2006/main" xmlns:w14="http://schemas.microsoft.com/office/word/2010/wordml" xmlns:w15="http://schemas.microsoft.com/office/word/2012/wordml" xmlns:w16cid="http://schemas.microsoft.com/office/word/2016/wordml/cid" xmlns:w16se="http://schemas.microsoft.com/office/word/2015/wordml/symex" xmlns:wpg="http://schemas.microsoft.com/office/word/2010/wordprocessingGroup" xmlns:wpi="http://schemas.microsoft.com/office/word/2010/wordprocessingInk" xmlns:wne="http://schemas.microsoft.com/office/word/2006/wordml" xmlns:wps="http://schemas.microsoft.com/office/word/2010/wordprocessingShape" mc:Ignorable="w14 w15 w16se w16cid wp14">
+<w:document xmlns:wpc="http://schemas.microsoft.com/office/word/2010/wordprocessingCanvas" xmlns:cx="http://schemas.microsoft.com/office/drawing/2014/chartex" xmlns:cx1="http://schemas.microsoft.com/office/drawing/2015/9/8/chartex" xmlns:cx2="http://schemas.microsoft.com/office/drawing/2015/10/21/chartex" xmlns:cx3="http://schemas.microsoft.com/office/drawing/2016/5/9/chartex" xmlns:cx4="http://schemas.microsoft.com/office/drawing/2016/5/10/chartex" xmlns:cx5="http://schemas.microsoft.com/office/drawing/2016/5/11/chartex" xmlns:cx6="http://schemas.microsoft.com/office/drawing/2016/5/12/chartex" xmlns:cx7="http://schemas.microsoft.com/office/drawing/2016/5/13/chartex" xmlns:cx8="http://schemas.microsoft.com/office/drawing/2016/5/14/chartex" xmlns:mc="http://schemas.openxmlformats.org/markup-compatibility/2006" xmlns:aink="http://schemas.microsoft.com/office/drawing/2016/ink" xmlns:am3d="http://schemas.microsoft.com/office/drawing/2017/model3d" xmlns:o="urn:schemas-microsoft-com:office:office" xmlns:r="http://schemas.openxmlformats.org/officeDocument/2006/relationships" xmlns:m="http://schemas.openxmlformats.org/officeDocument/2006/math" xmlns:v="urn:schemas-microsoft-com:vml" xmlns:wp14="http://schemas.microsoft.com/office/word/2010/wordprocessingDrawing" xmlns:wp="http://schemas.openxmlformats.org/drawingml/2006/wordprocessingDrawing" xmlns:w10="urn:schemas-microsoft-com:office:word" xmlns:w="http://schemas.openxmlformats.org/wordprocessingml/2006/main" xmlns:w14="http://schemas.microsoft.com/office/word/2010/wordml" xmlns:w15="http://schemas.microsoft.com/office/word/2012/wordml" xmlns:w16cex="http://schemas.microsoft.com/office/word/2018/wordml/cex" xmlns:w16cid="http://schemas.microsoft.com/office/word/2016/wordml/cid" xmlns:w16="http://schemas.microsoft.com/office/word/2018/wordml" xmlns:w16sdtdh="http://schemas.microsoft.com/office/word/2020/wordml/sdtdatahash" xmlns:w16se="http://schemas.microsoft.com/office/word/2015/wordml/symex" xmlns:wpg="http://schemas.microsoft.com/office/word/2010/wordprocessingGroup" xmlns:wpi="http://schemas.microsoft.com/office/word/2010/wordprocessingInk" xmlns:wne="http://schemas.microsoft.com/office/word/2006/wordml" xmlns:wps="http://schemas.microsoft.com/office/word/2010/wordprocessingShape" mc:Ignorable="w14 w15 w16se w16cid w16 w16cex w16sdtdh wp14">
   <w:body>
     <w:p>
       <w:pPr>
@@ -82,7 +82,7 @@
               </wp:anchor>
             </w:drawing>
           </mc:Choice>
-          <mc:Fallback xmlns:oel="http://schemas.microsoft.com/office/2019/extlst" xmlns:w16sdtdh="http://schemas.microsoft.com/office/word/2020/wordml/sdtdatahash" xmlns:w16="http://schemas.microsoft.com/office/word/2018/wordml" xmlns:w16cex="http://schemas.microsoft.com/office/word/2018/wordml/cex">
+          <mc:Fallback xmlns:oel="http://schemas.microsoft.com/office/2019/extlst">
             <w:pict>
               <v:rect w14:anchorId="2D05ECE6" id="Rectángulo 3" o:spid="_x0000_s1026" alt="rectángulo blanco para texto en portada" style="position:absolute;margin-left:-15.95pt;margin-top:73.85pt;width:310.15pt;height:681.65pt;z-index:-251656192;visibility:visible;mso-wrap-style:square;mso-width-percent:0;mso-height-percent:0;mso-wrap-distance-left:9pt;mso-wrap-distance-top:0;mso-wrap-distance-right:9pt;mso-wrap-distance-bottom:0;mso-position-horizontal:absolute;mso-position-horizontal-relative:text;mso-position-vertical:absolute;mso-position-vertical-relative:page;mso-width-percent:0;mso-height-percent:0;mso-width-relative:margin;mso-height-relative:margin;v-text-anchor:middle" o:gfxdata="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" fillcolor="white [3212]" stroked="f" strokeweight="2pt">
                 <w10:wrap anchory="page"/>
@@ -300,7 +300,7 @@
                     </wp:inline>
                   </w:drawing>
                 </mc:Choice>
-                <mc:Fallback xmlns:w16sdtdh="http://schemas.microsoft.com/office/word/2020/wordml/sdtdatahash" xmlns:w16="http://schemas.microsoft.com/office/word/2018/wordml" xmlns:w16cex="http://schemas.microsoft.com/office/word/2018/wordml/cex">
+                <mc:Fallback>
                   <w:pict>
                     <v:shapetype w14:anchorId="0CB9EEAA" id="_x0000_t202" coordsize="21600,21600" o:spt="202" path="m,l,21600r21600,l21600,xe">
                       <v:stroke joinstyle="miter"/>
@@ -436,7 +436,7 @@
                     </wp:inline>
                   </w:drawing>
                 </mc:Choice>
-                <mc:Fallback xmlns:oel="http://schemas.microsoft.com/office/2019/extlst" xmlns:w16sdtdh="http://schemas.microsoft.com/office/word/2020/wordml/sdtdatahash" xmlns:w16="http://schemas.microsoft.com/office/word/2018/wordml" xmlns:w16cex="http://schemas.microsoft.com/office/word/2018/wordml/cex">
+                <mc:Fallback xmlns:oel="http://schemas.microsoft.com/office/2019/extlst">
                   <w:pict>
                     <v:line w14:anchorId="3C7809CC" id="Conector recto 5" o:spid="_x0000_s1026" alt="divisor de texto" style="visibility:visible;mso-wrap-style:square;mso-left-percent:-10001;mso-top-percent:-10001;mso-position-horizontal:absolute;mso-position-horizontal-relative:char;mso-position-vertical:absolute;mso-position-vertical-relative:line;mso-left-percent:-10001;mso-top-percent:-10001" from="0,0" to="109.5pt,0" o:gfxdata="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" strokecolor="#082a75 [3215]" strokeweight="3pt">
                       <w10:anchorlock/>
@@ -538,7 +538,7 @@
                     <w:noProof/>
                     <w:lang w:bidi="es-ES"/>
                   </w:rPr>
-                  <w:t>9 mayo</w:t>
+                  <w:t>10 mayo</w:t>
                 </w:r>
                 <w:r>
                   <w:rPr>
@@ -614,7 +614,7 @@
                     </wp:inline>
                   </w:drawing>
                 </mc:Choice>
-                <mc:Fallback xmlns:oel="http://schemas.microsoft.com/office/2019/extlst" xmlns:w16sdtdh="http://schemas.microsoft.com/office/word/2020/wordml/sdtdatahash" xmlns:w16="http://schemas.microsoft.com/office/word/2018/wordml" xmlns:w16cex="http://schemas.microsoft.com/office/word/2018/wordml/cex">
+                <mc:Fallback xmlns:oel="http://schemas.microsoft.com/office/2019/extlst">
                   <w:pict>
                     <v:line w14:anchorId="2EAC2734" id="Conector recto 6" o:spid="_x0000_s1026" alt="divisor de texto" style="visibility:visible;mso-wrap-style:square;mso-left-percent:-10001;mso-top-percent:-10001;mso-position-horizontal:absolute;mso-position-horizontal-relative:char;mso-position-vertical:absolute;mso-position-vertical-relative:line;mso-left-percent:-10001;mso-top-percent:-10001" from="0,0" to="117.65pt,0" o:gfxdata="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" strokecolor="#082a75 [3215]" strokeweight="3pt">
                       <w10:anchorlock/>
@@ -861,7 +861,7 @@
               </wp:anchor>
             </w:drawing>
           </mc:Choice>
-          <mc:Fallback xmlns:w16sdtdh="http://schemas.microsoft.com/office/word/2020/wordml/sdtdatahash" xmlns:w16="http://schemas.microsoft.com/office/word/2018/wordml" xmlns:w16cex="http://schemas.microsoft.com/office/word/2018/wordml/cex">
+          <mc:Fallback>
             <w:pict>
               <v:rect w14:anchorId="65894E13" id="Rectángulo 2" o:spid="_x0000_s1026" alt="rectángulo de color" style="position:absolute;margin-left:-58.7pt;margin-top:525pt;width:611.1pt;height:316.5pt;z-index:-251657216;visibility:visible;mso-wrap-style:square;mso-height-percent:0;mso-wrap-distance-left:9pt;mso-wrap-distance-top:0;mso-wrap-distance-right:9pt;mso-wrap-distance-bottom:0;mso-position-horizontal:absolute;mso-position-horizontal-relative:text;mso-position-vertical:absolute;mso-position-vertical-relative:page;mso-height-percent:0;mso-height-relative:margin;v-text-anchor:middle" o:gfxdata="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" fillcolor="#34aba2 [3206]" stroked="f" strokeweight="2pt">
                 <w10:wrap anchory="page"/>
@@ -2182,21 +2182,7 @@
         <w:rPr>
           <w:bCs/>
         </w:rPr>
-        <w:t xml:space="preserve">Producto </w:t>
-      </w:r>
-      <w:proofErr w:type="spellStart"/>
-      <w:r>
-        <w:rPr>
-          <w:bCs/>
-        </w:rPr>
-        <w:t>Owner</w:t>
-      </w:r>
-      <w:proofErr w:type="spellEnd"/>
-      <w:r>
-        <w:rPr>
-          <w:bCs/>
-        </w:rPr>
-        <w:t>:</w:t>
+        <w:t>Producto Owner:</w:t>
       </w:r>
       <w:r>
         <w:rPr>
@@ -2225,35 +2211,7 @@
         <w:rPr>
           <w:b w:val="0"/>
         </w:rPr>
-        <w:t xml:space="preserve"> </w:t>
-      </w:r>
-      <w:proofErr w:type="spellStart"/>
-      <w:r>
-        <w:rPr>
-          <w:b w:val="0"/>
-        </w:rPr>
-        <w:t>Nathalia</w:t>
-      </w:r>
-      <w:proofErr w:type="spellEnd"/>
-      <w:r>
-        <w:rPr>
-          <w:b w:val="0"/>
-        </w:rPr>
-        <w:t xml:space="preserve"> </w:t>
-      </w:r>
-      <w:proofErr w:type="spellStart"/>
-      <w:r>
-        <w:rPr>
-          <w:b w:val="0"/>
-        </w:rPr>
-        <w:t>Mejia</w:t>
-      </w:r>
-      <w:proofErr w:type="spellEnd"/>
-      <w:r>
-        <w:rPr>
-          <w:b w:val="0"/>
-        </w:rPr>
-        <w:t xml:space="preserve"> Buitrago.</w:t>
+        <w:t xml:space="preserve"> Nathalia Mejia Buitrago.</w:t>
       </w:r>
     </w:p>
     <w:p>
@@ -2270,55 +2228,13 @@
         <w:rPr>
           <w:bCs/>
         </w:rPr>
-        <w:t xml:space="preserve">Scrum </w:t>
-      </w:r>
-      <w:proofErr w:type="spellStart"/>
-      <w:r>
-        <w:rPr>
-          <w:bCs/>
-        </w:rPr>
-        <w:t>Team</w:t>
-      </w:r>
-      <w:proofErr w:type="spellEnd"/>
-      <w:r>
-        <w:rPr>
-          <w:bCs/>
-        </w:rPr>
-        <w:t xml:space="preserve">: </w:t>
-      </w:r>
-      <w:r>
-        <w:rPr>
-          <w:b w:val="0"/>
-        </w:rPr>
-        <w:t xml:space="preserve">Isaura Alexandra Banguera Ruiz - </w:t>
-      </w:r>
-      <w:proofErr w:type="spellStart"/>
-      <w:r>
-        <w:rPr>
-          <w:b w:val="0"/>
-        </w:rPr>
-        <w:t>Nathalia</w:t>
-      </w:r>
-      <w:proofErr w:type="spellEnd"/>
-      <w:r>
-        <w:rPr>
-          <w:b w:val="0"/>
-        </w:rPr>
-        <w:t xml:space="preserve"> </w:t>
-      </w:r>
-      <w:proofErr w:type="spellStart"/>
-      <w:r>
-        <w:rPr>
-          <w:b w:val="0"/>
-        </w:rPr>
-        <w:t>Mejia</w:t>
-      </w:r>
-      <w:proofErr w:type="spellEnd"/>
-      <w:r>
-        <w:rPr>
-          <w:b w:val="0"/>
-        </w:rPr>
-        <w:t xml:space="preserve"> Buitrago.</w:t>
+        <w:t xml:space="preserve">Scrum Team: </w:t>
+      </w:r>
+      <w:r>
+        <w:rPr>
+          <w:b w:val="0"/>
+        </w:rPr>
+        <w:t>Isaura Alexandra Banguera Ruiz - Nathalia Mejia Buitrago.</w:t>
       </w:r>
     </w:p>
     <w:p>
@@ -2372,35 +2288,7 @@
         <w:rPr>
           <w:b w:val="0"/>
         </w:rPr>
-        <w:t xml:space="preserve"> </w:t>
-      </w:r>
-      <w:proofErr w:type="spellStart"/>
-      <w:r>
-        <w:rPr>
-          <w:b w:val="0"/>
-        </w:rPr>
-        <w:t>Nathalia</w:t>
-      </w:r>
-      <w:proofErr w:type="spellEnd"/>
-      <w:r>
-        <w:rPr>
-          <w:b w:val="0"/>
-        </w:rPr>
-        <w:t xml:space="preserve"> </w:t>
-      </w:r>
-      <w:proofErr w:type="spellStart"/>
-      <w:r>
-        <w:rPr>
-          <w:b w:val="0"/>
-        </w:rPr>
-        <w:t>Mejia</w:t>
-      </w:r>
-      <w:proofErr w:type="spellEnd"/>
-      <w:r>
-        <w:rPr>
-          <w:b w:val="0"/>
-        </w:rPr>
-        <w:t xml:space="preserve"> Buitrago.</w:t>
+        <w:t xml:space="preserve"> Nathalia Mejia Buitrago.</w:t>
       </w:r>
     </w:p>
     <w:p>
@@ -2436,53 +2324,17 @@
           <w:b w:val="0"/>
         </w:rPr>
       </w:pPr>
-      <w:proofErr w:type="spellStart"/>
       <w:r>
         <w:rPr>
           <w:bCs/>
         </w:rPr>
-        <w:t>Tester</w:t>
-      </w:r>
-      <w:proofErr w:type="spellEnd"/>
-      <w:r>
-        <w:rPr>
-          <w:bCs/>
-        </w:rPr>
-        <w:t>:</w:t>
-      </w:r>
-      <w:r>
-        <w:rPr>
-          <w:b w:val="0"/>
-        </w:rPr>
-        <w:t xml:space="preserve"> </w:t>
-      </w:r>
-      <w:proofErr w:type="spellStart"/>
-      <w:r>
-        <w:rPr>
-          <w:b w:val="0"/>
-        </w:rPr>
-        <w:t>Nathalia</w:t>
-      </w:r>
-      <w:proofErr w:type="spellEnd"/>
-      <w:r>
-        <w:rPr>
-          <w:b w:val="0"/>
-        </w:rPr>
-        <w:t xml:space="preserve"> </w:t>
-      </w:r>
-      <w:proofErr w:type="spellStart"/>
-      <w:r>
-        <w:rPr>
-          <w:b w:val="0"/>
-        </w:rPr>
-        <w:t>Mejia</w:t>
-      </w:r>
-      <w:proofErr w:type="spellEnd"/>
-      <w:r>
-        <w:rPr>
-          <w:b w:val="0"/>
-        </w:rPr>
-        <w:t xml:space="preserve"> Buitrago.</w:t>
+        <w:t>Tester:</w:t>
+      </w:r>
+      <w:r>
+        <w:rPr>
+          <w:b w:val="0"/>
+        </w:rPr>
+        <w:t xml:space="preserve"> Nathalia Mejia Buitrago.</w:t>
       </w:r>
     </w:p>
     <w:p>
@@ -2518,53 +2370,17 @@
           <w:b w:val="0"/>
         </w:rPr>
       </w:pPr>
-      <w:proofErr w:type="spellStart"/>
       <w:r>
         <w:rPr>
           <w:bCs/>
         </w:rPr>
-        <w:t>Team</w:t>
-      </w:r>
-      <w:proofErr w:type="spellEnd"/>
-      <w:r>
-        <w:rPr>
-          <w:bCs/>
-        </w:rPr>
-        <w:t xml:space="preserve"> lead:</w:t>
-      </w:r>
-      <w:r>
-        <w:rPr>
-          <w:b w:val="0"/>
-        </w:rPr>
-        <w:t xml:space="preserve"> </w:t>
-      </w:r>
-      <w:proofErr w:type="spellStart"/>
-      <w:r>
-        <w:rPr>
-          <w:b w:val="0"/>
-        </w:rPr>
-        <w:t>Nathalia</w:t>
-      </w:r>
-      <w:proofErr w:type="spellEnd"/>
-      <w:r>
-        <w:rPr>
-          <w:b w:val="0"/>
-        </w:rPr>
-        <w:t xml:space="preserve"> </w:t>
-      </w:r>
-      <w:proofErr w:type="spellStart"/>
-      <w:r>
-        <w:rPr>
-          <w:b w:val="0"/>
-        </w:rPr>
-        <w:t>Mejia</w:t>
-      </w:r>
-      <w:proofErr w:type="spellEnd"/>
-      <w:r>
-        <w:rPr>
-          <w:b w:val="0"/>
-        </w:rPr>
-        <w:t xml:space="preserve"> Buitrago.</w:t>
+        <w:t>Team lead:</w:t>
+      </w:r>
+      <w:r>
+        <w:rPr>
+          <w:b w:val="0"/>
+        </w:rPr>
+        <w:t xml:space="preserve"> Nathalia Mejia Buitrago.</w:t>
       </w:r>
     </w:p>
     <w:p>
@@ -2581,55 +2397,13 @@
         <w:rPr>
           <w:bCs/>
         </w:rPr>
-        <w:t xml:space="preserve">Desarrolladores back </w:t>
-      </w:r>
-      <w:proofErr w:type="spellStart"/>
-      <w:r>
-        <w:rPr>
-          <w:bCs/>
-        </w:rPr>
-        <w:t>end</w:t>
-      </w:r>
-      <w:proofErr w:type="spellEnd"/>
-      <w:r>
-        <w:rPr>
-          <w:bCs/>
-        </w:rPr>
-        <w:t>:</w:t>
-      </w:r>
-      <w:r>
-        <w:rPr>
-          <w:b w:val="0"/>
-        </w:rPr>
-        <w:t xml:space="preserve"> </w:t>
-      </w:r>
-      <w:proofErr w:type="spellStart"/>
-      <w:r>
-        <w:rPr>
-          <w:b w:val="0"/>
-        </w:rPr>
-        <w:t>Nathalia</w:t>
-      </w:r>
-      <w:proofErr w:type="spellEnd"/>
-      <w:r>
-        <w:rPr>
-          <w:b w:val="0"/>
-        </w:rPr>
-        <w:t xml:space="preserve"> </w:t>
-      </w:r>
-      <w:proofErr w:type="spellStart"/>
-      <w:r>
-        <w:rPr>
-          <w:b w:val="0"/>
-        </w:rPr>
-        <w:t>Mejia</w:t>
-      </w:r>
-      <w:proofErr w:type="spellEnd"/>
-      <w:r>
-        <w:rPr>
-          <w:b w:val="0"/>
-        </w:rPr>
-        <w:t xml:space="preserve"> Buitrago - Isaura Alexandra Banguera Ruiz.</w:t>
+        <w:t>Desarrolladores back end:</w:t>
+      </w:r>
+      <w:r>
+        <w:rPr>
+          <w:b w:val="0"/>
+        </w:rPr>
+        <w:t xml:space="preserve"> Nathalia Mejia Buitrago - Isaura Alexandra Banguera Ruiz.</w:t>
       </w:r>
     </w:p>
     <w:p>
@@ -2655,63 +2429,13 @@
         <w:rPr>
           <w:bCs/>
         </w:rPr>
-        <w:t xml:space="preserve">Desarrolladores Front </w:t>
-      </w:r>
-      <w:proofErr w:type="spellStart"/>
-      <w:r>
-        <w:rPr>
-          <w:bCs/>
-        </w:rPr>
-        <w:t>End</w:t>
-      </w:r>
-      <w:proofErr w:type="spellEnd"/>
-      <w:r>
-        <w:rPr>
-          <w:bCs/>
-        </w:rPr>
-        <w:t xml:space="preserve">: </w:t>
-      </w:r>
-      <w:proofErr w:type="spellStart"/>
-      <w:r>
-        <w:rPr>
-          <w:b w:val="0"/>
-        </w:rPr>
-        <w:t>Nathalia</w:t>
-      </w:r>
-      <w:proofErr w:type="spellEnd"/>
-      <w:r>
-        <w:rPr>
-          <w:b w:val="0"/>
-        </w:rPr>
-        <w:t xml:space="preserve"> </w:t>
-      </w:r>
-      <w:proofErr w:type="spellStart"/>
-      <w:r>
-        <w:rPr>
-          <w:b w:val="0"/>
-        </w:rPr>
-        <w:t>Mejia</w:t>
-      </w:r>
-      <w:proofErr w:type="spellEnd"/>
-      <w:r>
-        <w:rPr>
-          <w:b w:val="0"/>
-        </w:rPr>
-        <w:t xml:space="preserve"> </w:t>
-      </w:r>
-      <w:proofErr w:type="gramStart"/>
-      <w:r>
-        <w:rPr>
-          <w:b w:val="0"/>
-        </w:rPr>
-        <w:t>Buitrago  -</w:t>
-      </w:r>
-      <w:proofErr w:type="gramEnd"/>
-      <w:r>
-        <w:rPr>
-          <w:b w:val="0"/>
-        </w:rPr>
-        <w:t xml:space="preserve"> Isaura Alexandra Banguera Rui</w:t>
+        <w:t xml:space="preserve">Desarrolladores Front End: </w:t>
+      </w:r>
+      <w:r>
+        <w:rPr>
+          <w:b w:val="0"/>
+        </w:rPr>
+        <w:t>Nathalia Mejia Buitrago  - Isaura Alexandra Banguera Rui</w:t>
       </w:r>
     </w:p>
     <w:p>
@@ -2898,15 +2622,7 @@
               <w:cnfStyle w:val="000000100000" w:firstRow="0" w:lastRow="0" w:firstColumn="0" w:lastColumn="0" w:oddVBand="0" w:evenVBand="0" w:oddHBand="1" w:evenHBand="0" w:firstRowFirstColumn="0" w:firstRowLastColumn="0" w:lastRowFirstColumn="0" w:lastRowLastColumn="0"/>
             </w:pPr>
             <w:r>
-              <w:t>Asignar roles con permisos específicos (</w:t>
-            </w:r>
-            <w:proofErr w:type="spellStart"/>
-            <w:r>
-              <w:t>admin</w:t>
-            </w:r>
-            <w:proofErr w:type="spellEnd"/>
-            <w:r>
-              <w:t>, empleado, gerente).</w:t>
+              <w:t>Asignar roles con permisos específicos (admin, empleado, gerente).</w:t>
             </w:r>
           </w:p>
           <w:p>
@@ -3676,14 +3392,9 @@
       <w:pPr>
         <w:pStyle w:val="Ttulo1"/>
       </w:pPr>
-      <w:proofErr w:type="spellStart"/>
       <w:r>
         <w:lastRenderedPageBreak/>
-        <w:t>Product</w:t>
-      </w:r>
-      <w:proofErr w:type="spellEnd"/>
-      <w:r>
-        <w:t xml:space="preserve"> Backlog</w:t>
+        <w:t>Product Backlog</w:t>
       </w:r>
     </w:p>
     <w:tbl>
@@ -5379,10 +5090,17 @@
         </w:rPr>
         <w:t>7</w:t>
       </w:r>
+      <w:r>
+        <w:rPr>
+          <w:b/>
+          <w:bCs/>
+        </w:rPr>
+        <w:t>: Visualización de reportes del sistema.</w:t>
+      </w:r>
     </w:p>
     <w:tbl>
       <w:tblPr>
-        <w:tblW w:w="7200" w:type="dxa"/>
+        <w:tblW w:w="10201" w:type="dxa"/>
         <w:tblCellMar>
           <w:left w:w="70" w:type="dxa"/>
           <w:right w:w="70" w:type="dxa"/>
@@ -5390,12 +5108,12 @@
         <w:tblLook w:val="04A0" w:firstRow="1" w:lastRow="0" w:firstColumn="1" w:lastColumn="0" w:noHBand="0" w:noVBand="1"/>
       </w:tblPr>
       <w:tblGrid>
-        <w:gridCol w:w="1200"/>
-        <w:gridCol w:w="1200"/>
-        <w:gridCol w:w="1200"/>
-        <w:gridCol w:w="1200"/>
-        <w:gridCol w:w="1200"/>
-        <w:gridCol w:w="1200"/>
+        <w:gridCol w:w="1210"/>
+        <w:gridCol w:w="1209"/>
+        <w:gridCol w:w="1209"/>
+        <w:gridCol w:w="1209"/>
+        <w:gridCol w:w="1209"/>
+        <w:gridCol w:w="4234"/>
       </w:tblGrid>
       <w:tr>
         <w:trPr>
@@ -5648,7 +5366,7 @@
         </w:tc>
         <w:tc>
           <w:tcPr>
-            <w:tcW w:w="1200" w:type="dxa"/>
+            <w:tcW w:w="4201" w:type="dxa"/>
             <w:tcBorders>
               <w:top w:val="single" w:sz="4" w:space="0" w:color="auto"/>
               <w:left w:val="nil"/>
@@ -5727,7 +5445,7 @@
         </w:tc>
         <w:tc>
           <w:tcPr>
-            <w:tcW w:w="6000" w:type="dxa"/>
+            <w:tcW w:w="9001" w:type="dxa"/>
             <w:gridSpan w:val="5"/>
             <w:tcBorders>
               <w:top w:val="single" w:sz="4" w:space="0" w:color="auto"/>
@@ -5770,7 +5488,7 @@
         </w:trPr>
         <w:tc>
           <w:tcPr>
-            <w:tcW w:w="7200" w:type="dxa"/>
+            <w:tcW w:w="10201" w:type="dxa"/>
             <w:gridSpan w:val="6"/>
             <w:tcBorders>
               <w:top w:val="single" w:sz="4" w:space="0" w:color="auto"/>
@@ -5861,7 +5579,7 @@
         </w:tc>
         <w:tc>
           <w:tcPr>
-            <w:tcW w:w="6000" w:type="dxa"/>
+            <w:tcW w:w="9001" w:type="dxa"/>
             <w:gridSpan w:val="5"/>
             <w:tcBorders>
               <w:top w:val="single" w:sz="4" w:space="0" w:color="auto"/>
@@ -5952,7 +5670,7 @@
         </w:tc>
         <w:tc>
           <w:tcPr>
-            <w:tcW w:w="6000" w:type="dxa"/>
+            <w:tcW w:w="9001" w:type="dxa"/>
             <w:gridSpan w:val="5"/>
             <w:tcBorders>
               <w:top w:val="single" w:sz="4" w:space="0" w:color="auto"/>
@@ -6042,7 +5760,7 @@
         </w:tc>
         <w:tc>
           <w:tcPr>
-            <w:tcW w:w="6000" w:type="dxa"/>
+            <w:tcW w:w="9001" w:type="dxa"/>
             <w:gridSpan w:val="5"/>
             <w:tcBorders>
               <w:top w:val="single" w:sz="4" w:space="0" w:color="auto"/>
@@ -6096,7 +5814,7 @@
         </w:trPr>
         <w:tc>
           <w:tcPr>
-            <w:tcW w:w="7200" w:type="dxa"/>
+            <w:tcW w:w="10201" w:type="dxa"/>
             <w:gridSpan w:val="6"/>
             <w:tcBorders>
               <w:top w:val="single" w:sz="4" w:space="0" w:color="auto"/>
@@ -6187,7 +5905,7 @@
         </w:tc>
         <w:tc>
           <w:tcPr>
-            <w:tcW w:w="6000" w:type="dxa"/>
+            <w:tcW w:w="9001" w:type="dxa"/>
             <w:gridSpan w:val="5"/>
             <w:tcBorders>
               <w:top w:val="single" w:sz="4" w:space="0" w:color="auto"/>
@@ -6277,7 +5995,7 @@
         </w:tc>
         <w:tc>
           <w:tcPr>
-            <w:tcW w:w="6000" w:type="dxa"/>
+            <w:tcW w:w="9001" w:type="dxa"/>
             <w:gridSpan w:val="5"/>
             <w:tcBorders>
               <w:top w:val="single" w:sz="4" w:space="0" w:color="auto"/>
@@ -6311,7 +6029,6 @@
               </w:rPr>
               <w:t xml:space="preserve">Acceda al </w:t>
             </w:r>
-            <w:proofErr w:type="spellStart"/>
             <w:r>
               <w:rPr>
                 <w:rFonts w:ascii="Calibri" w:eastAsia="Times New Roman" w:hAnsi="Calibri" w:cs="Calibri"/>
@@ -6320,9 +6037,8 @@
                 <w:sz w:val="22"/>
                 <w:lang w:val="es-CO" w:eastAsia="es-CO"/>
               </w:rPr>
-              <w:t>modulo</w:t>
-            </w:r>
-            <w:proofErr w:type="spellEnd"/>
+              <w:t>módulo</w:t>
+            </w:r>
             <w:r>
               <w:rPr>
                 <w:rFonts w:ascii="Calibri" w:eastAsia="Times New Roman" w:hAnsi="Calibri" w:cs="Calibri"/>
@@ -6389,7 +6105,7 @@
         </w:tc>
         <w:tc>
           <w:tcPr>
-            <w:tcW w:w="6000" w:type="dxa"/>
+            <w:tcW w:w="9001" w:type="dxa"/>
             <w:gridSpan w:val="5"/>
             <w:tcBorders>
               <w:top w:val="single" w:sz="4" w:space="0" w:color="auto"/>
@@ -6433,7 +6149,7 @@
         </w:trPr>
         <w:tc>
           <w:tcPr>
-            <w:tcW w:w="7200" w:type="dxa"/>
+            <w:tcW w:w="10201" w:type="dxa"/>
             <w:gridSpan w:val="6"/>
             <w:tcBorders>
               <w:top w:val="single" w:sz="4" w:space="0" w:color="auto"/>
@@ -6473,11 +6189,11 @@
       </w:tr>
       <w:tr>
         <w:trPr>
-          <w:trHeight w:val="300"/>
+          <w:trHeight w:val="60"/>
         </w:trPr>
         <w:tc>
           <w:tcPr>
-            <w:tcW w:w="7200" w:type="dxa"/>
+            <w:tcW w:w="10201" w:type="dxa"/>
             <w:gridSpan w:val="6"/>
             <w:tcBorders>
               <w:top w:val="single" w:sz="4" w:space="0" w:color="auto"/>
@@ -6487,7 +6203,6 @@
             </w:tcBorders>
             <w:shd w:val="clear" w:color="auto" w:fill="auto"/>
             <w:noWrap/>
-            <w:vAlign w:val="bottom"/>
             <w:hideMark/>
           </w:tcPr>
           <w:p>
@@ -6502,7 +6217,11 @@
                 <w:lang w:val="es-CO" w:eastAsia="es-CO"/>
               </w:rPr>
             </w:pPr>
-            <w:r>
+          </w:p>
+          <w:p>
+            <w:pPr>
+              <w:spacing w:line="240" w:lineRule="auto"/>
+              <w:jc w:val="center"/>
               <w:rPr>
                 <w:rFonts w:ascii="Calibri" w:eastAsia="Times New Roman" w:hAnsi="Calibri" w:cs="Calibri"/>
                 <w:b w:val="0"/>
@@ -6510,8 +6229,227 @@
                 <w:sz w:val="22"/>
                 <w:lang w:val="es-CO" w:eastAsia="es-CO"/>
               </w:rPr>
-              <w:t> </w:t>
-            </w:r>
+            </w:pPr>
+          </w:p>
+          <w:p>
+            <w:pPr>
+              <w:pStyle w:val="Prrafodelista"/>
+              <w:numPr>
+                <w:ilvl w:val="0"/>
+                <w:numId w:val="34"/>
+              </w:numPr>
+              <w:tabs>
+                <w:tab w:val="left" w:pos="3310"/>
+              </w:tabs>
+              <w:spacing w:line="240" w:lineRule="auto"/>
+              <w:rPr>
+                <w:rFonts w:ascii="Calibri" w:eastAsia="Times New Roman" w:hAnsi="Calibri" w:cs="Calibri"/>
+                <w:b w:val="0"/>
+                <w:color w:val="000000"/>
+                <w:sz w:val="22"/>
+                <w:lang w:val="es-CO" w:eastAsia="es-CO"/>
+              </w:rPr>
+            </w:pPr>
+            <w:r>
+              <w:rPr>
+                <w:rFonts w:ascii="Calibri" w:eastAsia="Times New Roman" w:hAnsi="Calibri" w:cs="Calibri"/>
+                <w:b w:val="0"/>
+                <w:color w:val="000000"/>
+                <w:sz w:val="22"/>
+                <w:lang w:val="es-CO" w:eastAsia="es-CO"/>
+              </w:rPr>
+              <w:t>Ingreso al sistemas con credenciales que correspondan al cargo de gerente.</w:t>
+            </w:r>
+          </w:p>
+          <w:p>
+            <w:pPr>
+              <w:pStyle w:val="Prrafodelista"/>
+              <w:tabs>
+                <w:tab w:val="left" w:pos="3310"/>
+              </w:tabs>
+              <w:spacing w:line="240" w:lineRule="auto"/>
+              <w:rPr>
+                <w:rFonts w:ascii="Calibri" w:eastAsia="Times New Roman" w:hAnsi="Calibri" w:cs="Calibri"/>
+                <w:b w:val="0"/>
+                <w:color w:val="000000"/>
+                <w:sz w:val="22"/>
+                <w:lang w:val="es-CO" w:eastAsia="es-CO"/>
+              </w:rPr>
+            </w:pPr>
+            <w:r>
+              <w:rPr>
+                <w:rFonts w:ascii="Calibri" w:eastAsia="Times New Roman" w:hAnsi="Calibri" w:cs="Calibri"/>
+                <w:b w:val="0"/>
+                <w:noProof/>
+                <w:color w:val="000000"/>
+                <w:sz w:val="22"/>
+                <w:lang w:val="es-CO" w:eastAsia="es-CO"/>
+              </w:rPr>
+              <w:drawing>
+                <wp:inline distT="0" distB="0" distL="0" distR="0" wp14:anchorId="285FA0E7" wp14:editId="6E8D3F34">
+                  <wp:extent cx="3167374" cy="1860605"/>
+                  <wp:effectExtent l="0" t="0" r="0" b="6350"/>
+                  <wp:docPr id="15" name="Imagen 15"/>
+                  <wp:cNvGraphicFramePr>
+                    <a:graphicFrameLocks xmlns:a="http://schemas.openxmlformats.org/drawingml/2006/main" noChangeAspect="1"/>
+                  </wp:cNvGraphicFramePr>
+                  <a:graphic xmlns:a="http://schemas.openxmlformats.org/drawingml/2006/main">
+                    <a:graphicData uri="http://schemas.openxmlformats.org/drawingml/2006/picture">
+                      <pic:pic xmlns:pic="http://schemas.openxmlformats.org/drawingml/2006/picture">
+                        <pic:nvPicPr>
+                          <pic:cNvPr id="15" name="Imagen 15"/>
+                          <pic:cNvPicPr/>
+                        </pic:nvPicPr>
+                        <pic:blipFill>
+                          <a:blip r:embed="rId14" cstate="print">
+                            <a:extLst>
+                              <a:ext uri="{28A0092B-C50C-407E-A947-70E740481C1C}">
+                                <a14:useLocalDpi xmlns:a14="http://schemas.microsoft.com/office/drawing/2010/main" val="0"/>
+                              </a:ext>
+                            </a:extLst>
+                          </a:blip>
+                          <a:stretch>
+                            <a:fillRect/>
+                          </a:stretch>
+                        </pic:blipFill>
+                        <pic:spPr>
+                          <a:xfrm>
+                            <a:off x="0" y="0"/>
+                            <a:ext cx="3211212" cy="1886357"/>
+                          </a:xfrm>
+                          <a:prstGeom prst="rect">
+                            <a:avLst/>
+                          </a:prstGeom>
+                        </pic:spPr>
+                      </pic:pic>
+                    </a:graphicData>
+                  </a:graphic>
+                </wp:inline>
+              </w:drawing>
+            </w:r>
+          </w:p>
+          <w:p>
+            <w:pPr>
+              <w:pStyle w:val="Prrafodelista"/>
+              <w:numPr>
+                <w:ilvl w:val="0"/>
+                <w:numId w:val="34"/>
+              </w:numPr>
+              <w:tabs>
+                <w:tab w:val="left" w:pos="3310"/>
+              </w:tabs>
+              <w:spacing w:line="240" w:lineRule="auto"/>
+              <w:rPr>
+                <w:rFonts w:ascii="Calibri" w:eastAsia="Times New Roman" w:hAnsi="Calibri" w:cs="Calibri"/>
+                <w:b w:val="0"/>
+                <w:color w:val="000000"/>
+                <w:sz w:val="22"/>
+                <w:lang w:val="es-CO" w:eastAsia="es-CO"/>
+              </w:rPr>
+            </w:pPr>
+            <w:r>
+              <w:rPr>
+                <w:rFonts w:ascii="Calibri" w:eastAsia="Times New Roman" w:hAnsi="Calibri" w:cs="Calibri"/>
+                <w:b w:val="0"/>
+                <w:color w:val="000000"/>
+                <w:sz w:val="22"/>
+                <w:lang w:val="es-CO" w:eastAsia="es-CO"/>
+              </w:rPr>
+              <w:t>Accede al modulo de reportes donde se vera los reportes de ventas, compras e inventario.</w:t>
+            </w:r>
+          </w:p>
+          <w:p>
+            <w:pPr>
+              <w:pStyle w:val="Prrafodelista"/>
+              <w:tabs>
+                <w:tab w:val="left" w:pos="3310"/>
+              </w:tabs>
+              <w:spacing w:line="240" w:lineRule="auto"/>
+              <w:rPr>
+                <w:rFonts w:ascii="Calibri" w:eastAsia="Times New Roman" w:hAnsi="Calibri" w:cs="Calibri"/>
+                <w:b w:val="0"/>
+                <w:color w:val="000000"/>
+                <w:sz w:val="22"/>
+                <w:lang w:val="es-CO" w:eastAsia="es-CO"/>
+              </w:rPr>
+            </w:pPr>
+            <w:r>
+              <w:rPr>
+                <w:rFonts w:ascii="Calibri" w:eastAsia="Times New Roman" w:hAnsi="Calibri" w:cs="Calibri"/>
+                <w:b w:val="0"/>
+                <w:noProof/>
+                <w:color w:val="000000"/>
+                <w:sz w:val="22"/>
+                <w:lang w:val="es-CO" w:eastAsia="es-CO"/>
+              </w:rPr>
+              <w:drawing>
+                <wp:inline distT="0" distB="0" distL="0" distR="0" wp14:anchorId="7238D26A" wp14:editId="77FDA842">
+                  <wp:extent cx="5977724" cy="3291840"/>
+                  <wp:effectExtent l="0" t="0" r="4445" b="3810"/>
+                  <wp:docPr id="17" name="Imagen 17"/>
+                  <wp:cNvGraphicFramePr>
+                    <a:graphicFrameLocks xmlns:a="http://schemas.openxmlformats.org/drawingml/2006/main" noChangeAspect="1"/>
+                  </wp:cNvGraphicFramePr>
+                  <a:graphic xmlns:a="http://schemas.openxmlformats.org/drawingml/2006/main">
+                    <a:graphicData uri="http://schemas.openxmlformats.org/drawingml/2006/picture">
+                      <pic:pic xmlns:pic="http://schemas.openxmlformats.org/drawingml/2006/picture">
+                        <pic:nvPicPr>
+                          <pic:cNvPr id="17" name="Imagen 17"/>
+                          <pic:cNvPicPr/>
+                        </pic:nvPicPr>
+                        <pic:blipFill>
+                          <a:blip r:embed="rId15" cstate="print">
+                            <a:extLst>
+                              <a:ext uri="{28A0092B-C50C-407E-A947-70E740481C1C}">
+                                <a14:useLocalDpi xmlns:a14="http://schemas.microsoft.com/office/drawing/2010/main" val="0"/>
+                              </a:ext>
+                            </a:extLst>
+                          </a:blip>
+                          <a:stretch>
+                            <a:fillRect/>
+                          </a:stretch>
+                        </pic:blipFill>
+                        <pic:spPr>
+                          <a:xfrm>
+                            <a:off x="0" y="0"/>
+                            <a:ext cx="6092347" cy="3354961"/>
+                          </a:xfrm>
+                          <a:prstGeom prst="rect">
+                            <a:avLst/>
+                          </a:prstGeom>
+                        </pic:spPr>
+                      </pic:pic>
+                    </a:graphicData>
+                  </a:graphic>
+                </wp:inline>
+              </w:drawing>
+            </w:r>
+          </w:p>
+          <w:p>
+            <w:pPr>
+              <w:pStyle w:val="Prrafodelista"/>
+              <w:tabs>
+                <w:tab w:val="left" w:pos="3310"/>
+              </w:tabs>
+              <w:spacing w:line="240" w:lineRule="auto"/>
+              <w:rPr>
+                <w:rFonts w:ascii="Calibri" w:eastAsia="Times New Roman" w:hAnsi="Calibri" w:cs="Calibri"/>
+                <w:b w:val="0"/>
+                <w:color w:val="000000"/>
+                <w:sz w:val="22"/>
+                <w:lang w:val="es-CO" w:eastAsia="es-CO"/>
+              </w:rPr>
+            </w:pPr>
+          </w:p>
+          <w:p>
+            <w:pPr>
+              <w:jc w:val="center"/>
+              <w:rPr>
+                <w:rFonts w:ascii="Calibri" w:eastAsia="Times New Roman" w:hAnsi="Calibri" w:cs="Calibri"/>
+                <w:sz w:val="22"/>
+                <w:lang w:val="es-CO" w:eastAsia="es-CO"/>
+              </w:rPr>
+            </w:pPr>
           </w:p>
         </w:tc>
       </w:tr>
@@ -6523,7 +6461,6 @@
         <w:pStyle w:val="Ttulo2"/>
       </w:pPr>
       <w:r>
-        <w:lastRenderedPageBreak/>
         <w:t>Diagrama de clases</w:t>
       </w:r>
     </w:p>
@@ -6548,7 +6485,7 @@
                     <pic:cNvPicPr/>
                   </pic:nvPicPr>
                   <pic:blipFill>
-                    <a:blip r:embed="rId14">
+                    <a:blip r:embed="rId16">
                       <a:extLst>
                         <a:ext uri="{28A0092B-C50C-407E-A947-70E740481C1C}">
                           <a14:useLocalDpi xmlns:a14="http://schemas.microsoft.com/office/drawing/2010/main" val="0"/>
@@ -6609,7 +6546,7 @@
                     <pic:cNvPicPr/>
                   </pic:nvPicPr>
                   <pic:blipFill>
-                    <a:blip r:embed="rId15">
+                    <a:blip r:embed="rId17">
                       <a:extLst>
                         <a:ext uri="{28A0092B-C50C-407E-A947-70E740481C1C}">
                           <a14:useLocalDpi xmlns:a14="http://schemas.microsoft.com/office/drawing/2010/main" val="0"/>
@@ -6635,15 +6572,18 @@
           </wp:inline>
         </w:drawing>
       </w:r>
-      <w:bookmarkStart w:id="4" w:name="_GoBack"/>
-      <w:bookmarkEnd w:id="4"/>
     </w:p>
     <w:p/>
+    <w:p/>
+    <w:p/>
+    <w:p/>
+    <w:p/>
     <w:p>
       <w:pPr>
         <w:pStyle w:val="Ttulo2"/>
       </w:pPr>
       <w:r>
+        <w:lastRenderedPageBreak/>
         <w:t xml:space="preserve">Incremento - </w:t>
       </w:r>
       <w:r>
@@ -6656,11 +6596,815 @@
     <w:p>
       <w:pPr>
         <w:pStyle w:val="Contenido"/>
-      </w:pPr>
+        <w:rPr>
+          <w:b/>
+          <w:bCs/>
+          <w:lang w:val="es-CO"/>
+        </w:rPr>
+      </w:pPr>
+      <w:r>
+        <w:rPr>
+          <w:b/>
+          <w:bCs/>
+          <w:lang w:val="es-CO"/>
+        </w:rPr>
+        <w:t xml:space="preserve">Incremento del Sprint </w:t>
+      </w:r>
+      <w:r>
+        <w:rPr>
+          <w:b/>
+          <w:bCs/>
+          <w:lang w:val="es-CO"/>
+        </w:rPr>
+        <w:t>3</w:t>
+      </w:r>
     </w:p>
     <w:p>
       <w:pPr>
         <w:pStyle w:val="Contenido"/>
+        <w:rPr>
+          <w:lang w:val="es-CO"/>
+        </w:rPr>
+      </w:pPr>
+      <w:r>
+        <w:rPr>
+          <w:lang w:val="es-CO"/>
+        </w:rPr>
+        <w:t xml:space="preserve">Durante el Sprint </w:t>
+      </w:r>
+      <w:r>
+        <w:rPr>
+          <w:lang w:val="es-CO"/>
+        </w:rPr>
+        <w:t>3</w:t>
+      </w:r>
+      <w:r>
+        <w:rPr>
+          <w:lang w:val="es-CO"/>
+        </w:rPr>
+        <w:t xml:space="preserve"> se </w:t>
+      </w:r>
+      <w:r>
+        <w:rPr>
+          <w:lang w:val="es-CO"/>
+        </w:rPr>
+        <w:t>implement</w:t>
+      </w:r>
+      <w:r>
+        <w:rPr>
+          <w:lang w:val="es-CO"/>
+        </w:rPr>
+        <w:t>ó</w:t>
+      </w:r>
+      <w:r>
+        <w:rPr>
+          <w:lang w:val="es-CO"/>
+        </w:rPr>
+        <w:t xml:space="preserve"> la siguiente historia de usuario:</w:t>
+      </w:r>
+    </w:p>
+    <w:p>
+      <w:pPr>
+        <w:pStyle w:val="Contenido"/>
+        <w:numPr>
+          <w:ilvl w:val="0"/>
+          <w:numId w:val="35"/>
+        </w:numPr>
+        <w:rPr>
+          <w:lang w:val="es-CO"/>
+        </w:rPr>
+      </w:pPr>
+      <w:r>
+        <w:rPr>
+          <w:b/>
+          <w:bCs/>
+          <w:lang w:val="es-CO"/>
+        </w:rPr>
+        <w:t>HU-0</w:t>
+      </w:r>
+      <w:r>
+        <w:rPr>
+          <w:b/>
+          <w:bCs/>
+          <w:lang w:val="es-CO"/>
+        </w:rPr>
+        <w:t>7</w:t>
+      </w:r>
+      <w:r>
+        <w:rPr>
+          <w:b/>
+          <w:bCs/>
+          <w:lang w:val="es-CO"/>
+        </w:rPr>
+        <w:t xml:space="preserve">: </w:t>
+      </w:r>
+      <w:r>
+        <w:rPr>
+          <w:b/>
+          <w:bCs/>
+          <w:lang w:val="es-CO"/>
+        </w:rPr>
+        <w:t>Visualización de reportes del sistema.</w:t>
+      </w:r>
+    </w:p>
+    <w:p>
+      <w:pPr>
+        <w:pStyle w:val="Contenido"/>
+        <w:rPr>
+          <w:lang w:val="es-CO"/>
+        </w:rPr>
+      </w:pPr>
+      <w:r>
+        <w:rPr>
+          <w:lang w:val="es-CO"/>
+        </w:rPr>
+        <w:t>Estas funcionalidades permiten:</w:t>
+      </w:r>
+    </w:p>
+    <w:p>
+      <w:pPr>
+        <w:pStyle w:val="Contenido"/>
+        <w:numPr>
+          <w:ilvl w:val="0"/>
+          <w:numId w:val="16"/>
+        </w:numPr>
+        <w:rPr>
+          <w:lang w:val="es-CO"/>
+        </w:rPr>
+      </w:pPr>
+      <w:r>
+        <w:rPr>
+          <w:lang w:val="es-CO"/>
+        </w:rPr>
+        <w:t>Consultar reportes de compras, ventas e inventario del sistema.</w:t>
+      </w:r>
+    </w:p>
+    <w:p>
+      <w:pPr>
+        <w:pStyle w:val="Contenido"/>
+        <w:numPr>
+          <w:ilvl w:val="0"/>
+          <w:numId w:val="16"/>
+        </w:numPr>
+        <w:rPr>
+          <w:lang w:val="es-CO"/>
+        </w:rPr>
+      </w:pPr>
+      <w:r>
+        <w:rPr>
+          <w:lang w:val="es-CO"/>
+        </w:rPr>
+        <w:t>Visualizar información organizada y actualizada en tiempo real.</w:t>
+      </w:r>
+    </w:p>
+    <w:p>
+      <w:pPr>
+        <w:pStyle w:val="Contenido"/>
+        <w:numPr>
+          <w:ilvl w:val="0"/>
+          <w:numId w:val="16"/>
+        </w:numPr>
+        <w:rPr>
+          <w:lang w:val="es-CO"/>
+        </w:rPr>
+      </w:pPr>
+      <w:r>
+        <w:rPr>
+          <w:lang w:val="es-CO"/>
+        </w:rPr>
+        <w:t>Filtrar reportes por rangos de fechas, clientes, proveedores o códigos según la necesidad.</w:t>
+      </w:r>
+    </w:p>
+    <w:p>
+      <w:pPr>
+        <w:pStyle w:val="Contenido"/>
+        <w:numPr>
+          <w:ilvl w:val="0"/>
+          <w:numId w:val="16"/>
+        </w:numPr>
+        <w:rPr>
+          <w:lang w:val="es-CO"/>
+        </w:rPr>
+      </w:pPr>
+      <w:r>
+        <w:rPr>
+          <w:lang w:val="es-CO"/>
+        </w:rPr>
+        <w:t>Llevar un control y seguimiento de los movimientos realizados en el inventario.</w:t>
+      </w:r>
+    </w:p>
+    <w:p>
+      <w:pPr>
+        <w:pStyle w:val="Contenido"/>
+        <w:numPr>
+          <w:ilvl w:val="0"/>
+          <w:numId w:val="16"/>
+        </w:numPr>
+        <w:rPr>
+          <w:lang w:val="es-CO"/>
+        </w:rPr>
+      </w:pPr>
+      <w:r>
+        <w:rPr>
+          <w:lang w:val="es-CO"/>
+        </w:rPr>
+        <w:t>Facilitar la toma de decisiones mediante la visualización de la información registrada en el sistema.</w:t>
+      </w:r>
+    </w:p>
+    <w:p>
+      <w:pPr>
+        <w:pStyle w:val="Contenido"/>
+        <w:numPr>
+          <w:ilvl w:val="0"/>
+          <w:numId w:val="16"/>
+        </w:numPr>
+        <w:rPr>
+          <w:lang w:val="es-CO"/>
+        </w:rPr>
+      </w:pPr>
+      <w:r>
+        <w:rPr>
+          <w:lang w:val="es-CO"/>
+        </w:rPr>
+        <w:t>Mejorar el control administrativo y operativo de la plataforma mediante reportes detallados.</w:t>
+      </w:r>
+    </w:p>
+    <w:p>
+      <w:pPr>
+        <w:pStyle w:val="Contenido"/>
+        <w:rPr>
+          <w:lang w:val="es-CO"/>
+        </w:rPr>
+      </w:pPr>
+      <w:r>
+        <w:rPr>
+          <w:lang w:val="es-CO"/>
+        </w:rPr>
+        <w:t>Modulo de reportes:</w:t>
+      </w:r>
+    </w:p>
+    <w:p>
+      <w:pPr>
+        <w:pStyle w:val="Contenido"/>
+        <w:rPr>
+          <w:lang w:val="es-CO"/>
+        </w:rPr>
+      </w:pPr>
+      <w:r>
+        <w:rPr>
+          <w:lang w:val="es-CO"/>
+        </w:rPr>
+        <w:drawing>
+          <wp:inline distT="0" distB="0" distL="0" distR="0" wp14:anchorId="1A67DBD9" wp14:editId="54F7ED45">
+            <wp:extent cx="6371590" cy="2933700"/>
+            <wp:effectExtent l="0" t="0" r="0" b="0"/>
+            <wp:docPr id="18" name="Imagen 18"/>
+            <wp:cNvGraphicFramePr>
+              <a:graphicFrameLocks xmlns:a="http://schemas.openxmlformats.org/drawingml/2006/main" noChangeAspect="1"/>
+            </wp:cNvGraphicFramePr>
+            <a:graphic xmlns:a="http://schemas.openxmlformats.org/drawingml/2006/main">
+              <a:graphicData uri="http://schemas.openxmlformats.org/drawingml/2006/picture">
+                <pic:pic xmlns:pic="http://schemas.openxmlformats.org/drawingml/2006/picture">
+                  <pic:nvPicPr>
+                    <pic:cNvPr id="1" name=""/>
+                    <pic:cNvPicPr/>
+                  </pic:nvPicPr>
+                  <pic:blipFill>
+                    <a:blip r:embed="rId18"/>
+                    <a:stretch>
+                      <a:fillRect/>
+                    </a:stretch>
+                  </pic:blipFill>
+                  <pic:spPr>
+                    <a:xfrm>
+                      <a:off x="0" y="0"/>
+                      <a:ext cx="6371590" cy="2933700"/>
+                    </a:xfrm>
+                    <a:prstGeom prst="rect">
+                      <a:avLst/>
+                    </a:prstGeom>
+                  </pic:spPr>
+                </pic:pic>
+              </a:graphicData>
+            </a:graphic>
+          </wp:inline>
+        </w:drawing>
+      </w:r>
+    </w:p>
+    <w:p>
+      <w:pPr>
+        <w:pStyle w:val="Contenido"/>
+        <w:rPr>
+          <w:lang w:val="es-CO"/>
+        </w:rPr>
+      </w:pPr>
+    </w:p>
+    <w:p>
+      <w:pPr>
+        <w:pStyle w:val="Contenido"/>
+        <w:rPr>
+          <w:lang w:val="es-CO"/>
+        </w:rPr>
+      </w:pPr>
+      <w:r>
+        <w:rPr>
+          <w:lang w:val="es-CO"/>
+        </w:rPr>
+        <w:t>Reporte de ventas</w:t>
+      </w:r>
+      <w:r>
+        <w:rPr>
+          <w:lang w:val="es-CO"/>
+        </w:rPr>
+        <w:t>:</w:t>
+      </w:r>
+    </w:p>
+    <w:p>
+      <w:pPr>
+        <w:pStyle w:val="Contenido"/>
+        <w:rPr>
+          <w:lang w:val="es-CO"/>
+        </w:rPr>
+      </w:pPr>
+      <w:r>
+        <w:rPr>
+          <w:lang w:val="es-CO"/>
+        </w:rPr>
+        <w:lastRenderedPageBreak/>
+        <w:drawing>
+          <wp:inline distT="0" distB="0" distL="0" distR="0" wp14:anchorId="7A472E7D" wp14:editId="2A6EF3B7">
+            <wp:extent cx="6371590" cy="3063875"/>
+            <wp:effectExtent l="0" t="0" r="0" b="3175"/>
+            <wp:docPr id="19" name="Imagen 19"/>
+            <wp:cNvGraphicFramePr>
+              <a:graphicFrameLocks xmlns:a="http://schemas.openxmlformats.org/drawingml/2006/main" noChangeAspect="1"/>
+            </wp:cNvGraphicFramePr>
+            <a:graphic xmlns:a="http://schemas.openxmlformats.org/drawingml/2006/main">
+              <a:graphicData uri="http://schemas.openxmlformats.org/drawingml/2006/picture">
+                <pic:pic xmlns:pic="http://schemas.openxmlformats.org/drawingml/2006/picture">
+                  <pic:nvPicPr>
+                    <pic:cNvPr id="1" name=""/>
+                    <pic:cNvPicPr/>
+                  </pic:nvPicPr>
+                  <pic:blipFill>
+                    <a:blip r:embed="rId19"/>
+                    <a:stretch>
+                      <a:fillRect/>
+                    </a:stretch>
+                  </pic:blipFill>
+                  <pic:spPr>
+                    <a:xfrm>
+                      <a:off x="0" y="0"/>
+                      <a:ext cx="6371590" cy="3063875"/>
+                    </a:xfrm>
+                    <a:prstGeom prst="rect">
+                      <a:avLst/>
+                    </a:prstGeom>
+                  </pic:spPr>
+                </pic:pic>
+              </a:graphicData>
+            </a:graphic>
+          </wp:inline>
+        </w:drawing>
+      </w:r>
+      <w:r>
+        <w:rPr>
+          <w:lang w:val="es-CO"/>
+        </w:rPr>
+        <w:t>Filtrar por fechas:</w:t>
+      </w:r>
+    </w:p>
+    <w:p>
+      <w:pPr>
+        <w:pStyle w:val="Contenido"/>
+        <w:rPr>
+          <w:lang w:val="es-CO"/>
+        </w:rPr>
+      </w:pPr>
+      <w:r>
+        <w:rPr>
+          <w:lang w:val="es-CO"/>
+        </w:rPr>
+        <w:drawing>
+          <wp:inline distT="0" distB="0" distL="0" distR="0" wp14:anchorId="7B076A0F" wp14:editId="2B9275F0">
+            <wp:extent cx="6371590" cy="2131060"/>
+            <wp:effectExtent l="0" t="0" r="0" b="2540"/>
+            <wp:docPr id="20" name="Imagen 20"/>
+            <wp:cNvGraphicFramePr>
+              <a:graphicFrameLocks xmlns:a="http://schemas.openxmlformats.org/drawingml/2006/main" noChangeAspect="1"/>
+            </wp:cNvGraphicFramePr>
+            <a:graphic xmlns:a="http://schemas.openxmlformats.org/drawingml/2006/main">
+              <a:graphicData uri="http://schemas.openxmlformats.org/drawingml/2006/picture">
+                <pic:pic xmlns:pic="http://schemas.openxmlformats.org/drawingml/2006/picture">
+                  <pic:nvPicPr>
+                    <pic:cNvPr id="1" name=""/>
+                    <pic:cNvPicPr/>
+                  </pic:nvPicPr>
+                  <pic:blipFill>
+                    <a:blip r:embed="rId20"/>
+                    <a:stretch>
+                      <a:fillRect/>
+                    </a:stretch>
+                  </pic:blipFill>
+                  <pic:spPr>
+                    <a:xfrm>
+                      <a:off x="0" y="0"/>
+                      <a:ext cx="6371590" cy="2131060"/>
+                    </a:xfrm>
+                    <a:prstGeom prst="rect">
+                      <a:avLst/>
+                    </a:prstGeom>
+                  </pic:spPr>
+                </pic:pic>
+              </a:graphicData>
+            </a:graphic>
+          </wp:inline>
+        </w:drawing>
+      </w:r>
+    </w:p>
+    <w:p>
+      <w:pPr>
+        <w:pStyle w:val="Contenido"/>
+        <w:rPr>
+          <w:lang w:val="es-CO"/>
+        </w:rPr>
+      </w:pPr>
+      <w:r>
+        <w:rPr>
+          <w:lang w:val="es-CO"/>
+        </w:rPr>
+        <w:t xml:space="preserve">Filtrar por cliente: </w:t>
+      </w:r>
+    </w:p>
+    <w:p>
+      <w:pPr>
+        <w:pStyle w:val="Contenido"/>
+        <w:rPr>
+          <w:lang w:val="es-CO"/>
+        </w:rPr>
+      </w:pPr>
+      <w:r>
+        <w:rPr>
+          <w:lang w:val="es-CO"/>
+        </w:rPr>
+        <w:drawing>
+          <wp:inline distT="0" distB="0" distL="0" distR="0" wp14:anchorId="0DEB1CF3" wp14:editId="7A84AEC3">
+            <wp:extent cx="6371590" cy="2330450"/>
+            <wp:effectExtent l="0" t="0" r="0" b="0"/>
+            <wp:docPr id="21" name="Imagen 21"/>
+            <wp:cNvGraphicFramePr>
+              <a:graphicFrameLocks xmlns:a="http://schemas.openxmlformats.org/drawingml/2006/main" noChangeAspect="1"/>
+            </wp:cNvGraphicFramePr>
+            <a:graphic xmlns:a="http://schemas.openxmlformats.org/drawingml/2006/main">
+              <a:graphicData uri="http://schemas.openxmlformats.org/drawingml/2006/picture">
+                <pic:pic xmlns:pic="http://schemas.openxmlformats.org/drawingml/2006/picture">
+                  <pic:nvPicPr>
+                    <pic:cNvPr id="1" name=""/>
+                    <pic:cNvPicPr/>
+                  </pic:nvPicPr>
+                  <pic:blipFill>
+                    <a:blip r:embed="rId21"/>
+                    <a:stretch>
+                      <a:fillRect/>
+                    </a:stretch>
+                  </pic:blipFill>
+                  <pic:spPr>
+                    <a:xfrm>
+                      <a:off x="0" y="0"/>
+                      <a:ext cx="6371590" cy="2330450"/>
+                    </a:xfrm>
+                    <a:prstGeom prst="rect">
+                      <a:avLst/>
+                    </a:prstGeom>
+                  </pic:spPr>
+                </pic:pic>
+              </a:graphicData>
+            </a:graphic>
+          </wp:inline>
+        </w:drawing>
+      </w:r>
+    </w:p>
+    <w:p>
+      <w:pPr>
+        <w:pStyle w:val="Contenido"/>
+        <w:rPr>
+          <w:lang w:val="es-CO"/>
+        </w:rPr>
+      </w:pPr>
+      <w:r>
+        <w:rPr>
+          <w:lang w:val="es-CO"/>
+        </w:rPr>
+        <w:t>Filtrar por código:</w:t>
+      </w:r>
+    </w:p>
+    <w:p>
+      <w:pPr>
+        <w:pStyle w:val="Contenido"/>
+        <w:rPr>
+          <w:lang w:val="es-CO"/>
+        </w:rPr>
+      </w:pPr>
+      <w:r>
+        <w:rPr>
+          <w:lang w:val="es-CO"/>
+        </w:rPr>
+        <w:lastRenderedPageBreak/>
+        <w:drawing>
+          <wp:inline distT="0" distB="0" distL="0" distR="0" wp14:anchorId="0BCF718A" wp14:editId="2FC67069">
+            <wp:extent cx="6371590" cy="2090420"/>
+            <wp:effectExtent l="0" t="0" r="0" b="5080"/>
+            <wp:docPr id="22" name="Imagen 22"/>
+            <wp:cNvGraphicFramePr>
+              <a:graphicFrameLocks xmlns:a="http://schemas.openxmlformats.org/drawingml/2006/main" noChangeAspect="1"/>
+            </wp:cNvGraphicFramePr>
+            <a:graphic xmlns:a="http://schemas.openxmlformats.org/drawingml/2006/main">
+              <a:graphicData uri="http://schemas.openxmlformats.org/drawingml/2006/picture">
+                <pic:pic xmlns:pic="http://schemas.openxmlformats.org/drawingml/2006/picture">
+                  <pic:nvPicPr>
+                    <pic:cNvPr id="1" name=""/>
+                    <pic:cNvPicPr/>
+                  </pic:nvPicPr>
+                  <pic:blipFill>
+                    <a:blip r:embed="rId22"/>
+                    <a:stretch>
+                      <a:fillRect/>
+                    </a:stretch>
+                  </pic:blipFill>
+                  <pic:spPr>
+                    <a:xfrm>
+                      <a:off x="0" y="0"/>
+                      <a:ext cx="6371590" cy="2090420"/>
+                    </a:xfrm>
+                    <a:prstGeom prst="rect">
+                      <a:avLst/>
+                    </a:prstGeom>
+                  </pic:spPr>
+                </pic:pic>
+              </a:graphicData>
+            </a:graphic>
+          </wp:inline>
+        </w:drawing>
+      </w:r>
+    </w:p>
+    <w:p>
+      <w:pPr>
+        <w:pStyle w:val="Contenido"/>
+        <w:rPr>
+          <w:lang w:val="es-CO"/>
+        </w:rPr>
+      </w:pPr>
+    </w:p>
+    <w:p>
+      <w:pPr>
+        <w:pStyle w:val="Contenido"/>
+        <w:rPr>
+          <w:lang w:val="es-CO"/>
+        </w:rPr>
+      </w:pPr>
+      <w:r>
+        <w:rPr>
+          <w:lang w:val="es-CO"/>
+        </w:rPr>
+        <w:t xml:space="preserve">Reporte de compras: </w:t>
+      </w:r>
+    </w:p>
+    <w:p>
+      <w:pPr>
+        <w:pStyle w:val="Contenido"/>
+        <w:rPr>
+          <w:lang w:val="es-CO"/>
+        </w:rPr>
+      </w:pPr>
+      <w:r>
+        <w:rPr>
+          <w:lang w:val="es-CO"/>
+        </w:rPr>
+        <w:drawing>
+          <wp:inline distT="0" distB="0" distL="0" distR="0" wp14:anchorId="36EEFB14" wp14:editId="5C4B8C59">
+            <wp:extent cx="6371590" cy="2891790"/>
+            <wp:effectExtent l="0" t="0" r="0" b="3810"/>
+            <wp:docPr id="23" name="Imagen 23"/>
+            <wp:cNvGraphicFramePr>
+              <a:graphicFrameLocks xmlns:a="http://schemas.openxmlformats.org/drawingml/2006/main" noChangeAspect="1"/>
+            </wp:cNvGraphicFramePr>
+            <a:graphic xmlns:a="http://schemas.openxmlformats.org/drawingml/2006/main">
+              <a:graphicData uri="http://schemas.openxmlformats.org/drawingml/2006/picture">
+                <pic:pic xmlns:pic="http://schemas.openxmlformats.org/drawingml/2006/picture">
+                  <pic:nvPicPr>
+                    <pic:cNvPr id="1" name=""/>
+                    <pic:cNvPicPr/>
+                  </pic:nvPicPr>
+                  <pic:blipFill>
+                    <a:blip r:embed="rId23"/>
+                    <a:stretch>
+                      <a:fillRect/>
+                    </a:stretch>
+                  </pic:blipFill>
+                  <pic:spPr>
+                    <a:xfrm>
+                      <a:off x="0" y="0"/>
+                      <a:ext cx="6371590" cy="2891790"/>
+                    </a:xfrm>
+                    <a:prstGeom prst="rect">
+                      <a:avLst/>
+                    </a:prstGeom>
+                  </pic:spPr>
+                </pic:pic>
+              </a:graphicData>
+            </a:graphic>
+          </wp:inline>
+        </w:drawing>
+      </w:r>
+    </w:p>
+    <w:p>
+      <w:pPr>
+        <w:pStyle w:val="Contenido"/>
+        <w:rPr>
+          <w:lang w:val="es-CO"/>
+        </w:rPr>
+      </w:pPr>
+      <w:r>
+        <w:rPr>
+          <w:lang w:val="es-CO"/>
+        </w:rPr>
+        <w:t xml:space="preserve">Reporte de inventario: </w:t>
+      </w:r>
+    </w:p>
+    <w:p>
+      <w:pPr>
+        <w:pStyle w:val="Contenido"/>
+        <w:rPr>
+          <w:lang w:val="es-CO"/>
+        </w:rPr>
+      </w:pPr>
+      <w:r>
+        <w:rPr>
+          <w:lang w:val="es-CO"/>
+        </w:rPr>
+        <w:drawing>
+          <wp:inline distT="0" distB="0" distL="0" distR="0" wp14:anchorId="0E16414D" wp14:editId="237AC927">
+            <wp:extent cx="6371590" cy="2545690"/>
+            <wp:effectExtent l="0" t="0" r="0" b="7620"/>
+            <wp:docPr id="24" name="Imagen 24"/>
+            <wp:cNvGraphicFramePr>
+              <a:graphicFrameLocks xmlns:a="http://schemas.openxmlformats.org/drawingml/2006/main" noChangeAspect="1"/>
+            </wp:cNvGraphicFramePr>
+            <a:graphic xmlns:a="http://schemas.openxmlformats.org/drawingml/2006/main">
+              <a:graphicData uri="http://schemas.openxmlformats.org/drawingml/2006/picture">
+                <pic:pic xmlns:pic="http://schemas.openxmlformats.org/drawingml/2006/picture">
+                  <pic:nvPicPr>
+                    <pic:cNvPr id="1" name=""/>
+                    <pic:cNvPicPr/>
+                  </pic:nvPicPr>
+                  <pic:blipFill rotWithShape="1">
+                    <a:blip r:embed="rId24"/>
+                    <a:srcRect b="18781"/>
+                    <a:stretch/>
+                  </pic:blipFill>
+                  <pic:spPr bwMode="auto">
+                    <a:xfrm>
+                      <a:off x="0" y="0"/>
+                      <a:ext cx="6371590" cy="2545690"/>
+                    </a:xfrm>
+                    <a:prstGeom prst="rect">
+                      <a:avLst/>
+                    </a:prstGeom>
+                    <a:ln>
+                      <a:noFill/>
+                    </a:ln>
+                    <a:extLst>
+                      <a:ext uri="{53640926-AAD7-44D8-BBD7-CCE9431645EC}">
+                        <a14:shadowObscured xmlns:a14="http://schemas.microsoft.com/office/drawing/2010/main"/>
+                      </a:ext>
+                    </a:extLst>
+                  </pic:spPr>
+                </pic:pic>
+              </a:graphicData>
+            </a:graphic>
+          </wp:inline>
+        </w:drawing>
+      </w:r>
+      <w:r>
+        <w:rPr>
+          <w:lang w:val="es-CO"/>
+        </w:rPr>
+        <w:t xml:space="preserve"> </w:t>
+      </w:r>
+    </w:p>
+    <w:p>
+      <w:pPr>
+        <w:pStyle w:val="Contenido"/>
+        <w:ind w:left="720"/>
+        <w:rPr>
+          <w:lang w:val="es-CO"/>
+        </w:rPr>
+      </w:pPr>
+    </w:p>
+    <w:p>
+      <w:pPr>
+        <w:pStyle w:val="Contenido"/>
+      </w:pPr>
+      <w:r>
+        <w:t>Reporte de mas vendidos:</w:t>
+      </w:r>
+    </w:p>
+    <w:p>
+      <w:pPr>
+        <w:pStyle w:val="Contenido"/>
+      </w:pPr>
+      <w:r>
+        <w:lastRenderedPageBreak/>
+        <w:drawing>
+          <wp:inline distT="0" distB="0" distL="0" distR="0" wp14:anchorId="6C6AA5A3" wp14:editId="58533CC7">
+            <wp:extent cx="6371590" cy="1600200"/>
+            <wp:effectExtent l="0" t="0" r="0" b="0"/>
+            <wp:docPr id="25" name="Imagen 25"/>
+            <wp:cNvGraphicFramePr>
+              <a:graphicFrameLocks xmlns:a="http://schemas.openxmlformats.org/drawingml/2006/main" noChangeAspect="1"/>
+            </wp:cNvGraphicFramePr>
+            <a:graphic xmlns:a="http://schemas.openxmlformats.org/drawingml/2006/main">
+              <a:graphicData uri="http://schemas.openxmlformats.org/drawingml/2006/picture">
+                <pic:pic xmlns:pic="http://schemas.openxmlformats.org/drawingml/2006/picture">
+                  <pic:nvPicPr>
+                    <pic:cNvPr id="1" name=""/>
+                    <pic:cNvPicPr/>
+                  </pic:nvPicPr>
+                  <pic:blipFill>
+                    <a:blip r:embed="rId25"/>
+                    <a:stretch>
+                      <a:fillRect/>
+                    </a:stretch>
+                  </pic:blipFill>
+                  <pic:spPr>
+                    <a:xfrm>
+                      <a:off x="0" y="0"/>
+                      <a:ext cx="6371590" cy="1600200"/>
+                    </a:xfrm>
+                    <a:prstGeom prst="rect">
+                      <a:avLst/>
+                    </a:prstGeom>
+                  </pic:spPr>
+                </pic:pic>
+              </a:graphicData>
+            </a:graphic>
+          </wp:inline>
+        </w:drawing>
+      </w:r>
+    </w:p>
+    <w:p>
+      <w:pPr>
+        <w:pStyle w:val="Contenido"/>
+      </w:pPr>
+      <w:r>
+        <w:t xml:space="preserve">Impresión de reporte a consideración: </w:t>
+      </w:r>
+    </w:p>
+    <w:p>
+      <w:pPr>
+        <w:pStyle w:val="Contenido"/>
+      </w:pPr>
+      <w:r>
+        <w:drawing>
+          <wp:inline distT="0" distB="0" distL="0" distR="0" wp14:anchorId="04D85405" wp14:editId="3AC13DA2">
+            <wp:extent cx="6371590" cy="3404235"/>
+            <wp:effectExtent l="0" t="0" r="0" b="5715"/>
+            <wp:docPr id="26" name="Imagen 26"/>
+            <wp:cNvGraphicFramePr>
+              <a:graphicFrameLocks xmlns:a="http://schemas.openxmlformats.org/drawingml/2006/main" noChangeAspect="1"/>
+            </wp:cNvGraphicFramePr>
+            <a:graphic xmlns:a="http://schemas.openxmlformats.org/drawingml/2006/main">
+              <a:graphicData uri="http://schemas.openxmlformats.org/drawingml/2006/picture">
+                <pic:pic xmlns:pic="http://schemas.openxmlformats.org/drawingml/2006/picture">
+                  <pic:nvPicPr>
+                    <pic:cNvPr id="1" name=""/>
+                    <pic:cNvPicPr/>
+                  </pic:nvPicPr>
+                  <pic:blipFill>
+                    <a:blip r:embed="rId26"/>
+                    <a:stretch>
+                      <a:fillRect/>
+                    </a:stretch>
+                  </pic:blipFill>
+                  <pic:spPr>
+                    <a:xfrm>
+                      <a:off x="0" y="0"/>
+                      <a:ext cx="6371590" cy="3404235"/>
+                    </a:xfrm>
+                    <a:prstGeom prst="rect">
+                      <a:avLst/>
+                    </a:prstGeom>
+                  </pic:spPr>
+                </pic:pic>
+              </a:graphicData>
+            </a:graphic>
+          </wp:inline>
+        </w:drawing>
+      </w:r>
+    </w:p>
+    <w:p>
+      <w:pPr>
+        <w:pStyle w:val="Contenido"/>
       </w:pPr>
     </w:p>
     <w:p>
@@ -6668,37 +7412,332 @@
         <w:pStyle w:val="Ttulo2"/>
       </w:pPr>
       <w:r>
+        <w:t>Sprint Review</w:t>
+      </w:r>
+    </w:p>
+    <w:p>
+      <w:pPr>
+        <w:pStyle w:val="Ttulo3"/>
+      </w:pPr>
+      <w:r>
+        <w:t>Debilidades</w:t>
+      </w:r>
+    </w:p>
+    <w:p>
+      <w:pPr>
+        <w:pStyle w:val="Prrafodelista"/>
+        <w:numPr>
+          <w:ilvl w:val="0"/>
+          <w:numId w:val="37"/>
+        </w:numPr>
+        <w:rPr>
+          <w:b w:val="0"/>
+          <w:bCs/>
+        </w:rPr>
+      </w:pPr>
+      <w:r>
+        <w:rPr>
+          <w:b w:val="0"/>
+          <w:bCs/>
+        </w:rPr>
+        <w:t>Algunas funcionalidades avanzadas de reportes aún pueden optimizarse en cuanto a velocidad y presentación de la información.</w:t>
+      </w:r>
+    </w:p>
+    <w:p>
+      <w:pPr>
+        <w:pStyle w:val="Prrafodelista"/>
+        <w:numPr>
+          <w:ilvl w:val="0"/>
+          <w:numId w:val="37"/>
+        </w:numPr>
+        <w:rPr>
+          <w:b w:val="0"/>
+          <w:bCs/>
+        </w:rPr>
+      </w:pPr>
+      <w:r>
+        <w:rPr>
+          <w:b w:val="0"/>
+          <w:bCs/>
+        </w:rPr>
+        <w:t>La interfaz gráfica de algunos módulos todavía puede mejorar en experiencia de usuario y diseño responsivo.</w:t>
+      </w:r>
+    </w:p>
+    <w:p>
+      <w:pPr>
+        <w:pStyle w:val="Ttulo3"/>
+      </w:pPr>
+      <w:r>
+        <w:t>Fortalezas</w:t>
+      </w:r>
+    </w:p>
+    <w:p>
+      <w:pPr>
+        <w:pStyle w:val="Prrafodelista"/>
+        <w:numPr>
+          <w:ilvl w:val="0"/>
+          <w:numId w:val="38"/>
+        </w:numPr>
+        <w:rPr>
+          <w:b w:val="0"/>
+          <w:bCs/>
+        </w:rPr>
+      </w:pPr>
+      <w:r>
+        <w:rPr>
+          <w:b w:val="0"/>
+          <w:bCs/>
+        </w:rPr>
+        <w:t>Se logró implementar correctamente la historia de usuario HU-07, permitiendo la visualización de reportes del sistema.</w:t>
+      </w:r>
+    </w:p>
+    <w:p>
+      <w:pPr>
+        <w:pStyle w:val="Prrafodelista"/>
+        <w:numPr>
+          <w:ilvl w:val="0"/>
+          <w:numId w:val="38"/>
+        </w:numPr>
+        <w:rPr>
+          <w:b w:val="0"/>
+          <w:bCs/>
+        </w:rPr>
+      </w:pPr>
+      <w:r>
+        <w:rPr>
+          <w:b w:val="0"/>
+          <w:bCs/>
+        </w:rPr>
+        <w:t>El sistema ahora permite consultar información de compras, ventas e inventario de forma más organizada.</w:t>
+      </w:r>
+    </w:p>
+    <w:p>
+      <w:pPr>
+        <w:pStyle w:val="Prrafodelista"/>
+        <w:numPr>
+          <w:ilvl w:val="0"/>
+          <w:numId w:val="38"/>
+        </w:numPr>
+        <w:rPr>
+          <w:b w:val="0"/>
+          <w:bCs/>
+        </w:rPr>
+      </w:pPr>
+      <w:r>
+        <w:rPr>
+          <w:b w:val="0"/>
+          <w:bCs/>
+        </w:rPr>
+        <w:t>Se incorporaron filtros por fechas, clientes y proveedores para facilitar la búsqueda de información.</w:t>
+      </w:r>
+    </w:p>
+    <w:p>
+      <w:pPr>
+        <w:pStyle w:val="Prrafodelista"/>
+        <w:numPr>
+          <w:ilvl w:val="0"/>
+          <w:numId w:val="38"/>
+        </w:numPr>
+        <w:rPr>
+          <w:b w:val="0"/>
+          <w:bCs/>
+        </w:rPr>
+      </w:pPr>
+      <w:r>
+        <w:rPr>
+          <w:b w:val="0"/>
+          <w:bCs/>
+        </w:rPr>
         <w:lastRenderedPageBreak/>
-        <w:t xml:space="preserve">Sprint </w:t>
-      </w:r>
-      <w:proofErr w:type="spellStart"/>
-      <w:r>
-        <w:t>Review</w:t>
-      </w:r>
-      <w:proofErr w:type="spellEnd"/>
+        <w:t>Se fortaleció el control y seguimiento de movimientos del inventario mediante reportes detallados.</w:t>
+      </w:r>
+    </w:p>
+    <w:p>
+      <w:pPr>
+        <w:pStyle w:val="Prrafodelista"/>
+        <w:numPr>
+          <w:ilvl w:val="0"/>
+          <w:numId w:val="38"/>
+        </w:numPr>
+        <w:rPr>
+          <w:b w:val="0"/>
+          <w:bCs/>
+        </w:rPr>
+      </w:pPr>
+      <w:r>
+        <w:rPr>
+          <w:b w:val="0"/>
+          <w:bCs/>
+        </w:rPr>
+        <w:t>El sistema mantiene la integración entre módulos desarrollados en los sprints anteriores.</w:t>
+      </w:r>
+    </w:p>
+    <w:p>
+      <w:pPr>
+        <w:pStyle w:val="Prrafodelista"/>
+        <w:numPr>
+          <w:ilvl w:val="0"/>
+          <w:numId w:val="38"/>
+        </w:numPr>
+        <w:rPr>
+          <w:b w:val="0"/>
+          <w:bCs/>
+        </w:rPr>
+      </w:pPr>
+      <w:r>
+        <w:rPr>
+          <w:b w:val="0"/>
+          <w:bCs/>
+        </w:rPr>
+        <w:t>Se conservaron las validaciones y controles de acceso implementados previamente.</w:t>
+      </w:r>
+    </w:p>
+    <w:p>
+      <w:pPr>
+        <w:pStyle w:val="Prrafodelista"/>
+        <w:numPr>
+          <w:ilvl w:val="0"/>
+          <w:numId w:val="38"/>
+        </w:numPr>
+        <w:rPr>
+          <w:b w:val="0"/>
+          <w:bCs/>
+        </w:rPr>
+      </w:pPr>
+      <w:r>
+        <w:rPr>
+          <w:b w:val="0"/>
+          <w:bCs/>
+        </w:rPr>
+        <w:t>La arquitectura del sistema continuó organizada bajo el patrón MVC, facilitando el mantenimiento y escalabilidad.</w:t>
+      </w:r>
     </w:p>
     <w:p>
       <w:pPr>
         <w:pStyle w:val="Ttulo3"/>
       </w:pPr>
       <w:r>
-        <w:t>Debilidades</w:t>
-      </w:r>
-    </w:p>
-    <w:p>
-      <w:pPr>
-        <w:pStyle w:val="Ttulo3"/>
-      </w:pPr>
-      <w:r>
-        <w:t>Fortalezas</w:t>
-      </w:r>
-    </w:p>
-    <w:p>
-      <w:pPr>
-        <w:pStyle w:val="Ttulo3"/>
-      </w:pPr>
-      <w:r>
         <w:t>Oportunidades de mejora</w:t>
+      </w:r>
+    </w:p>
+    <w:p>
+      <w:pPr>
+        <w:pStyle w:val="Prrafodelista"/>
+        <w:numPr>
+          <w:ilvl w:val="0"/>
+          <w:numId w:val="39"/>
+        </w:numPr>
+        <w:rPr>
+          <w:b w:val="0"/>
+          <w:bCs/>
+        </w:rPr>
+      </w:pPr>
+      <w:r>
+        <w:rPr>
+          <w:b w:val="0"/>
+          <w:bCs/>
+        </w:rPr>
+        <w:t>Optimizar las consultas SQL para manejar grandes volúmenes de datos.</w:t>
+      </w:r>
+    </w:p>
+    <w:p>
+      <w:pPr>
+        <w:pStyle w:val="Prrafodelista"/>
+        <w:numPr>
+          <w:ilvl w:val="0"/>
+          <w:numId w:val="39"/>
+        </w:numPr>
+        <w:rPr>
+          <w:b w:val="0"/>
+          <w:bCs/>
+        </w:rPr>
+      </w:pPr>
+      <w:r>
+        <w:rPr>
+          <w:b w:val="0"/>
+          <w:bCs/>
+        </w:rPr>
+        <w:t>Implementar pruebas automatizadas y pruebas de carga.</w:t>
+      </w:r>
+    </w:p>
+    <w:p>
+      <w:pPr>
+        <w:pStyle w:val="Prrafodelista"/>
+        <w:numPr>
+          <w:ilvl w:val="0"/>
+          <w:numId w:val="39"/>
+        </w:numPr>
+        <w:rPr>
+          <w:b w:val="0"/>
+          <w:bCs/>
+        </w:rPr>
+      </w:pPr>
+      <w:r>
+        <w:rPr>
+          <w:b w:val="0"/>
+          <w:bCs/>
+        </w:rPr>
+        <w:t>Mejorar aún más la experiencia de usuario en dispositivos móviles.</w:t>
+      </w:r>
+    </w:p>
+    <w:p>
+      <w:pPr>
+        <w:pStyle w:val="Prrafodelista"/>
+        <w:numPr>
+          <w:ilvl w:val="0"/>
+          <w:numId w:val="39"/>
+        </w:numPr>
+        <w:rPr>
+          <w:b w:val="0"/>
+          <w:bCs/>
+        </w:rPr>
+      </w:pPr>
+      <w:r>
+        <w:rPr>
+          <w:b w:val="0"/>
+          <w:bCs/>
+        </w:rPr>
+        <w:t>Agregar notificaciones automáticas relacionadas con inventario bajo o movimientos importantes.</w:t>
+      </w:r>
+    </w:p>
+    <w:p>
+      <w:pPr>
+        <w:pStyle w:val="Prrafodelista"/>
+        <w:numPr>
+          <w:ilvl w:val="0"/>
+          <w:numId w:val="39"/>
+        </w:numPr>
+        <w:rPr>
+          <w:b w:val="0"/>
+          <w:bCs/>
+        </w:rPr>
+      </w:pPr>
+      <w:r>
+        <w:rPr>
+          <w:b w:val="0"/>
+          <w:bCs/>
+        </w:rPr>
+        <w:t>Fortalecer la seguridad del sistema con auditorías y registros de actividad de usuarios.</w:t>
+      </w:r>
+    </w:p>
+    <w:p>
+      <w:pPr>
+        <w:pStyle w:val="Prrafodelista"/>
+        <w:numPr>
+          <w:ilvl w:val="0"/>
+          <w:numId w:val="39"/>
+        </w:numPr>
+        <w:rPr>
+          <w:b w:val="0"/>
+          <w:bCs/>
+        </w:rPr>
+      </w:pPr>
+      <w:r>
+        <w:rPr>
+          <w:b w:val="0"/>
+          <w:bCs/>
+        </w:rPr>
+        <w:t>Implementar métricas e indicadores de rendimiento para apoyar la toma de decisiones.</w:t>
       </w:r>
     </w:p>
     <w:p>
@@ -6821,14 +7860,9 @@
       <w:pPr>
         <w:pStyle w:val="Ttulo2"/>
       </w:pPr>
-      <w:proofErr w:type="spellStart"/>
       <w:r>
         <w:lastRenderedPageBreak/>
-        <w:t>Product</w:t>
-      </w:r>
-      <w:proofErr w:type="spellEnd"/>
-      <w:r>
-        <w:t xml:space="preserve"> Backlog Actualizado</w:t>
+        <w:t>Product Backlog Actualizado</w:t>
       </w:r>
     </w:p>
     <w:tbl>
@@ -7656,7 +8690,7 @@
               <w:cnfStyle w:val="000000100000" w:firstRow="0" w:lastRow="0" w:firstColumn="0" w:lastColumn="0" w:oddVBand="0" w:evenVBand="0" w:oddHBand="1" w:evenHBand="0" w:firstRowFirstColumn="0" w:firstRowLastColumn="0" w:lastRowFirstColumn="0" w:lastRowLastColumn="0"/>
             </w:pPr>
             <w:r>
-              <w:t>En desarrollo</w:t>
+              <w:t>Terminada</w:t>
             </w:r>
           </w:p>
         </w:tc>
@@ -7677,13 +8711,72 @@
     <w:p>
       <w:pPr>
         <w:pStyle w:val="Ttulo1"/>
-        <w:rPr>
-          <w:noProof/>
-        </w:rPr>
       </w:pPr>
       <w:r>
         <w:lastRenderedPageBreak/>
         <w:t>Referencias</w:t>
+      </w:r>
+    </w:p>
+    <w:p>
+      <w:pPr>
+        <w:pStyle w:val="Ttulo1"/>
+        <w:rPr>
+          <w:noProof/>
+        </w:rPr>
+      </w:pPr>
+      <w:r>
+        <w:rPr>
+          <w:noProof/>
+          <w:lang w:eastAsia="es-ES"/>
+        </w:rPr>
+        <w:drawing>
+          <wp:inline distT="0" distB="0" distL="0" distR="0" wp14:anchorId="13A6BE7C" wp14:editId="7EE65FD4">
+            <wp:extent cx="5614035" cy="1510030"/>
+            <wp:effectExtent l="0" t="0" r="5715" b="0"/>
+            <wp:docPr id="27" name="Imagen 27"/>
+            <wp:cNvGraphicFramePr>
+              <a:graphicFrameLocks xmlns:a="http://schemas.openxmlformats.org/drawingml/2006/main" noChangeAspect="1"/>
+            </wp:cNvGraphicFramePr>
+            <a:graphic xmlns:a="http://schemas.openxmlformats.org/drawingml/2006/main">
+              <a:graphicData uri="http://schemas.openxmlformats.org/drawingml/2006/picture">
+                <pic:pic xmlns:pic="http://schemas.openxmlformats.org/drawingml/2006/picture">
+                  <pic:nvPicPr>
+                    <pic:cNvPr id="0" name="Picture 1"/>
+                    <pic:cNvPicPr>
+                      <a:picLocks noChangeAspect="1" noChangeArrowheads="1"/>
+                    </pic:cNvPicPr>
+                  </pic:nvPicPr>
+                  <pic:blipFill>
+                    <a:blip r:embed="rId27">
+                      <a:extLst>
+                        <a:ext uri="{28A0092B-C50C-407E-A947-70E740481C1C}">
+                          <a14:useLocalDpi xmlns:a14="http://schemas.microsoft.com/office/drawing/2010/main" val="0"/>
+                        </a:ext>
+                      </a:extLst>
+                    </a:blip>
+                    <a:srcRect/>
+                    <a:stretch>
+                      <a:fillRect/>
+                    </a:stretch>
+                  </pic:blipFill>
+                  <pic:spPr bwMode="auto">
+                    <a:xfrm>
+                      <a:off x="0" y="0"/>
+                      <a:ext cx="5614035" cy="1510030"/>
+                    </a:xfrm>
+                    <a:prstGeom prst="rect">
+                      <a:avLst/>
+                    </a:prstGeom>
+                    <a:noFill/>
+                    <a:ln>
+                      <a:noFill/>
+                    </a:ln>
+                  </pic:spPr>
+                </pic:pic>
+              </a:graphicData>
+            </a:graphic>
+          </wp:inline>
+        </w:drawing>
       </w:r>
     </w:p>
     <w:sectPr>
@@ -7698,7 +8791,7 @@
 </file>
 
 <file path=word/endnotes.xml><?xml version="1.0" encoding="utf-8"?>
-<w:endnotes xmlns:wpc="http://schemas.microsoft.com/office/word/2010/wordprocessingCanvas" xmlns:cx="http://schemas.microsoft.com/office/drawing/2014/chartex" xmlns:cx1="http://schemas.microsoft.com/office/drawing/2015/9/8/chartex" xmlns:cx2="http://schemas.microsoft.com/office/drawing/2015/10/21/chartex" xmlns:cx3="http://schemas.microsoft.com/office/drawing/2016/5/9/chartex" xmlns:cx4="http://schemas.microsoft.com/office/drawing/2016/5/10/chartex" xmlns:cx5="http://schemas.microsoft.com/office/drawing/2016/5/11/chartex" xmlns:cx6="http://schemas.microsoft.com/office/drawing/2016/5/12/chartex" xmlns:cx7="http://schemas.microsoft.com/office/drawing/2016/5/13/chartex" xmlns:cx8="http://schemas.microsoft.com/office/drawing/2016/5/14/chartex" xmlns:mc="http://schemas.openxmlformats.org/markup-compatibility/2006" xmlns:aink="http://schemas.microsoft.com/office/drawing/2016/ink" xmlns:am3d="http://schemas.microsoft.com/office/drawing/2017/model3d" xmlns:o="urn:schemas-microsoft-com:office:office" xmlns:r="http://schemas.openxmlformats.org/officeDocument/2006/relationships" xmlns:m="http://schemas.openxmlformats.org/officeDocument/2006/math" xmlns:v="urn:schemas-microsoft-com:vml" xmlns:wp14="http://schemas.microsoft.com/office/word/2010/wordprocessingDrawing" xmlns:wp="http://schemas.openxmlformats.org/drawingml/2006/wordprocessingDrawing" xmlns:w10="urn:schemas-microsoft-com:office:word" xmlns:w="http://schemas.openxmlformats.org/wordprocessingml/2006/main" xmlns:w14="http://schemas.microsoft.com/office/word/2010/wordml" xmlns:w15="http://schemas.microsoft.com/office/word/2012/wordml" xmlns:w16cid="http://schemas.microsoft.com/office/word/2016/wordml/cid" xmlns:w16se="http://schemas.microsoft.com/office/word/2015/wordml/symex" xmlns:wpg="http://schemas.microsoft.com/office/word/2010/wordprocessingGroup" xmlns:wpi="http://schemas.microsoft.com/office/word/2010/wordprocessingInk" xmlns:wne="http://schemas.microsoft.com/office/word/2006/wordml" xmlns:wps="http://schemas.microsoft.com/office/word/2010/wordprocessingShape" mc:Ignorable="w14 w15 w16se w16cid wp14">
+<w:endnotes xmlns:wpc="http://schemas.microsoft.com/office/word/2010/wordprocessingCanvas" xmlns:cx="http://schemas.microsoft.com/office/drawing/2014/chartex" xmlns:cx1="http://schemas.microsoft.com/office/drawing/2015/9/8/chartex" xmlns:cx2="http://schemas.microsoft.com/office/drawing/2015/10/21/chartex" xmlns:cx3="http://schemas.microsoft.com/office/drawing/2016/5/9/chartex" xmlns:cx4="http://schemas.microsoft.com/office/drawing/2016/5/10/chartex" xmlns:cx5="http://schemas.microsoft.com/office/drawing/2016/5/11/chartex" xmlns:cx6="http://schemas.microsoft.com/office/drawing/2016/5/12/chartex" xmlns:cx7="http://schemas.microsoft.com/office/drawing/2016/5/13/chartex" xmlns:cx8="http://schemas.microsoft.com/office/drawing/2016/5/14/chartex" xmlns:mc="http://schemas.openxmlformats.org/markup-compatibility/2006" xmlns:aink="http://schemas.microsoft.com/office/drawing/2016/ink" xmlns:am3d="http://schemas.microsoft.com/office/drawing/2017/model3d" xmlns:o="urn:schemas-microsoft-com:office:office" xmlns:r="http://schemas.openxmlformats.org/officeDocument/2006/relationships" xmlns:m="http://schemas.openxmlformats.org/officeDocument/2006/math" xmlns:v="urn:schemas-microsoft-com:vml" xmlns:wp14="http://schemas.microsoft.com/office/word/2010/wordprocessingDrawing" xmlns:wp="http://schemas.openxmlformats.org/drawingml/2006/wordprocessingDrawing" xmlns:w10="urn:schemas-microsoft-com:office:word" xmlns:w="http://schemas.openxmlformats.org/wordprocessingml/2006/main" xmlns:w14="http://schemas.microsoft.com/office/word/2010/wordml" xmlns:w15="http://schemas.microsoft.com/office/word/2012/wordml" xmlns:w16cex="http://schemas.microsoft.com/office/word/2018/wordml/cex" xmlns:w16cid="http://schemas.microsoft.com/office/word/2016/wordml/cid" xmlns:w16="http://schemas.microsoft.com/office/word/2018/wordml" xmlns:w16sdtdh="http://schemas.microsoft.com/office/word/2020/wordml/sdtdatahash" xmlns:w16se="http://schemas.microsoft.com/office/word/2015/wordml/symex" xmlns:wpg="http://schemas.microsoft.com/office/word/2010/wordprocessingGroup" xmlns:wpi="http://schemas.microsoft.com/office/word/2010/wordprocessingInk" xmlns:wne="http://schemas.microsoft.com/office/word/2006/wordml" xmlns:wps="http://schemas.microsoft.com/office/word/2010/wordprocessingShape" mc:Ignorable="w14 w15 w16se w16cid w16 w16cex w16sdtdh wp14">
   <w:endnote w:type="separator" w:id="-1">
     <w:p>
       <w:r>
@@ -7719,7 +8812,7 @@
 </file>
 
 <file path=word/footer1.xml><?xml version="1.0" encoding="utf-8"?>
-<w:ftr xmlns:wpc="http://schemas.microsoft.com/office/word/2010/wordprocessingCanvas" xmlns:cx="http://schemas.microsoft.com/office/drawing/2014/chartex" xmlns:cx1="http://schemas.microsoft.com/office/drawing/2015/9/8/chartex" xmlns:cx2="http://schemas.microsoft.com/office/drawing/2015/10/21/chartex" xmlns:cx3="http://schemas.microsoft.com/office/drawing/2016/5/9/chartex" xmlns:cx4="http://schemas.microsoft.com/office/drawing/2016/5/10/chartex" xmlns:cx5="http://schemas.microsoft.com/office/drawing/2016/5/11/chartex" xmlns:cx6="http://schemas.microsoft.com/office/drawing/2016/5/12/chartex" xmlns:cx7="http://schemas.microsoft.com/office/drawing/2016/5/13/chartex" xmlns:cx8="http://schemas.microsoft.com/office/drawing/2016/5/14/chartex" xmlns:mc="http://schemas.openxmlformats.org/markup-compatibility/2006" xmlns:aink="http://schemas.microsoft.com/office/drawing/2016/ink" xmlns:am3d="http://schemas.microsoft.com/office/drawing/2017/model3d" xmlns:o="urn:schemas-microsoft-com:office:office" xmlns:r="http://schemas.openxmlformats.org/officeDocument/2006/relationships" xmlns:m="http://schemas.openxmlformats.org/officeDocument/2006/math" xmlns:v="urn:schemas-microsoft-com:vml" xmlns:wp14="http://schemas.microsoft.com/office/word/2010/wordprocessingDrawing" xmlns:wp="http://schemas.openxmlformats.org/drawingml/2006/wordprocessingDrawing" xmlns:w10="urn:schemas-microsoft-com:office:word" xmlns:w="http://schemas.openxmlformats.org/wordprocessingml/2006/main" xmlns:w14="http://schemas.microsoft.com/office/word/2010/wordml" xmlns:w15="http://schemas.microsoft.com/office/word/2012/wordml" xmlns:w16cid="http://schemas.microsoft.com/office/word/2016/wordml/cid" xmlns:w16se="http://schemas.microsoft.com/office/word/2015/wordml/symex" xmlns:wpg="http://schemas.microsoft.com/office/word/2010/wordprocessingGroup" xmlns:wpi="http://schemas.microsoft.com/office/word/2010/wordprocessingInk" xmlns:wne="http://schemas.microsoft.com/office/word/2006/wordml" xmlns:wps="http://schemas.microsoft.com/office/word/2010/wordprocessingShape" mc:Ignorable="w14 w15 w16se w16cid wp14">
+<w:ftr xmlns:wpc="http://schemas.microsoft.com/office/word/2010/wordprocessingCanvas" xmlns:cx="http://schemas.microsoft.com/office/drawing/2014/chartex" xmlns:cx1="http://schemas.microsoft.com/office/drawing/2015/9/8/chartex" xmlns:cx2="http://schemas.microsoft.com/office/drawing/2015/10/21/chartex" xmlns:cx3="http://schemas.microsoft.com/office/drawing/2016/5/9/chartex" xmlns:cx4="http://schemas.microsoft.com/office/drawing/2016/5/10/chartex" xmlns:cx5="http://schemas.microsoft.com/office/drawing/2016/5/11/chartex" xmlns:cx6="http://schemas.microsoft.com/office/drawing/2016/5/12/chartex" xmlns:cx7="http://schemas.microsoft.com/office/drawing/2016/5/13/chartex" xmlns:cx8="http://schemas.microsoft.com/office/drawing/2016/5/14/chartex" xmlns:mc="http://schemas.openxmlformats.org/markup-compatibility/2006" xmlns:aink="http://schemas.microsoft.com/office/drawing/2016/ink" xmlns:am3d="http://schemas.microsoft.com/office/drawing/2017/model3d" xmlns:o="urn:schemas-microsoft-com:office:office" xmlns:r="http://schemas.openxmlformats.org/officeDocument/2006/relationships" xmlns:m="http://schemas.openxmlformats.org/officeDocument/2006/math" xmlns:v="urn:schemas-microsoft-com:vml" xmlns:wp14="http://schemas.microsoft.com/office/word/2010/wordprocessingDrawing" xmlns:wp="http://schemas.openxmlformats.org/drawingml/2006/wordprocessingDrawing" xmlns:w10="urn:schemas-microsoft-com:office:word" xmlns:w="http://schemas.openxmlformats.org/wordprocessingml/2006/main" xmlns:w14="http://schemas.microsoft.com/office/word/2010/wordml" xmlns:w15="http://schemas.microsoft.com/office/word/2012/wordml" xmlns:w16cex="http://schemas.microsoft.com/office/word/2018/wordml/cex" xmlns:w16cid="http://schemas.microsoft.com/office/word/2016/wordml/cid" xmlns:w16="http://schemas.microsoft.com/office/word/2018/wordml" xmlns:w16sdtdh="http://schemas.microsoft.com/office/word/2020/wordml/sdtdatahash" xmlns:w16se="http://schemas.microsoft.com/office/word/2015/wordml/symex" xmlns:wpg="http://schemas.microsoft.com/office/word/2010/wordprocessingGroup" xmlns:wpi="http://schemas.microsoft.com/office/word/2010/wordprocessingInk" xmlns:wne="http://schemas.microsoft.com/office/word/2006/wordml" xmlns:wps="http://schemas.microsoft.com/office/word/2010/wordprocessingShape" mc:Ignorable="w14 w15 w16se w16cid w16 w16cex w16sdtdh wp14">
   <w:sdt>
     <w:sdtPr>
       <w:rPr>
@@ -7791,7 +8884,7 @@
 </file>
 
 <file path=word/footer2.xml><?xml version="1.0" encoding="utf-8"?>
-<w:ftr xmlns:wpc="http://schemas.microsoft.com/office/word/2010/wordprocessingCanvas" xmlns:cx="http://schemas.microsoft.com/office/drawing/2014/chartex" xmlns:cx1="http://schemas.microsoft.com/office/drawing/2015/9/8/chartex" xmlns:cx2="http://schemas.microsoft.com/office/drawing/2015/10/21/chartex" xmlns:cx3="http://schemas.microsoft.com/office/drawing/2016/5/9/chartex" xmlns:cx4="http://schemas.microsoft.com/office/drawing/2016/5/10/chartex" xmlns:cx5="http://schemas.microsoft.com/office/drawing/2016/5/11/chartex" xmlns:cx6="http://schemas.microsoft.com/office/drawing/2016/5/12/chartex" xmlns:cx7="http://schemas.microsoft.com/office/drawing/2016/5/13/chartex" xmlns:cx8="http://schemas.microsoft.com/office/drawing/2016/5/14/chartex" xmlns:mc="http://schemas.openxmlformats.org/markup-compatibility/2006" xmlns:aink="http://schemas.microsoft.com/office/drawing/2016/ink" xmlns:am3d="http://schemas.microsoft.com/office/drawing/2017/model3d" xmlns:o="urn:schemas-microsoft-com:office:office" xmlns:r="http://schemas.openxmlformats.org/officeDocument/2006/relationships" xmlns:m="http://schemas.openxmlformats.org/officeDocument/2006/math" xmlns:v="urn:schemas-microsoft-com:vml" xmlns:wp14="http://schemas.microsoft.com/office/word/2010/wordprocessingDrawing" xmlns:wp="http://schemas.openxmlformats.org/drawingml/2006/wordprocessingDrawing" xmlns:w10="urn:schemas-microsoft-com:office:word" xmlns:w="http://schemas.openxmlformats.org/wordprocessingml/2006/main" xmlns:w14="http://schemas.microsoft.com/office/word/2010/wordml" xmlns:w15="http://schemas.microsoft.com/office/word/2012/wordml" xmlns:w16cid="http://schemas.microsoft.com/office/word/2016/wordml/cid" xmlns:w16se="http://schemas.microsoft.com/office/word/2015/wordml/symex" xmlns:wpg="http://schemas.microsoft.com/office/word/2010/wordprocessingGroup" xmlns:wpi="http://schemas.microsoft.com/office/word/2010/wordprocessingInk" xmlns:wne="http://schemas.microsoft.com/office/word/2006/wordml" xmlns:wps="http://schemas.microsoft.com/office/word/2010/wordprocessingShape" mc:Ignorable="w14 w15 w16se w16cid wp14">
+<w:ftr xmlns:wpc="http://schemas.microsoft.com/office/word/2010/wordprocessingCanvas" xmlns:cx="http://schemas.microsoft.com/office/drawing/2014/chartex" xmlns:cx1="http://schemas.microsoft.com/office/drawing/2015/9/8/chartex" xmlns:cx2="http://schemas.microsoft.com/office/drawing/2015/10/21/chartex" xmlns:cx3="http://schemas.microsoft.com/office/drawing/2016/5/9/chartex" xmlns:cx4="http://schemas.microsoft.com/office/drawing/2016/5/10/chartex" xmlns:cx5="http://schemas.microsoft.com/office/drawing/2016/5/11/chartex" xmlns:cx6="http://schemas.microsoft.com/office/drawing/2016/5/12/chartex" xmlns:cx7="http://schemas.microsoft.com/office/drawing/2016/5/13/chartex" xmlns:cx8="http://schemas.microsoft.com/office/drawing/2016/5/14/chartex" xmlns:mc="http://schemas.openxmlformats.org/markup-compatibility/2006" xmlns:aink="http://schemas.microsoft.com/office/drawing/2016/ink" xmlns:am3d="http://schemas.microsoft.com/office/drawing/2017/model3d" xmlns:o="urn:schemas-microsoft-com:office:office" xmlns:r="http://schemas.openxmlformats.org/officeDocument/2006/relationships" xmlns:m="http://schemas.openxmlformats.org/officeDocument/2006/math" xmlns:v="urn:schemas-microsoft-com:vml" xmlns:wp14="http://schemas.microsoft.com/office/word/2010/wordprocessingDrawing" xmlns:wp="http://schemas.openxmlformats.org/drawingml/2006/wordprocessingDrawing" xmlns:w10="urn:schemas-microsoft-com:office:word" xmlns:w="http://schemas.openxmlformats.org/wordprocessingml/2006/main" xmlns:w14="http://schemas.microsoft.com/office/word/2010/wordml" xmlns:w15="http://schemas.microsoft.com/office/word/2012/wordml" xmlns:w16cex="http://schemas.microsoft.com/office/word/2018/wordml/cex" xmlns:w16cid="http://schemas.microsoft.com/office/word/2016/wordml/cid" xmlns:w16="http://schemas.microsoft.com/office/word/2018/wordml" xmlns:w16sdtdh="http://schemas.microsoft.com/office/word/2020/wordml/sdtdatahash" xmlns:w16se="http://schemas.microsoft.com/office/word/2015/wordml/symex" xmlns:wpg="http://schemas.microsoft.com/office/word/2010/wordprocessingGroup" xmlns:wpi="http://schemas.microsoft.com/office/word/2010/wordprocessingInk" xmlns:wne="http://schemas.microsoft.com/office/word/2006/wordml" xmlns:wps="http://schemas.microsoft.com/office/word/2010/wordprocessingShape" mc:Ignorable="w14 w15 w16se w16cid w16 w16cex w16sdtdh wp14">
   <w:sdt>
     <w:sdtPr>
       <w:rPr>
@@ -7863,7 +8956,7 @@
 </file>
 
 <file path=word/footnotes.xml><?xml version="1.0" encoding="utf-8"?>
-<w:footnotes xmlns:wpc="http://schemas.microsoft.com/office/word/2010/wordprocessingCanvas" xmlns:cx="http://schemas.microsoft.com/office/drawing/2014/chartex" xmlns:cx1="http://schemas.microsoft.com/office/drawing/2015/9/8/chartex" xmlns:cx2="http://schemas.microsoft.com/office/drawing/2015/10/21/chartex" xmlns:cx3="http://schemas.microsoft.com/office/drawing/2016/5/9/chartex" xmlns:cx4="http://schemas.microsoft.com/office/drawing/2016/5/10/chartex" xmlns:cx5="http://schemas.microsoft.com/office/drawing/2016/5/11/chartex" xmlns:cx6="http://schemas.microsoft.com/office/drawing/2016/5/12/chartex" xmlns:cx7="http://schemas.microsoft.com/office/drawing/2016/5/13/chartex" xmlns:cx8="http://schemas.microsoft.com/office/drawing/2016/5/14/chartex" xmlns:mc="http://schemas.openxmlformats.org/markup-compatibility/2006" xmlns:aink="http://schemas.microsoft.com/office/drawing/2016/ink" xmlns:am3d="http://schemas.microsoft.com/office/drawing/2017/model3d" xmlns:o="urn:schemas-microsoft-com:office:office" xmlns:r="http://schemas.openxmlformats.org/officeDocument/2006/relationships" xmlns:m="http://schemas.openxmlformats.org/officeDocument/2006/math" xmlns:v="urn:schemas-microsoft-com:vml" xmlns:wp14="http://schemas.microsoft.com/office/word/2010/wordprocessingDrawing" xmlns:wp="http://schemas.openxmlformats.org/drawingml/2006/wordprocessingDrawing" xmlns:w10="urn:schemas-microsoft-com:office:word" xmlns:w="http://schemas.openxmlformats.org/wordprocessingml/2006/main" xmlns:w14="http://schemas.microsoft.com/office/word/2010/wordml" xmlns:w15="http://schemas.microsoft.com/office/word/2012/wordml" xmlns:w16cid="http://schemas.microsoft.com/office/word/2016/wordml/cid" xmlns:w16se="http://schemas.microsoft.com/office/word/2015/wordml/symex" xmlns:wpg="http://schemas.microsoft.com/office/word/2010/wordprocessingGroup" xmlns:wpi="http://schemas.microsoft.com/office/word/2010/wordprocessingInk" xmlns:wne="http://schemas.microsoft.com/office/word/2006/wordml" xmlns:wps="http://schemas.microsoft.com/office/word/2010/wordprocessingShape" mc:Ignorable="w14 w15 w16se w16cid wp14">
+<w:footnotes xmlns:wpc="http://schemas.microsoft.com/office/word/2010/wordprocessingCanvas" xmlns:cx="http://schemas.microsoft.com/office/drawing/2014/chartex" xmlns:cx1="http://schemas.microsoft.com/office/drawing/2015/9/8/chartex" xmlns:cx2="http://schemas.microsoft.com/office/drawing/2015/10/21/chartex" xmlns:cx3="http://schemas.microsoft.com/office/drawing/2016/5/9/chartex" xmlns:cx4="http://schemas.microsoft.com/office/drawing/2016/5/10/chartex" xmlns:cx5="http://schemas.microsoft.com/office/drawing/2016/5/11/chartex" xmlns:cx6="http://schemas.microsoft.com/office/drawing/2016/5/12/chartex" xmlns:cx7="http://schemas.microsoft.com/office/drawing/2016/5/13/chartex" xmlns:cx8="http://schemas.microsoft.com/office/drawing/2016/5/14/chartex" xmlns:mc="http://schemas.openxmlformats.org/markup-compatibility/2006" xmlns:aink="http://schemas.microsoft.com/office/drawing/2016/ink" xmlns:am3d="http://schemas.microsoft.com/office/drawing/2017/model3d" xmlns:o="urn:schemas-microsoft-com:office:office" xmlns:r="http://schemas.openxmlformats.org/officeDocument/2006/relationships" xmlns:m="http://schemas.openxmlformats.org/officeDocument/2006/math" xmlns:v="urn:schemas-microsoft-com:vml" xmlns:wp14="http://schemas.microsoft.com/office/word/2010/wordprocessingDrawing" xmlns:wp="http://schemas.openxmlformats.org/drawingml/2006/wordprocessingDrawing" xmlns:w10="urn:schemas-microsoft-com:office:word" xmlns:w="http://schemas.openxmlformats.org/wordprocessingml/2006/main" xmlns:w14="http://schemas.microsoft.com/office/word/2010/wordml" xmlns:w15="http://schemas.microsoft.com/office/word/2012/wordml" xmlns:w16cex="http://schemas.microsoft.com/office/word/2018/wordml/cex" xmlns:w16cid="http://schemas.microsoft.com/office/word/2016/wordml/cid" xmlns:w16="http://schemas.microsoft.com/office/word/2018/wordml" xmlns:w16sdtdh="http://schemas.microsoft.com/office/word/2020/wordml/sdtdatahash" xmlns:w16se="http://schemas.microsoft.com/office/word/2015/wordml/symex" xmlns:wpg="http://schemas.microsoft.com/office/word/2010/wordprocessingGroup" xmlns:wpi="http://schemas.microsoft.com/office/word/2010/wordprocessingInk" xmlns:wne="http://schemas.microsoft.com/office/word/2006/wordml" xmlns:wps="http://schemas.microsoft.com/office/word/2010/wordprocessingShape" mc:Ignorable="w14 w15 w16se w16cid w16 w16cex w16sdtdh wp14">
   <w:footnote w:type="separator" w:id="-1">
     <w:p>
       <w:r>
@@ -7884,7 +8977,7 @@
 </file>
 
 <file path=word/header1.xml><?xml version="1.0" encoding="utf-8"?>
-<w:hdr xmlns:wpc="http://schemas.microsoft.com/office/word/2010/wordprocessingCanvas" xmlns:cx="http://schemas.microsoft.com/office/drawing/2014/chartex" xmlns:cx1="http://schemas.microsoft.com/office/drawing/2015/9/8/chartex" xmlns:cx2="http://schemas.microsoft.com/office/drawing/2015/10/21/chartex" xmlns:cx3="http://schemas.microsoft.com/office/drawing/2016/5/9/chartex" xmlns:cx4="http://schemas.microsoft.com/office/drawing/2016/5/10/chartex" xmlns:cx5="http://schemas.microsoft.com/office/drawing/2016/5/11/chartex" xmlns:cx6="http://schemas.microsoft.com/office/drawing/2016/5/12/chartex" xmlns:cx7="http://schemas.microsoft.com/office/drawing/2016/5/13/chartex" xmlns:cx8="http://schemas.microsoft.com/office/drawing/2016/5/14/chartex" xmlns:mc="http://schemas.openxmlformats.org/markup-compatibility/2006" xmlns:aink="http://schemas.microsoft.com/office/drawing/2016/ink" xmlns:am3d="http://schemas.microsoft.com/office/drawing/2017/model3d" xmlns:o="urn:schemas-microsoft-com:office:office" xmlns:r="http://schemas.openxmlformats.org/officeDocument/2006/relationships" xmlns:m="http://schemas.openxmlformats.org/officeDocument/2006/math" xmlns:v="urn:schemas-microsoft-com:vml" xmlns:wp14="http://schemas.microsoft.com/office/word/2010/wordprocessingDrawing" xmlns:wp="http://schemas.openxmlformats.org/drawingml/2006/wordprocessingDrawing" xmlns:w10="urn:schemas-microsoft-com:office:word" xmlns:w="http://schemas.openxmlformats.org/wordprocessingml/2006/main" xmlns:w14="http://schemas.microsoft.com/office/word/2010/wordml" xmlns:w15="http://schemas.microsoft.com/office/word/2012/wordml" xmlns:w16cid="http://schemas.microsoft.com/office/word/2016/wordml/cid" xmlns:w16se="http://schemas.microsoft.com/office/word/2015/wordml/symex" xmlns:wpg="http://schemas.microsoft.com/office/word/2010/wordprocessingGroup" xmlns:wpi="http://schemas.microsoft.com/office/word/2010/wordprocessingInk" xmlns:wne="http://schemas.microsoft.com/office/word/2006/wordml" xmlns:wps="http://schemas.microsoft.com/office/word/2010/wordprocessingShape" mc:Ignorable="w14 w15 w16se w16cid wp14">
+<w:hdr xmlns:wpc="http://schemas.microsoft.com/office/word/2010/wordprocessingCanvas" xmlns:cx="http://schemas.microsoft.com/office/drawing/2014/chartex" xmlns:cx1="http://schemas.microsoft.com/office/drawing/2015/9/8/chartex" xmlns:cx2="http://schemas.microsoft.com/office/drawing/2015/10/21/chartex" xmlns:cx3="http://schemas.microsoft.com/office/drawing/2016/5/9/chartex" xmlns:cx4="http://schemas.microsoft.com/office/drawing/2016/5/10/chartex" xmlns:cx5="http://schemas.microsoft.com/office/drawing/2016/5/11/chartex" xmlns:cx6="http://schemas.microsoft.com/office/drawing/2016/5/12/chartex" xmlns:cx7="http://schemas.microsoft.com/office/drawing/2016/5/13/chartex" xmlns:cx8="http://schemas.microsoft.com/office/drawing/2016/5/14/chartex" xmlns:mc="http://schemas.openxmlformats.org/markup-compatibility/2006" xmlns:aink="http://schemas.microsoft.com/office/drawing/2016/ink" xmlns:am3d="http://schemas.microsoft.com/office/drawing/2017/model3d" xmlns:o="urn:schemas-microsoft-com:office:office" xmlns:r="http://schemas.openxmlformats.org/officeDocument/2006/relationships" xmlns:m="http://schemas.openxmlformats.org/officeDocument/2006/math" xmlns:v="urn:schemas-microsoft-com:vml" xmlns:wp14="http://schemas.microsoft.com/office/word/2010/wordprocessingDrawing" xmlns:wp="http://schemas.openxmlformats.org/drawingml/2006/wordprocessingDrawing" xmlns:w10="urn:schemas-microsoft-com:office:word" xmlns:w="http://schemas.openxmlformats.org/wordprocessingml/2006/main" xmlns:w14="http://schemas.microsoft.com/office/word/2010/wordml" xmlns:w15="http://schemas.microsoft.com/office/word/2012/wordml" xmlns:w16cex="http://schemas.microsoft.com/office/word/2018/wordml/cex" xmlns:w16cid="http://schemas.microsoft.com/office/word/2016/wordml/cid" xmlns:w16="http://schemas.microsoft.com/office/word/2018/wordml" xmlns:w16sdtdh="http://schemas.microsoft.com/office/word/2020/wordml/sdtdatahash" xmlns:w16se="http://schemas.microsoft.com/office/word/2015/wordml/symex" xmlns:wpg="http://schemas.microsoft.com/office/word/2010/wordprocessingGroup" xmlns:wpi="http://schemas.microsoft.com/office/word/2010/wordprocessingInk" xmlns:wne="http://schemas.microsoft.com/office/word/2006/wordml" xmlns:wps="http://schemas.microsoft.com/office/word/2010/wordprocessingShape" mc:Ignorable="w14 w15 w16se w16cid w16 w16cex w16sdtdh wp14">
   <w:tbl>
     <w:tblPr>
       <w:tblW w:w="10035" w:type="dxa"/>
@@ -7938,7 +9031,7 @@
 </file>
 
 <file path=word/header2.xml><?xml version="1.0" encoding="utf-8"?>
-<w:hdr xmlns:wpc="http://schemas.microsoft.com/office/word/2010/wordprocessingCanvas" xmlns:cx="http://schemas.microsoft.com/office/drawing/2014/chartex" xmlns:cx1="http://schemas.microsoft.com/office/drawing/2015/9/8/chartex" xmlns:cx2="http://schemas.microsoft.com/office/drawing/2015/10/21/chartex" xmlns:cx3="http://schemas.microsoft.com/office/drawing/2016/5/9/chartex" xmlns:cx4="http://schemas.microsoft.com/office/drawing/2016/5/10/chartex" xmlns:cx5="http://schemas.microsoft.com/office/drawing/2016/5/11/chartex" xmlns:cx6="http://schemas.microsoft.com/office/drawing/2016/5/12/chartex" xmlns:cx7="http://schemas.microsoft.com/office/drawing/2016/5/13/chartex" xmlns:cx8="http://schemas.microsoft.com/office/drawing/2016/5/14/chartex" xmlns:mc="http://schemas.openxmlformats.org/markup-compatibility/2006" xmlns:aink="http://schemas.microsoft.com/office/drawing/2016/ink" xmlns:am3d="http://schemas.microsoft.com/office/drawing/2017/model3d" xmlns:o="urn:schemas-microsoft-com:office:office" xmlns:r="http://schemas.openxmlformats.org/officeDocument/2006/relationships" xmlns:m="http://schemas.openxmlformats.org/officeDocument/2006/math" xmlns:v="urn:schemas-microsoft-com:vml" xmlns:wp14="http://schemas.microsoft.com/office/word/2010/wordprocessingDrawing" xmlns:wp="http://schemas.openxmlformats.org/drawingml/2006/wordprocessingDrawing" xmlns:w10="urn:schemas-microsoft-com:office:word" xmlns:w="http://schemas.openxmlformats.org/wordprocessingml/2006/main" xmlns:w14="http://schemas.microsoft.com/office/word/2010/wordml" xmlns:w15="http://schemas.microsoft.com/office/word/2012/wordml" xmlns:w16cid="http://schemas.microsoft.com/office/word/2016/wordml/cid" xmlns:w16se="http://schemas.microsoft.com/office/word/2015/wordml/symex" xmlns:wpg="http://schemas.microsoft.com/office/word/2010/wordprocessingGroup" xmlns:wpi="http://schemas.microsoft.com/office/word/2010/wordprocessingInk" xmlns:wne="http://schemas.microsoft.com/office/word/2006/wordml" xmlns:wps="http://schemas.microsoft.com/office/word/2010/wordprocessingShape" mc:Ignorable="w14 w15 w16se w16cid wp14">
+<w:hdr xmlns:wpc="http://schemas.microsoft.com/office/word/2010/wordprocessingCanvas" xmlns:cx="http://schemas.microsoft.com/office/drawing/2014/chartex" xmlns:cx1="http://schemas.microsoft.com/office/drawing/2015/9/8/chartex" xmlns:cx2="http://schemas.microsoft.com/office/drawing/2015/10/21/chartex" xmlns:cx3="http://schemas.microsoft.com/office/drawing/2016/5/9/chartex" xmlns:cx4="http://schemas.microsoft.com/office/drawing/2016/5/10/chartex" xmlns:cx5="http://schemas.microsoft.com/office/drawing/2016/5/11/chartex" xmlns:cx6="http://schemas.microsoft.com/office/drawing/2016/5/12/chartex" xmlns:cx7="http://schemas.microsoft.com/office/drawing/2016/5/13/chartex" xmlns:cx8="http://schemas.microsoft.com/office/drawing/2016/5/14/chartex" xmlns:mc="http://schemas.openxmlformats.org/markup-compatibility/2006" xmlns:aink="http://schemas.microsoft.com/office/drawing/2016/ink" xmlns:am3d="http://schemas.microsoft.com/office/drawing/2017/model3d" xmlns:o="urn:schemas-microsoft-com:office:office" xmlns:r="http://schemas.openxmlformats.org/officeDocument/2006/relationships" xmlns:m="http://schemas.openxmlformats.org/officeDocument/2006/math" xmlns:v="urn:schemas-microsoft-com:vml" xmlns:wp14="http://schemas.microsoft.com/office/word/2010/wordprocessingDrawing" xmlns:wp="http://schemas.openxmlformats.org/drawingml/2006/wordprocessingDrawing" xmlns:w10="urn:schemas-microsoft-com:office:word" xmlns:w="http://schemas.openxmlformats.org/wordprocessingml/2006/main" xmlns:w14="http://schemas.microsoft.com/office/word/2010/wordml" xmlns:w15="http://schemas.microsoft.com/office/word/2012/wordml" xmlns:w16cex="http://schemas.microsoft.com/office/word/2018/wordml/cex" xmlns:w16cid="http://schemas.microsoft.com/office/word/2016/wordml/cid" xmlns:w16="http://schemas.microsoft.com/office/word/2018/wordml" xmlns:w16sdtdh="http://schemas.microsoft.com/office/word/2020/wordml/sdtdatahash" xmlns:w16se="http://schemas.microsoft.com/office/word/2015/wordml/symex" xmlns:wpg="http://schemas.microsoft.com/office/word/2010/wordprocessingGroup" xmlns:wpi="http://schemas.microsoft.com/office/word/2010/wordprocessingInk" xmlns:wne="http://schemas.microsoft.com/office/word/2006/wordml" xmlns:wps="http://schemas.microsoft.com/office/word/2010/wordprocessingShape" mc:Ignorable="w14 w15 w16se w16cid w16 w16cex w16sdtdh wp14">
   <w:tbl>
     <w:tblPr>
       <w:tblW w:w="10035" w:type="dxa"/>
@@ -7992,7 +9085,7 @@
 </file>
 
 <file path=word/numbering.xml><?xml version="1.0" encoding="utf-8"?>
-<w:numbering xmlns:wpc="http://schemas.microsoft.com/office/word/2010/wordprocessingCanvas" xmlns:cx="http://schemas.microsoft.com/office/drawing/2014/chartex" xmlns:cx1="http://schemas.microsoft.com/office/drawing/2015/9/8/chartex" xmlns:cx2="http://schemas.microsoft.com/office/drawing/2015/10/21/chartex" xmlns:cx3="http://schemas.microsoft.com/office/drawing/2016/5/9/chartex" xmlns:cx4="http://schemas.microsoft.com/office/drawing/2016/5/10/chartex" xmlns:cx5="http://schemas.microsoft.com/office/drawing/2016/5/11/chartex" xmlns:cx6="http://schemas.microsoft.com/office/drawing/2016/5/12/chartex" xmlns:cx7="http://schemas.microsoft.com/office/drawing/2016/5/13/chartex" xmlns:cx8="http://schemas.microsoft.com/office/drawing/2016/5/14/chartex" xmlns:mc="http://schemas.openxmlformats.org/markup-compatibility/2006" xmlns:aink="http://schemas.microsoft.com/office/drawing/2016/ink" xmlns:am3d="http://schemas.microsoft.com/office/drawing/2017/model3d" xmlns:o="urn:schemas-microsoft-com:office:office" xmlns:r="http://schemas.openxmlformats.org/officeDocument/2006/relationships" xmlns:m="http://schemas.openxmlformats.org/officeDocument/2006/math" xmlns:v="urn:schemas-microsoft-com:vml" xmlns:wp14="http://schemas.microsoft.com/office/word/2010/wordprocessingDrawing" xmlns:wp="http://schemas.openxmlformats.org/drawingml/2006/wordprocessingDrawing" xmlns:w10="urn:schemas-microsoft-com:office:word" xmlns:w="http://schemas.openxmlformats.org/wordprocessingml/2006/main" xmlns:w14="http://schemas.microsoft.com/office/word/2010/wordml" xmlns:w15="http://schemas.microsoft.com/office/word/2012/wordml" xmlns:w16cid="http://schemas.microsoft.com/office/word/2016/wordml/cid" xmlns:w16se="http://schemas.microsoft.com/office/word/2015/wordml/symex" xmlns:wpg="http://schemas.microsoft.com/office/word/2010/wordprocessingGroup" xmlns:wpi="http://schemas.microsoft.com/office/word/2010/wordprocessingInk" xmlns:wne="http://schemas.microsoft.com/office/word/2006/wordml" xmlns:wps="http://schemas.microsoft.com/office/word/2010/wordprocessingShape" mc:Ignorable="w14 w15 w16se w16cid wp14">
+<w:numbering xmlns:wpc="http://schemas.microsoft.com/office/word/2010/wordprocessingCanvas" xmlns:cx="http://schemas.microsoft.com/office/drawing/2014/chartex" xmlns:cx1="http://schemas.microsoft.com/office/drawing/2015/9/8/chartex" xmlns:cx2="http://schemas.microsoft.com/office/drawing/2015/10/21/chartex" xmlns:cx3="http://schemas.microsoft.com/office/drawing/2016/5/9/chartex" xmlns:cx4="http://schemas.microsoft.com/office/drawing/2016/5/10/chartex" xmlns:cx5="http://schemas.microsoft.com/office/drawing/2016/5/11/chartex" xmlns:cx6="http://schemas.microsoft.com/office/drawing/2016/5/12/chartex" xmlns:cx7="http://schemas.microsoft.com/office/drawing/2016/5/13/chartex" xmlns:cx8="http://schemas.microsoft.com/office/drawing/2016/5/14/chartex" xmlns:mc="http://schemas.openxmlformats.org/markup-compatibility/2006" xmlns:aink="http://schemas.microsoft.com/office/drawing/2016/ink" xmlns:am3d="http://schemas.microsoft.com/office/drawing/2017/model3d" xmlns:o="urn:schemas-microsoft-com:office:office" xmlns:r="http://schemas.openxmlformats.org/officeDocument/2006/relationships" xmlns:m="http://schemas.openxmlformats.org/officeDocument/2006/math" xmlns:v="urn:schemas-microsoft-com:vml" xmlns:wp14="http://schemas.microsoft.com/office/word/2010/wordprocessingDrawing" xmlns:wp="http://schemas.openxmlformats.org/drawingml/2006/wordprocessingDrawing" xmlns:w10="urn:schemas-microsoft-com:office:word" xmlns:w="http://schemas.openxmlformats.org/wordprocessingml/2006/main" xmlns:w14="http://schemas.microsoft.com/office/word/2010/wordml" xmlns:w15="http://schemas.microsoft.com/office/word/2012/wordml" xmlns:w16cex="http://schemas.microsoft.com/office/word/2018/wordml/cex" xmlns:w16cid="http://schemas.microsoft.com/office/word/2016/wordml/cid" xmlns:w16="http://schemas.microsoft.com/office/word/2018/wordml" xmlns:w16sdtdh="http://schemas.microsoft.com/office/word/2020/wordml/sdtdatahash" xmlns:w16se="http://schemas.microsoft.com/office/word/2015/wordml/symex" xmlns:wpg="http://schemas.microsoft.com/office/word/2010/wordprocessingGroup" xmlns:wpi="http://schemas.microsoft.com/office/word/2010/wordprocessingInk" xmlns:wne="http://schemas.microsoft.com/office/word/2006/wordml" xmlns:wps="http://schemas.microsoft.com/office/word/2010/wordprocessingShape" mc:Ignorable="w14 w15 w16se w16cid w16 w16cex w16sdtdh wp14">
   <w:abstractNum w:abstractNumId="0" w15:restartNumberingAfterBreak="0">
     <w:nsid w:val="09152359"/>
     <w:multiLevelType w:val="hybridMultilevel"/>
@@ -8555,6 +9648,119 @@
     </w:lvl>
   </w:abstractNum>
   <w:abstractNum w:abstractNumId="5" w15:restartNumberingAfterBreak="0">
+    <w:nsid w:val="17E02060"/>
+    <w:multiLevelType w:val="hybridMultilevel"/>
+    <w:tmpl w:val="78141FE8"/>
+    <w:lvl w:ilvl="0" w:tplc="240A0001">
+      <w:start w:val="1"/>
+      <w:numFmt w:val="bullet"/>
+      <w:lvlText w:val=""/>
+      <w:lvlJc w:val="left"/>
+      <w:pPr>
+        <w:ind w:left="720" w:hanging="360"/>
+      </w:pPr>
+      <w:rPr>
+        <w:rFonts w:ascii="Symbol" w:hAnsi="Symbol" w:hint="default"/>
+      </w:rPr>
+    </w:lvl>
+    <w:lvl w:ilvl="1" w:tplc="240A0003" w:tentative="1">
+      <w:start w:val="1"/>
+      <w:numFmt w:val="bullet"/>
+      <w:lvlText w:val="o"/>
+      <w:lvlJc w:val="left"/>
+      <w:pPr>
+        <w:ind w:left="1440" w:hanging="360"/>
+      </w:pPr>
+      <w:rPr>
+        <w:rFonts w:ascii="Courier New" w:hAnsi="Courier New" w:cs="Courier New" w:hint="default"/>
+      </w:rPr>
+    </w:lvl>
+    <w:lvl w:ilvl="2" w:tplc="240A0005" w:tentative="1">
+      <w:start w:val="1"/>
+      <w:numFmt w:val="bullet"/>
+      <w:lvlText w:val=""/>
+      <w:lvlJc w:val="left"/>
+      <w:pPr>
+        <w:ind w:left="2160" w:hanging="360"/>
+      </w:pPr>
+      <w:rPr>
+        <w:rFonts w:ascii="Wingdings" w:hAnsi="Wingdings" w:hint="default"/>
+      </w:rPr>
+    </w:lvl>
+    <w:lvl w:ilvl="3" w:tplc="240A0001" w:tentative="1">
+      <w:start w:val="1"/>
+      <w:numFmt w:val="bullet"/>
+      <w:lvlText w:val=""/>
+      <w:lvlJc w:val="left"/>
+      <w:pPr>
+        <w:ind w:left="2880" w:hanging="360"/>
+      </w:pPr>
+      <w:rPr>
+        <w:rFonts w:ascii="Symbol" w:hAnsi="Symbol" w:hint="default"/>
+      </w:rPr>
+    </w:lvl>
+    <w:lvl w:ilvl="4" w:tplc="240A0003" w:tentative="1">
+      <w:start w:val="1"/>
+      <w:numFmt w:val="bullet"/>
+      <w:lvlText w:val="o"/>
+      <w:lvlJc w:val="left"/>
+      <w:pPr>
+        <w:ind w:left="3600" w:hanging="360"/>
+      </w:pPr>
+      <w:rPr>
+        <w:rFonts w:ascii="Courier New" w:hAnsi="Courier New" w:cs="Courier New" w:hint="default"/>
+      </w:rPr>
+    </w:lvl>
+    <w:lvl w:ilvl="5" w:tplc="240A0005" w:tentative="1">
+      <w:start w:val="1"/>
+      <w:numFmt w:val="bullet"/>
+      <w:lvlText w:val=""/>
+      <w:lvlJc w:val="left"/>
+      <w:pPr>
+        <w:ind w:left="4320" w:hanging="360"/>
+      </w:pPr>
+      <w:rPr>
+        <w:rFonts w:ascii="Wingdings" w:hAnsi="Wingdings" w:hint="default"/>
+      </w:rPr>
+    </w:lvl>
+    <w:lvl w:ilvl="6" w:tplc="240A0001" w:tentative="1">
+      <w:start w:val="1"/>
+      <w:numFmt w:val="bullet"/>
+      <w:lvlText w:val=""/>
+      <w:lvlJc w:val="left"/>
+      <w:pPr>
+        <w:ind w:left="5040" w:hanging="360"/>
+      </w:pPr>
+      <w:rPr>
+        <w:rFonts w:ascii="Symbol" w:hAnsi="Symbol" w:hint="default"/>
+      </w:rPr>
+    </w:lvl>
+    <w:lvl w:ilvl="7" w:tplc="240A0003" w:tentative="1">
+      <w:start w:val="1"/>
+      <w:numFmt w:val="bullet"/>
+      <w:lvlText w:val="o"/>
+      <w:lvlJc w:val="left"/>
+      <w:pPr>
+        <w:ind w:left="5760" w:hanging="360"/>
+      </w:pPr>
+      <w:rPr>
+        <w:rFonts w:ascii="Courier New" w:hAnsi="Courier New" w:cs="Courier New" w:hint="default"/>
+      </w:rPr>
+    </w:lvl>
+    <w:lvl w:ilvl="8" w:tplc="240A0005" w:tentative="1">
+      <w:start w:val="1"/>
+      <w:numFmt w:val="bullet"/>
+      <w:lvlText w:val=""/>
+      <w:lvlJc w:val="left"/>
+      <w:pPr>
+        <w:ind w:left="6480" w:hanging="360"/>
+      </w:pPr>
+      <w:rPr>
+        <w:rFonts w:ascii="Wingdings" w:hAnsi="Wingdings" w:hint="default"/>
+      </w:rPr>
+    </w:lvl>
+  </w:abstractNum>
+  <w:abstractNum w:abstractNumId="6" w15:restartNumberingAfterBreak="0">
     <w:nsid w:val="20645EE5"/>
     <w:multiLevelType w:val="hybridMultilevel"/>
     <w:tmpl w:val="73F6465A"/>
@@ -8666,7 +9872,7 @@
       </w:rPr>
     </w:lvl>
   </w:abstractNum>
-  <w:abstractNum w:abstractNumId="6" w15:restartNumberingAfterBreak="0">
+  <w:abstractNum w:abstractNumId="7" w15:restartNumberingAfterBreak="0">
     <w:nsid w:val="30A9053F"/>
     <w:multiLevelType w:val="hybridMultilevel"/>
     <w:tmpl w:val="F21A982E"/>
@@ -8779,7 +9985,7 @@
       </w:rPr>
     </w:lvl>
   </w:abstractNum>
-  <w:abstractNum w:abstractNumId="7" w15:restartNumberingAfterBreak="0">
+  <w:abstractNum w:abstractNumId="8" w15:restartNumberingAfterBreak="0">
     <w:nsid w:val="34E02FE9"/>
     <w:multiLevelType w:val="hybridMultilevel"/>
     <w:tmpl w:val="9042D038"/>
@@ -8892,7 +10098,7 @@
       </w:rPr>
     </w:lvl>
   </w:abstractNum>
-  <w:abstractNum w:abstractNumId="8" w15:restartNumberingAfterBreak="0">
+  <w:abstractNum w:abstractNumId="9" w15:restartNumberingAfterBreak="0">
     <w:nsid w:val="34F278CF"/>
     <w:multiLevelType w:val="hybridMultilevel"/>
     <w:tmpl w:val="EC703D9C"/>
@@ -9005,7 +10211,7 @@
       </w:rPr>
     </w:lvl>
   </w:abstractNum>
-  <w:abstractNum w:abstractNumId="9" w15:restartNumberingAfterBreak="0">
+  <w:abstractNum w:abstractNumId="10" w15:restartNumberingAfterBreak="0">
     <w:nsid w:val="36482B59"/>
     <w:multiLevelType w:val="hybridMultilevel"/>
     <w:tmpl w:val="4B5437EC"/>
@@ -9118,7 +10324,7 @@
       </w:rPr>
     </w:lvl>
   </w:abstractNum>
-  <w:abstractNum w:abstractNumId="10" w15:restartNumberingAfterBreak="0">
+  <w:abstractNum w:abstractNumId="11" w15:restartNumberingAfterBreak="0">
     <w:nsid w:val="36755394"/>
     <w:multiLevelType w:val="hybridMultilevel"/>
     <w:tmpl w:val="726C3B14"/>
@@ -9231,10 +10437,10 @@
       </w:rPr>
     </w:lvl>
   </w:abstractNum>
-  <w:abstractNum w:abstractNumId="11" w15:restartNumberingAfterBreak="0">
+  <w:abstractNum w:abstractNumId="12" w15:restartNumberingAfterBreak="0">
     <w:nsid w:val="39577FDF"/>
     <w:multiLevelType w:val="hybridMultilevel"/>
-    <w:tmpl w:val="D638AD24"/>
+    <w:tmpl w:val="B51A3C42"/>
     <w:lvl w:ilvl="0" w:tplc="240A0001">
       <w:start w:val="1"/>
       <w:numFmt w:val="bullet"/>
@@ -9344,7 +10550,7 @@
       </w:rPr>
     </w:lvl>
   </w:abstractNum>
-  <w:abstractNum w:abstractNumId="12" w15:restartNumberingAfterBreak="0">
+  <w:abstractNum w:abstractNumId="13" w15:restartNumberingAfterBreak="0">
     <w:nsid w:val="42212BEF"/>
     <w:multiLevelType w:val="hybridMultilevel"/>
     <w:tmpl w:val="613A8526"/>
@@ -9457,7 +10663,7 @@
       </w:rPr>
     </w:lvl>
   </w:abstractNum>
-  <w:abstractNum w:abstractNumId="13" w15:restartNumberingAfterBreak="0">
+  <w:abstractNum w:abstractNumId="14" w15:restartNumberingAfterBreak="0">
     <w:nsid w:val="46520865"/>
     <w:multiLevelType w:val="hybridMultilevel"/>
     <w:tmpl w:val="67301346"/>
@@ -9570,7 +10776,7 @@
       </w:rPr>
     </w:lvl>
   </w:abstractNum>
-  <w:abstractNum w:abstractNumId="14" w15:restartNumberingAfterBreak="0">
+  <w:abstractNum w:abstractNumId="15" w15:restartNumberingAfterBreak="0">
     <w:nsid w:val="479035C8"/>
     <w:multiLevelType w:val="hybridMultilevel"/>
     <w:tmpl w:val="09185B3E"/>
@@ -9682,7 +10888,7 @@
       </w:rPr>
     </w:lvl>
   </w:abstractNum>
-  <w:abstractNum w:abstractNumId="15" w15:restartNumberingAfterBreak="0">
+  <w:abstractNum w:abstractNumId="16" w15:restartNumberingAfterBreak="0">
     <w:nsid w:val="4831487B"/>
     <w:multiLevelType w:val="hybridMultilevel"/>
     <w:tmpl w:val="AB2A0212"/>
@@ -9795,7 +11001,7 @@
       </w:rPr>
     </w:lvl>
   </w:abstractNum>
-  <w:abstractNum w:abstractNumId="16" w15:restartNumberingAfterBreak="0">
+  <w:abstractNum w:abstractNumId="17" w15:restartNumberingAfterBreak="0">
     <w:nsid w:val="49034592"/>
     <w:multiLevelType w:val="hybridMultilevel"/>
     <w:tmpl w:val="6BF85FAC"/>
@@ -9908,7 +11114,7 @@
       </w:rPr>
     </w:lvl>
   </w:abstractNum>
-  <w:abstractNum w:abstractNumId="17" w15:restartNumberingAfterBreak="0">
+  <w:abstractNum w:abstractNumId="18" w15:restartNumberingAfterBreak="0">
     <w:nsid w:val="49C41A83"/>
     <w:multiLevelType w:val="hybridMultilevel"/>
     <w:tmpl w:val="911E8E38"/>
@@ -10021,7 +11227,7 @@
       </w:rPr>
     </w:lvl>
   </w:abstractNum>
-  <w:abstractNum w:abstractNumId="18" w15:restartNumberingAfterBreak="0">
+  <w:abstractNum w:abstractNumId="19" w15:restartNumberingAfterBreak="0">
     <w:nsid w:val="4D6C00C1"/>
     <w:multiLevelType w:val="multilevel"/>
     <w:tmpl w:val="224E4C08"/>
@@ -10170,7 +11376,7 @@
       </w:rPr>
     </w:lvl>
   </w:abstractNum>
-  <w:abstractNum w:abstractNumId="19" w15:restartNumberingAfterBreak="0">
+  <w:abstractNum w:abstractNumId="20" w15:restartNumberingAfterBreak="0">
     <w:nsid w:val="507F5E30"/>
     <w:multiLevelType w:val="hybridMultilevel"/>
     <w:tmpl w:val="4EA8DDE2"/>
@@ -10283,7 +11489,7 @@
       </w:rPr>
     </w:lvl>
   </w:abstractNum>
-  <w:abstractNum w:abstractNumId="20" w15:restartNumberingAfterBreak="0">
+  <w:abstractNum w:abstractNumId="21" w15:restartNumberingAfterBreak="0">
     <w:nsid w:val="51237879"/>
     <w:multiLevelType w:val="hybridMultilevel"/>
     <w:tmpl w:val="3B00F736"/>
@@ -10396,7 +11602,7 @@
       </w:rPr>
     </w:lvl>
   </w:abstractNum>
-  <w:abstractNum w:abstractNumId="21" w15:restartNumberingAfterBreak="0">
+  <w:abstractNum w:abstractNumId="22" w15:restartNumberingAfterBreak="0">
     <w:nsid w:val="514A477D"/>
     <w:multiLevelType w:val="multilevel"/>
     <w:tmpl w:val="6F50A922"/>
@@ -10513,7 +11719,120 @@
       </w:pPr>
     </w:lvl>
   </w:abstractNum>
-  <w:abstractNum w:abstractNumId="22" w15:restartNumberingAfterBreak="0">
+  <w:abstractNum w:abstractNumId="23" w15:restartNumberingAfterBreak="0">
+    <w:nsid w:val="5257110A"/>
+    <w:multiLevelType w:val="hybridMultilevel"/>
+    <w:tmpl w:val="A7481D7E"/>
+    <w:lvl w:ilvl="0" w:tplc="240A0001">
+      <w:start w:val="1"/>
+      <w:numFmt w:val="bullet"/>
+      <w:lvlText w:val=""/>
+      <w:lvlJc w:val="left"/>
+      <w:pPr>
+        <w:ind w:left="720" w:hanging="360"/>
+      </w:pPr>
+      <w:rPr>
+        <w:rFonts w:ascii="Symbol" w:hAnsi="Symbol" w:hint="default"/>
+      </w:rPr>
+    </w:lvl>
+    <w:lvl w:ilvl="1" w:tplc="240A0003" w:tentative="1">
+      <w:start w:val="1"/>
+      <w:numFmt w:val="bullet"/>
+      <w:lvlText w:val="o"/>
+      <w:lvlJc w:val="left"/>
+      <w:pPr>
+        <w:ind w:left="1440" w:hanging="360"/>
+      </w:pPr>
+      <w:rPr>
+        <w:rFonts w:ascii="Courier New" w:hAnsi="Courier New" w:cs="Courier New" w:hint="default"/>
+      </w:rPr>
+    </w:lvl>
+    <w:lvl w:ilvl="2" w:tplc="240A0005" w:tentative="1">
+      <w:start w:val="1"/>
+      <w:numFmt w:val="bullet"/>
+      <w:lvlText w:val=""/>
+      <w:lvlJc w:val="left"/>
+      <w:pPr>
+        <w:ind w:left="2160" w:hanging="360"/>
+      </w:pPr>
+      <w:rPr>
+        <w:rFonts w:ascii="Wingdings" w:hAnsi="Wingdings" w:hint="default"/>
+      </w:rPr>
+    </w:lvl>
+    <w:lvl w:ilvl="3" w:tplc="240A0001" w:tentative="1">
+      <w:start w:val="1"/>
+      <w:numFmt w:val="bullet"/>
+      <w:lvlText w:val=""/>
+      <w:lvlJc w:val="left"/>
+      <w:pPr>
+        <w:ind w:left="2880" w:hanging="360"/>
+      </w:pPr>
+      <w:rPr>
+        <w:rFonts w:ascii="Symbol" w:hAnsi="Symbol" w:hint="default"/>
+      </w:rPr>
+    </w:lvl>
+    <w:lvl w:ilvl="4" w:tplc="240A0003" w:tentative="1">
+      <w:start w:val="1"/>
+      <w:numFmt w:val="bullet"/>
+      <w:lvlText w:val="o"/>
+      <w:lvlJc w:val="left"/>
+      <w:pPr>
+        <w:ind w:left="3600" w:hanging="360"/>
+      </w:pPr>
+      <w:rPr>
+        <w:rFonts w:ascii="Courier New" w:hAnsi="Courier New" w:cs="Courier New" w:hint="default"/>
+      </w:rPr>
+    </w:lvl>
+    <w:lvl w:ilvl="5" w:tplc="240A0005" w:tentative="1">
+      <w:start w:val="1"/>
+      <w:numFmt w:val="bullet"/>
+      <w:lvlText w:val=""/>
+      <w:lvlJc w:val="left"/>
+      <w:pPr>
+        <w:ind w:left="4320" w:hanging="360"/>
+      </w:pPr>
+      <w:rPr>
+        <w:rFonts w:ascii="Wingdings" w:hAnsi="Wingdings" w:hint="default"/>
+      </w:rPr>
+    </w:lvl>
+    <w:lvl w:ilvl="6" w:tplc="240A0001" w:tentative="1">
+      <w:start w:val="1"/>
+      <w:numFmt w:val="bullet"/>
+      <w:lvlText w:val=""/>
+      <w:lvlJc w:val="left"/>
+      <w:pPr>
+        <w:ind w:left="5040" w:hanging="360"/>
+      </w:pPr>
+      <w:rPr>
+        <w:rFonts w:ascii="Symbol" w:hAnsi="Symbol" w:hint="default"/>
+      </w:rPr>
+    </w:lvl>
+    <w:lvl w:ilvl="7" w:tplc="240A0003" w:tentative="1">
+      <w:start w:val="1"/>
+      <w:numFmt w:val="bullet"/>
+      <w:lvlText w:val="o"/>
+      <w:lvlJc w:val="left"/>
+      <w:pPr>
+        <w:ind w:left="5760" w:hanging="360"/>
+      </w:pPr>
+      <w:rPr>
+        <w:rFonts w:ascii="Courier New" w:hAnsi="Courier New" w:cs="Courier New" w:hint="default"/>
+      </w:rPr>
+    </w:lvl>
+    <w:lvl w:ilvl="8" w:tplc="240A0005" w:tentative="1">
+      <w:start w:val="1"/>
+      <w:numFmt w:val="bullet"/>
+      <w:lvlText w:val=""/>
+      <w:lvlJc w:val="left"/>
+      <w:pPr>
+        <w:ind w:left="6480" w:hanging="360"/>
+      </w:pPr>
+      <w:rPr>
+        <w:rFonts w:ascii="Wingdings" w:hAnsi="Wingdings" w:hint="default"/>
+      </w:rPr>
+    </w:lvl>
+  </w:abstractNum>
+  <w:abstractNum w:abstractNumId="24" w15:restartNumberingAfterBreak="0">
     <w:nsid w:val="54B315DE"/>
     <w:multiLevelType w:val="hybridMultilevel"/>
     <w:tmpl w:val="490A5BE2"/>
@@ -10626,7 +11945,7 @@
       </w:rPr>
     </w:lvl>
   </w:abstractNum>
-  <w:abstractNum w:abstractNumId="23" w15:restartNumberingAfterBreak="0">
+  <w:abstractNum w:abstractNumId="25" w15:restartNumberingAfterBreak="0">
     <w:nsid w:val="5B3668F3"/>
     <w:multiLevelType w:val="multilevel"/>
     <w:tmpl w:val="1EEA5C90"/>
@@ -10775,7 +12094,7 @@
       </w:rPr>
     </w:lvl>
   </w:abstractNum>
-  <w:abstractNum w:abstractNumId="24" w15:restartNumberingAfterBreak="0">
+  <w:abstractNum w:abstractNumId="26" w15:restartNumberingAfterBreak="0">
     <w:nsid w:val="5E13566F"/>
     <w:multiLevelType w:val="hybridMultilevel"/>
     <w:tmpl w:val="390620CC"/>
@@ -10887,7 +12206,7 @@
       </w:rPr>
     </w:lvl>
   </w:abstractNum>
-  <w:abstractNum w:abstractNumId="25" w15:restartNumberingAfterBreak="0">
+  <w:abstractNum w:abstractNumId="27" w15:restartNumberingAfterBreak="0">
     <w:nsid w:val="5E790CCD"/>
     <w:multiLevelType w:val="hybridMultilevel"/>
     <w:tmpl w:val="AAC02FD8"/>
@@ -11000,7 +12319,7 @@
       </w:rPr>
     </w:lvl>
   </w:abstractNum>
-  <w:abstractNum w:abstractNumId="26" w15:restartNumberingAfterBreak="0">
+  <w:abstractNum w:abstractNumId="28" w15:restartNumberingAfterBreak="0">
     <w:nsid w:val="5E953526"/>
     <w:multiLevelType w:val="hybridMultilevel"/>
     <w:tmpl w:val="0994C07E"/>
@@ -11112,7 +12431,7 @@
       </w:rPr>
     </w:lvl>
   </w:abstractNum>
-  <w:abstractNum w:abstractNumId="27" w15:restartNumberingAfterBreak="0">
+  <w:abstractNum w:abstractNumId="29" w15:restartNumberingAfterBreak="0">
     <w:nsid w:val="5EDB2FC0"/>
     <w:multiLevelType w:val="hybridMultilevel"/>
     <w:tmpl w:val="44527ED6"/>
@@ -11225,7 +12544,156 @@
       </w:rPr>
     </w:lvl>
   </w:abstractNum>
-  <w:abstractNum w:abstractNumId="28" w15:restartNumberingAfterBreak="0">
+  <w:abstractNum w:abstractNumId="30" w15:restartNumberingAfterBreak="0">
+    <w:nsid w:val="60783071"/>
+    <w:multiLevelType w:val="multilevel"/>
+    <w:tmpl w:val="1C706E60"/>
+    <w:lvl w:ilvl="0">
+      <w:start w:val="1"/>
+      <w:numFmt w:val="bullet"/>
+      <w:lvlText w:val=""/>
+      <w:lvlJc w:val="left"/>
+      <w:pPr>
+        <w:tabs>
+          <w:tab w:val="num" w:pos="720"/>
+        </w:tabs>
+        <w:ind w:left="720" w:hanging="360"/>
+      </w:pPr>
+      <w:rPr>
+        <w:rFonts w:ascii="Symbol" w:hAnsi="Symbol" w:hint="default"/>
+        <w:sz w:val="20"/>
+      </w:rPr>
+    </w:lvl>
+    <w:lvl w:ilvl="1" w:tentative="1">
+      <w:start w:val="1"/>
+      <w:numFmt w:val="bullet"/>
+      <w:lvlText w:val="o"/>
+      <w:lvlJc w:val="left"/>
+      <w:pPr>
+        <w:tabs>
+          <w:tab w:val="num" w:pos="1440"/>
+        </w:tabs>
+        <w:ind w:left="1440" w:hanging="360"/>
+      </w:pPr>
+      <w:rPr>
+        <w:rFonts w:ascii="Courier New" w:hAnsi="Courier New" w:hint="default"/>
+        <w:sz w:val="20"/>
+      </w:rPr>
+    </w:lvl>
+    <w:lvl w:ilvl="2" w:tentative="1">
+      <w:start w:val="1"/>
+      <w:numFmt w:val="bullet"/>
+      <w:lvlText w:val=""/>
+      <w:lvlJc w:val="left"/>
+      <w:pPr>
+        <w:tabs>
+          <w:tab w:val="num" w:pos="2160"/>
+        </w:tabs>
+        <w:ind w:left="2160" w:hanging="360"/>
+      </w:pPr>
+      <w:rPr>
+        <w:rFonts w:ascii="Wingdings" w:hAnsi="Wingdings" w:hint="default"/>
+        <w:sz w:val="20"/>
+      </w:rPr>
+    </w:lvl>
+    <w:lvl w:ilvl="3" w:tentative="1">
+      <w:start w:val="1"/>
+      <w:numFmt w:val="bullet"/>
+      <w:lvlText w:val=""/>
+      <w:lvlJc w:val="left"/>
+      <w:pPr>
+        <w:tabs>
+          <w:tab w:val="num" w:pos="2880"/>
+        </w:tabs>
+        <w:ind w:left="2880" w:hanging="360"/>
+      </w:pPr>
+      <w:rPr>
+        <w:rFonts w:ascii="Wingdings" w:hAnsi="Wingdings" w:hint="default"/>
+        <w:sz w:val="20"/>
+      </w:rPr>
+    </w:lvl>
+    <w:lvl w:ilvl="4" w:tentative="1">
+      <w:start w:val="1"/>
+      <w:numFmt w:val="bullet"/>
+      <w:lvlText w:val=""/>
+      <w:lvlJc w:val="left"/>
+      <w:pPr>
+        <w:tabs>
+          <w:tab w:val="num" w:pos="3600"/>
+        </w:tabs>
+        <w:ind w:left="3600" w:hanging="360"/>
+      </w:pPr>
+      <w:rPr>
+        <w:rFonts w:ascii="Wingdings" w:hAnsi="Wingdings" w:hint="default"/>
+        <w:sz w:val="20"/>
+      </w:rPr>
+    </w:lvl>
+    <w:lvl w:ilvl="5" w:tentative="1">
+      <w:start w:val="1"/>
+      <w:numFmt w:val="bullet"/>
+      <w:lvlText w:val=""/>
+      <w:lvlJc w:val="left"/>
+      <w:pPr>
+        <w:tabs>
+          <w:tab w:val="num" w:pos="4320"/>
+        </w:tabs>
+        <w:ind w:left="4320" w:hanging="360"/>
+      </w:pPr>
+      <w:rPr>
+        <w:rFonts w:ascii="Wingdings" w:hAnsi="Wingdings" w:hint="default"/>
+        <w:sz w:val="20"/>
+      </w:rPr>
+    </w:lvl>
+    <w:lvl w:ilvl="6" w:tentative="1">
+      <w:start w:val="1"/>
+      <w:numFmt w:val="bullet"/>
+      <w:lvlText w:val=""/>
+      <w:lvlJc w:val="left"/>
+      <w:pPr>
+        <w:tabs>
+          <w:tab w:val="num" w:pos="5040"/>
+        </w:tabs>
+        <w:ind w:left="5040" w:hanging="360"/>
+      </w:pPr>
+      <w:rPr>
+        <w:rFonts w:ascii="Wingdings" w:hAnsi="Wingdings" w:hint="default"/>
+        <w:sz w:val="20"/>
+      </w:rPr>
+    </w:lvl>
+    <w:lvl w:ilvl="7" w:tentative="1">
+      <w:start w:val="1"/>
+      <w:numFmt w:val="bullet"/>
+      <w:lvlText w:val=""/>
+      <w:lvlJc w:val="left"/>
+      <w:pPr>
+        <w:tabs>
+          <w:tab w:val="num" w:pos="5760"/>
+        </w:tabs>
+        <w:ind w:left="5760" w:hanging="360"/>
+      </w:pPr>
+      <w:rPr>
+        <w:rFonts w:ascii="Wingdings" w:hAnsi="Wingdings" w:hint="default"/>
+        <w:sz w:val="20"/>
+      </w:rPr>
+    </w:lvl>
+    <w:lvl w:ilvl="8" w:tentative="1">
+      <w:start w:val="1"/>
+      <w:numFmt w:val="bullet"/>
+      <w:lvlText w:val=""/>
+      <w:lvlJc w:val="left"/>
+      <w:pPr>
+        <w:tabs>
+          <w:tab w:val="num" w:pos="6480"/>
+        </w:tabs>
+        <w:ind w:left="6480" w:hanging="360"/>
+      </w:pPr>
+      <w:rPr>
+        <w:rFonts w:ascii="Wingdings" w:hAnsi="Wingdings" w:hint="default"/>
+        <w:sz w:val="20"/>
+      </w:rPr>
+    </w:lvl>
+  </w:abstractNum>
+  <w:abstractNum w:abstractNumId="31" w15:restartNumberingAfterBreak="0">
     <w:nsid w:val="655C4B5E"/>
     <w:multiLevelType w:val="hybridMultilevel"/>
     <w:tmpl w:val="4C109874"/>
@@ -11338,7 +12806,7 @@
       </w:rPr>
     </w:lvl>
   </w:abstractNum>
-  <w:abstractNum w:abstractNumId="29" w15:restartNumberingAfterBreak="0">
+  <w:abstractNum w:abstractNumId="32" w15:restartNumberingAfterBreak="0">
     <w:nsid w:val="660475A0"/>
     <w:multiLevelType w:val="hybridMultilevel"/>
     <w:tmpl w:val="84D8E084"/>
@@ -11451,7 +12919,7 @@
       </w:rPr>
     </w:lvl>
   </w:abstractNum>
-  <w:abstractNum w:abstractNumId="30" w15:restartNumberingAfterBreak="0">
+  <w:abstractNum w:abstractNumId="33" w15:restartNumberingAfterBreak="0">
     <w:nsid w:val="66995AC7"/>
     <w:multiLevelType w:val="hybridMultilevel"/>
     <w:tmpl w:val="9AE60CFE"/>
@@ -11564,7 +13032,358 @@
       </w:rPr>
     </w:lvl>
   </w:abstractNum>
-  <w:abstractNum w:abstractNumId="31" w15:restartNumberingAfterBreak="0">
+  <w:abstractNum w:abstractNumId="34" w15:restartNumberingAfterBreak="0">
+    <w:nsid w:val="67C41815"/>
+    <w:multiLevelType w:val="multilevel"/>
+    <w:tmpl w:val="2EDC36BE"/>
+    <w:lvl w:ilvl="0">
+      <w:start w:val="1"/>
+      <w:numFmt w:val="bullet"/>
+      <w:lvlText w:val=""/>
+      <w:lvlJc w:val="left"/>
+      <w:pPr>
+        <w:tabs>
+          <w:tab w:val="num" w:pos="720"/>
+        </w:tabs>
+        <w:ind w:left="720" w:hanging="360"/>
+      </w:pPr>
+      <w:rPr>
+        <w:rFonts w:ascii="Symbol" w:hAnsi="Symbol" w:hint="default"/>
+        <w:sz w:val="20"/>
+      </w:rPr>
+    </w:lvl>
+    <w:lvl w:ilvl="1" w:tentative="1">
+      <w:start w:val="1"/>
+      <w:numFmt w:val="bullet"/>
+      <w:lvlText w:val="o"/>
+      <w:lvlJc w:val="left"/>
+      <w:pPr>
+        <w:tabs>
+          <w:tab w:val="num" w:pos="1440"/>
+        </w:tabs>
+        <w:ind w:left="1440" w:hanging="360"/>
+      </w:pPr>
+      <w:rPr>
+        <w:rFonts w:ascii="Courier New" w:hAnsi="Courier New" w:hint="default"/>
+        <w:sz w:val="20"/>
+      </w:rPr>
+    </w:lvl>
+    <w:lvl w:ilvl="2" w:tentative="1">
+      <w:start w:val="1"/>
+      <w:numFmt w:val="bullet"/>
+      <w:lvlText w:val=""/>
+      <w:lvlJc w:val="left"/>
+      <w:pPr>
+        <w:tabs>
+          <w:tab w:val="num" w:pos="2160"/>
+        </w:tabs>
+        <w:ind w:left="2160" w:hanging="360"/>
+      </w:pPr>
+      <w:rPr>
+        <w:rFonts w:ascii="Wingdings" w:hAnsi="Wingdings" w:hint="default"/>
+        <w:sz w:val="20"/>
+      </w:rPr>
+    </w:lvl>
+    <w:lvl w:ilvl="3" w:tentative="1">
+      <w:start w:val="1"/>
+      <w:numFmt w:val="bullet"/>
+      <w:lvlText w:val=""/>
+      <w:lvlJc w:val="left"/>
+      <w:pPr>
+        <w:tabs>
+          <w:tab w:val="num" w:pos="2880"/>
+        </w:tabs>
+        <w:ind w:left="2880" w:hanging="360"/>
+      </w:pPr>
+      <w:rPr>
+        <w:rFonts w:ascii="Wingdings" w:hAnsi="Wingdings" w:hint="default"/>
+        <w:sz w:val="20"/>
+      </w:rPr>
+    </w:lvl>
+    <w:lvl w:ilvl="4" w:tentative="1">
+      <w:start w:val="1"/>
+      <w:numFmt w:val="bullet"/>
+      <w:lvlText w:val=""/>
+      <w:lvlJc w:val="left"/>
+      <w:pPr>
+        <w:tabs>
+          <w:tab w:val="num" w:pos="3600"/>
+        </w:tabs>
+        <w:ind w:left="3600" w:hanging="360"/>
+      </w:pPr>
+      <w:rPr>
+        <w:rFonts w:ascii="Wingdings" w:hAnsi="Wingdings" w:hint="default"/>
+        <w:sz w:val="20"/>
+      </w:rPr>
+    </w:lvl>
+    <w:lvl w:ilvl="5" w:tentative="1">
+      <w:start w:val="1"/>
+      <w:numFmt w:val="bullet"/>
+      <w:lvlText w:val=""/>
+      <w:lvlJc w:val="left"/>
+      <w:pPr>
+        <w:tabs>
+          <w:tab w:val="num" w:pos="4320"/>
+        </w:tabs>
+        <w:ind w:left="4320" w:hanging="360"/>
+      </w:pPr>
+      <w:rPr>
+        <w:rFonts w:ascii="Wingdings" w:hAnsi="Wingdings" w:hint="default"/>
+        <w:sz w:val="20"/>
+      </w:rPr>
+    </w:lvl>
+    <w:lvl w:ilvl="6" w:tentative="1">
+      <w:start w:val="1"/>
+      <w:numFmt w:val="bullet"/>
+      <w:lvlText w:val=""/>
+      <w:lvlJc w:val="left"/>
+      <w:pPr>
+        <w:tabs>
+          <w:tab w:val="num" w:pos="5040"/>
+        </w:tabs>
+        <w:ind w:left="5040" w:hanging="360"/>
+      </w:pPr>
+      <w:rPr>
+        <w:rFonts w:ascii="Wingdings" w:hAnsi="Wingdings" w:hint="default"/>
+        <w:sz w:val="20"/>
+      </w:rPr>
+    </w:lvl>
+    <w:lvl w:ilvl="7" w:tentative="1">
+      <w:start w:val="1"/>
+      <w:numFmt w:val="bullet"/>
+      <w:lvlText w:val=""/>
+      <w:lvlJc w:val="left"/>
+      <w:pPr>
+        <w:tabs>
+          <w:tab w:val="num" w:pos="5760"/>
+        </w:tabs>
+        <w:ind w:left="5760" w:hanging="360"/>
+      </w:pPr>
+      <w:rPr>
+        <w:rFonts w:ascii="Wingdings" w:hAnsi="Wingdings" w:hint="default"/>
+        <w:sz w:val="20"/>
+      </w:rPr>
+    </w:lvl>
+    <w:lvl w:ilvl="8" w:tentative="1">
+      <w:start w:val="1"/>
+      <w:numFmt w:val="bullet"/>
+      <w:lvlText w:val=""/>
+      <w:lvlJc w:val="left"/>
+      <w:pPr>
+        <w:tabs>
+          <w:tab w:val="num" w:pos="6480"/>
+        </w:tabs>
+        <w:ind w:left="6480" w:hanging="360"/>
+      </w:pPr>
+      <w:rPr>
+        <w:rFonts w:ascii="Wingdings" w:hAnsi="Wingdings" w:hint="default"/>
+        <w:sz w:val="20"/>
+      </w:rPr>
+    </w:lvl>
+  </w:abstractNum>
+  <w:abstractNum w:abstractNumId="35" w15:restartNumberingAfterBreak="0">
+    <w:nsid w:val="68485C7D"/>
+    <w:multiLevelType w:val="hybridMultilevel"/>
+    <w:tmpl w:val="FC12EF32"/>
+    <w:lvl w:ilvl="0" w:tplc="240A000F">
+      <w:start w:val="1"/>
+      <w:numFmt w:val="decimal"/>
+      <w:lvlText w:val="%1."/>
+      <w:lvlJc w:val="left"/>
+      <w:pPr>
+        <w:ind w:left="720" w:hanging="360"/>
+      </w:pPr>
+      <w:rPr>
+        <w:rFonts w:hint="default"/>
+      </w:rPr>
+    </w:lvl>
+    <w:lvl w:ilvl="1" w:tplc="240A0019" w:tentative="1">
+      <w:start w:val="1"/>
+      <w:numFmt w:val="lowerLetter"/>
+      <w:lvlText w:val="%2."/>
+      <w:lvlJc w:val="left"/>
+      <w:pPr>
+        <w:ind w:left="1440" w:hanging="360"/>
+      </w:pPr>
+    </w:lvl>
+    <w:lvl w:ilvl="2" w:tplc="240A001B" w:tentative="1">
+      <w:start w:val="1"/>
+      <w:numFmt w:val="lowerRoman"/>
+      <w:lvlText w:val="%3."/>
+      <w:lvlJc w:val="right"/>
+      <w:pPr>
+        <w:ind w:left="2160" w:hanging="180"/>
+      </w:pPr>
+    </w:lvl>
+    <w:lvl w:ilvl="3" w:tplc="240A000F" w:tentative="1">
+      <w:start w:val="1"/>
+      <w:numFmt w:val="decimal"/>
+      <w:lvlText w:val="%4."/>
+      <w:lvlJc w:val="left"/>
+      <w:pPr>
+        <w:ind w:left="2880" w:hanging="360"/>
+      </w:pPr>
+    </w:lvl>
+    <w:lvl w:ilvl="4" w:tplc="240A0019" w:tentative="1">
+      <w:start w:val="1"/>
+      <w:numFmt w:val="lowerLetter"/>
+      <w:lvlText w:val="%5."/>
+      <w:lvlJc w:val="left"/>
+      <w:pPr>
+        <w:ind w:left="3600" w:hanging="360"/>
+      </w:pPr>
+    </w:lvl>
+    <w:lvl w:ilvl="5" w:tplc="240A001B" w:tentative="1">
+      <w:start w:val="1"/>
+      <w:numFmt w:val="lowerRoman"/>
+      <w:lvlText w:val="%6."/>
+      <w:lvlJc w:val="right"/>
+      <w:pPr>
+        <w:ind w:left="4320" w:hanging="180"/>
+      </w:pPr>
+    </w:lvl>
+    <w:lvl w:ilvl="6" w:tplc="240A000F" w:tentative="1">
+      <w:start w:val="1"/>
+      <w:numFmt w:val="decimal"/>
+      <w:lvlText w:val="%7."/>
+      <w:lvlJc w:val="left"/>
+      <w:pPr>
+        <w:ind w:left="5040" w:hanging="360"/>
+      </w:pPr>
+    </w:lvl>
+    <w:lvl w:ilvl="7" w:tplc="240A0019" w:tentative="1">
+      <w:start w:val="1"/>
+      <w:numFmt w:val="lowerLetter"/>
+      <w:lvlText w:val="%8."/>
+      <w:lvlJc w:val="left"/>
+      <w:pPr>
+        <w:ind w:left="5760" w:hanging="360"/>
+      </w:pPr>
+    </w:lvl>
+    <w:lvl w:ilvl="8" w:tplc="240A001B" w:tentative="1">
+      <w:start w:val="1"/>
+      <w:numFmt w:val="lowerRoman"/>
+      <w:lvlText w:val="%9."/>
+      <w:lvlJc w:val="right"/>
+      <w:pPr>
+        <w:ind w:left="6480" w:hanging="180"/>
+      </w:pPr>
+    </w:lvl>
+  </w:abstractNum>
+  <w:abstractNum w:abstractNumId="36" w15:restartNumberingAfterBreak="0">
+    <w:nsid w:val="6B5C679A"/>
+    <w:multiLevelType w:val="hybridMultilevel"/>
+    <w:tmpl w:val="8398F1AE"/>
+    <w:lvl w:ilvl="0" w:tplc="240A0001">
+      <w:start w:val="1"/>
+      <w:numFmt w:val="bullet"/>
+      <w:lvlText w:val=""/>
+      <w:lvlJc w:val="left"/>
+      <w:pPr>
+        <w:ind w:left="720" w:hanging="360"/>
+      </w:pPr>
+      <w:rPr>
+        <w:rFonts w:ascii="Symbol" w:hAnsi="Symbol" w:hint="default"/>
+      </w:rPr>
+    </w:lvl>
+    <w:lvl w:ilvl="1" w:tplc="240A0003" w:tentative="1">
+      <w:start w:val="1"/>
+      <w:numFmt w:val="bullet"/>
+      <w:lvlText w:val="o"/>
+      <w:lvlJc w:val="left"/>
+      <w:pPr>
+        <w:ind w:left="1440" w:hanging="360"/>
+      </w:pPr>
+      <w:rPr>
+        <w:rFonts w:ascii="Courier New" w:hAnsi="Courier New" w:cs="Courier New" w:hint="default"/>
+      </w:rPr>
+    </w:lvl>
+    <w:lvl w:ilvl="2" w:tplc="240A0005" w:tentative="1">
+      <w:start w:val="1"/>
+      <w:numFmt w:val="bullet"/>
+      <w:lvlText w:val=""/>
+      <w:lvlJc w:val="left"/>
+      <w:pPr>
+        <w:ind w:left="2160" w:hanging="360"/>
+      </w:pPr>
+      <w:rPr>
+        <w:rFonts w:ascii="Wingdings" w:hAnsi="Wingdings" w:hint="default"/>
+      </w:rPr>
+    </w:lvl>
+    <w:lvl w:ilvl="3" w:tplc="240A0001" w:tentative="1">
+      <w:start w:val="1"/>
+      <w:numFmt w:val="bullet"/>
+      <w:lvlText w:val=""/>
+      <w:lvlJc w:val="left"/>
+      <w:pPr>
+        <w:ind w:left="2880" w:hanging="360"/>
+      </w:pPr>
+      <w:rPr>
+        <w:rFonts w:ascii="Symbol" w:hAnsi="Symbol" w:hint="default"/>
+      </w:rPr>
+    </w:lvl>
+    <w:lvl w:ilvl="4" w:tplc="240A0003" w:tentative="1">
+      <w:start w:val="1"/>
+      <w:numFmt w:val="bullet"/>
+      <w:lvlText w:val="o"/>
+      <w:lvlJc w:val="left"/>
+      <w:pPr>
+        <w:ind w:left="3600" w:hanging="360"/>
+      </w:pPr>
+      <w:rPr>
+        <w:rFonts w:ascii="Courier New" w:hAnsi="Courier New" w:cs="Courier New" w:hint="default"/>
+      </w:rPr>
+    </w:lvl>
+    <w:lvl w:ilvl="5" w:tplc="240A0005" w:tentative="1">
+      <w:start w:val="1"/>
+      <w:numFmt w:val="bullet"/>
+      <w:lvlText w:val=""/>
+      <w:lvlJc w:val="left"/>
+      <w:pPr>
+        <w:ind w:left="4320" w:hanging="360"/>
+      </w:pPr>
+      <w:rPr>
+        <w:rFonts w:ascii="Wingdings" w:hAnsi="Wingdings" w:hint="default"/>
+      </w:rPr>
+    </w:lvl>
+    <w:lvl w:ilvl="6" w:tplc="240A0001" w:tentative="1">
+      <w:start w:val="1"/>
+      <w:numFmt w:val="bullet"/>
+      <w:lvlText w:val=""/>
+      <w:lvlJc w:val="left"/>
+      <w:pPr>
+        <w:ind w:left="5040" w:hanging="360"/>
+      </w:pPr>
+      <w:rPr>
+        <w:rFonts w:ascii="Symbol" w:hAnsi="Symbol" w:hint="default"/>
+      </w:rPr>
+    </w:lvl>
+    <w:lvl w:ilvl="7" w:tplc="240A0003" w:tentative="1">
+      <w:start w:val="1"/>
+      <w:numFmt w:val="bullet"/>
+      <w:lvlText w:val="o"/>
+      <w:lvlJc w:val="left"/>
+      <w:pPr>
+        <w:ind w:left="5760" w:hanging="360"/>
+      </w:pPr>
+      <w:rPr>
+        <w:rFonts w:ascii="Courier New" w:hAnsi="Courier New" w:cs="Courier New" w:hint="default"/>
+      </w:rPr>
+    </w:lvl>
+    <w:lvl w:ilvl="8" w:tplc="240A0005" w:tentative="1">
+      <w:start w:val="1"/>
+      <w:numFmt w:val="bullet"/>
+      <w:lvlText w:val=""/>
+      <w:lvlJc w:val="left"/>
+      <w:pPr>
+        <w:ind w:left="6480" w:hanging="360"/>
+      </w:pPr>
+      <w:rPr>
+        <w:rFonts w:ascii="Wingdings" w:hAnsi="Wingdings" w:hint="default"/>
+      </w:rPr>
+    </w:lvl>
+  </w:abstractNum>
+  <w:abstractNum w:abstractNumId="37" w15:restartNumberingAfterBreak="0">
     <w:nsid w:val="6C9020D6"/>
     <w:multiLevelType w:val="hybridMultilevel"/>
     <w:tmpl w:val="BCB62236"/>
@@ -11676,7 +13495,7 @@
       </w:rPr>
     </w:lvl>
   </w:abstractNum>
-  <w:abstractNum w:abstractNumId="32" w15:restartNumberingAfterBreak="0">
+  <w:abstractNum w:abstractNumId="38" w15:restartNumberingAfterBreak="0">
     <w:nsid w:val="72310116"/>
     <w:multiLevelType w:val="hybridMultilevel"/>
     <w:tmpl w:val="A664D4B8"/>
@@ -11790,109 +13609,127 @@
     </w:lvl>
   </w:abstractNum>
   <w:num w:numId="1">
+    <w:abstractNumId w:val="21"/>
+  </w:num>
+  <w:num w:numId="2">
+    <w:abstractNumId w:val="13"/>
+  </w:num>
+  <w:num w:numId="3">
     <w:abstractNumId w:val="20"/>
   </w:num>
-  <w:num w:numId="2">
+  <w:num w:numId="4">
+    <w:abstractNumId w:val="9"/>
+  </w:num>
+  <w:num w:numId="5">
+    <w:abstractNumId w:val="11"/>
+  </w:num>
+  <w:num w:numId="6">
+    <w:abstractNumId w:val="18"/>
+  </w:num>
+  <w:num w:numId="7">
+    <w:abstractNumId w:val="24"/>
+  </w:num>
+  <w:num w:numId="8">
+    <w:abstractNumId w:val="16"/>
+  </w:num>
+  <w:num w:numId="9">
+    <w:abstractNumId w:val="10"/>
+  </w:num>
+  <w:num w:numId="10">
+    <w:abstractNumId w:val="33"/>
+  </w:num>
+  <w:num w:numId="11">
+    <w:abstractNumId w:val="38"/>
+  </w:num>
+  <w:num w:numId="12">
+    <w:abstractNumId w:val="17"/>
+  </w:num>
+  <w:num w:numId="13">
+    <w:abstractNumId w:val="14"/>
+  </w:num>
+  <w:num w:numId="14">
+    <w:abstractNumId w:val="8"/>
+  </w:num>
+  <w:num w:numId="15">
+    <w:abstractNumId w:val="29"/>
+  </w:num>
+  <w:num w:numId="16">
     <w:abstractNumId w:val="12"/>
   </w:num>
-  <w:num w:numId="3">
-    <w:abstractNumId w:val="19"/>
-  </w:num>
-  <w:num w:numId="4">
-    <w:abstractNumId w:val="8"/>
-  </w:num>
-  <w:num w:numId="5">
-    <w:abstractNumId w:val="10"/>
-  </w:num>
-  <w:num w:numId="6">
-    <w:abstractNumId w:val="17"/>
-  </w:num>
-  <w:num w:numId="7">
-    <w:abstractNumId w:val="22"/>
-  </w:num>
-  <w:num w:numId="8">
+  <w:num w:numId="17">
     <w:abstractNumId w:val="15"/>
-  </w:num>
-  <w:num w:numId="9">
-    <w:abstractNumId w:val="9"/>
-  </w:num>
-  <w:num w:numId="10">
-    <w:abstractNumId w:val="30"/>
-  </w:num>
-  <w:num w:numId="11">
-    <w:abstractNumId w:val="32"/>
-  </w:num>
-  <w:num w:numId="12">
-    <w:abstractNumId w:val="16"/>
-  </w:num>
-  <w:num w:numId="13">
-    <w:abstractNumId w:val="13"/>
-  </w:num>
-  <w:num w:numId="14">
-    <w:abstractNumId w:val="7"/>
-  </w:num>
-  <w:num w:numId="15">
-    <w:abstractNumId w:val="27"/>
-  </w:num>
-  <w:num w:numId="16">
-    <w:abstractNumId w:val="11"/>
-  </w:num>
-  <w:num w:numId="17">
-    <w:abstractNumId w:val="14"/>
   </w:num>
   <w:num w:numId="18">
     <w:abstractNumId w:val="1"/>
   </w:num>
   <w:num w:numId="19">
-    <w:abstractNumId w:val="29"/>
+    <w:abstractNumId w:val="32"/>
   </w:num>
   <w:num w:numId="20">
-    <w:abstractNumId w:val="28"/>
+    <w:abstractNumId w:val="31"/>
   </w:num>
   <w:num w:numId="21">
-    <w:abstractNumId w:val="6"/>
+    <w:abstractNumId w:val="7"/>
   </w:num>
   <w:num w:numId="22">
     <w:abstractNumId w:val="3"/>
   </w:num>
   <w:num w:numId="23">
-    <w:abstractNumId w:val="26"/>
+    <w:abstractNumId w:val="28"/>
   </w:num>
   <w:num w:numId="24">
-    <w:abstractNumId w:val="25"/>
+    <w:abstractNumId w:val="27"/>
   </w:num>
   <w:num w:numId="25">
     <w:abstractNumId w:val="2"/>
   </w:num>
   <w:num w:numId="26">
-    <w:abstractNumId w:val="5"/>
+    <w:abstractNumId w:val="6"/>
   </w:num>
   <w:num w:numId="27">
     <w:abstractNumId w:val="0"/>
   </w:num>
   <w:num w:numId="28">
-    <w:abstractNumId w:val="31"/>
+    <w:abstractNumId w:val="37"/>
   </w:num>
   <w:num w:numId="29">
-    <w:abstractNumId w:val="18"/>
+    <w:abstractNumId w:val="19"/>
   </w:num>
   <w:num w:numId="30">
-    <w:abstractNumId w:val="21"/>
+    <w:abstractNumId w:val="22"/>
   </w:num>
   <w:num w:numId="31">
-    <w:abstractNumId w:val="23"/>
+    <w:abstractNumId w:val="25"/>
   </w:num>
   <w:num w:numId="32">
     <w:abstractNumId w:val="4"/>
   </w:num>
   <w:num w:numId="33">
-    <w:abstractNumId w:val="24"/>
+    <w:abstractNumId w:val="26"/>
+  </w:num>
+  <w:num w:numId="34">
+    <w:abstractNumId w:val="35"/>
+  </w:num>
+  <w:num w:numId="35">
+    <w:abstractNumId w:val="30"/>
+  </w:num>
+  <w:num w:numId="36">
+    <w:abstractNumId w:val="34"/>
+  </w:num>
+  <w:num w:numId="37">
+    <w:abstractNumId w:val="23"/>
+  </w:num>
+  <w:num w:numId="38">
+    <w:abstractNumId w:val="36"/>
+  </w:num>
+  <w:num w:numId="39">
+    <w:abstractNumId w:val="5"/>
   </w:num>
 </w:numbering>
 </file>
 
 <file path=word/styles.xml><?xml version="1.0" encoding="utf-8"?>
-<w:styles xmlns:mc="http://schemas.openxmlformats.org/markup-compatibility/2006" xmlns:r="http://schemas.openxmlformats.org/officeDocument/2006/relationships" xmlns:w="http://schemas.openxmlformats.org/wordprocessingml/2006/main" xmlns:w14="http://schemas.microsoft.com/office/word/2010/wordml" xmlns:w15="http://schemas.microsoft.com/office/word/2012/wordml" xmlns:w16cid="http://schemas.microsoft.com/office/word/2016/wordml/cid" xmlns:w16se="http://schemas.microsoft.com/office/word/2015/wordml/symex" mc:Ignorable="w14 w15 w16se w16cid">
+<w:styles xmlns:mc="http://schemas.openxmlformats.org/markup-compatibility/2006" xmlns:r="http://schemas.openxmlformats.org/officeDocument/2006/relationships" xmlns:w="http://schemas.openxmlformats.org/wordprocessingml/2006/main" xmlns:w14="http://schemas.microsoft.com/office/word/2010/wordml" xmlns:w15="http://schemas.microsoft.com/office/word/2012/wordml" xmlns:w16cex="http://schemas.microsoft.com/office/word/2018/wordml/cex" xmlns:w16cid="http://schemas.microsoft.com/office/word/2016/wordml/cid" xmlns:w16="http://schemas.microsoft.com/office/word/2018/wordml" xmlns:w16sdtdh="http://schemas.microsoft.com/office/word/2020/wordml/sdtdatahash" xmlns:w16se="http://schemas.microsoft.com/office/word/2015/wordml/symex" mc:Ignorable="w14 w15 w16se w16cid w16 w16cex w16sdtdh">
   <w:docDefaults>
     <w:rPrDefault>
       <w:rPr>
@@ -11908,7 +13745,7 @@
       </w:pPr>
     </w:pPrDefault>
   </w:docDefaults>
-  <w:latentStyles w:defLockedState="0" w:defUIPriority="99" w:defSemiHidden="0" w:defUnhideWhenUsed="0" w:defQFormat="0" w:count="375">
+  <w:latentStyles w:defLockedState="0" w:defUIPriority="99" w:defSemiHidden="0" w:defUnhideWhenUsed="0" w:defQFormat="0" w:count="376">
     <w:lsdException w:name="Normal" w:uiPriority="0" w:qFormat="1"/>
     <w:lsdException w:name="heading 1" w:uiPriority="7" w:qFormat="1"/>
     <w:lsdException w:name="heading 2" w:uiPriority="4" w:qFormat="1"/>
@@ -12014,7 +13851,6 @@
     <w:lsdException w:name="HTML Sample" w:semiHidden="1" w:unhideWhenUsed="1"/>
     <w:lsdException w:name="HTML Typewriter" w:semiHidden="1" w:unhideWhenUsed="1"/>
     <w:lsdException w:name="HTML Variable" w:semiHidden="1" w:unhideWhenUsed="1"/>
-    <w:lsdException w:name="Normal Table" w:semiHidden="1" w:unhideWhenUsed="1"/>
     <w:lsdException w:name="annotation subject" w:semiHidden="1" w:unhideWhenUsed="1"/>
     <w:lsdException w:name="No List" w:semiHidden="1" w:unhideWhenUsed="1"/>
     <w:lsdException w:name="Outline List 1" w:semiHidden="1" w:unhideWhenUsed="1"/>
@@ -12061,10 +13897,8 @@
     <w:lsdException w:name="Table Subtle 2" w:semiHidden="1" w:unhideWhenUsed="1"/>
     <w:lsdException w:name="Table Web 1" w:semiHidden="1" w:unhideWhenUsed="1"/>
     <w:lsdException w:name="Table Web 2" w:semiHidden="1" w:unhideWhenUsed="1"/>
-    <w:lsdException w:name="Table Web 3" w:semiHidden="1" w:unhideWhenUsed="1"/>
     <w:lsdException w:name="Balloon Text" w:semiHidden="1" w:unhideWhenUsed="1"/>
     <w:lsdException w:name="Table Grid" w:uiPriority="1"/>
-    <w:lsdException w:name="Table Theme" w:semiHidden="1" w:unhideWhenUsed="1"/>
     <w:lsdException w:name="Placeholder Text" w:semiHidden="1" w:unhideWhenUsed="1"/>
     <w:lsdException w:name="No Spacing" w:semiHidden="1" w:unhideWhenUsed="1"/>
     <w:lsdException w:name="Light Shading"/>
@@ -12086,7 +13920,6 @@
     <w:lsdException w:name="Light Grid Accent 1"/>
     <w:lsdException w:name="Medium Shading 1 Accent 1"/>
     <w:lsdException w:name="Medium Shading 2 Accent 1"/>
-    <w:lsdException w:name="Medium List 1 Accent 1"/>
     <w:lsdException w:name="Revision" w:semiHidden="1"/>
     <w:lsdException w:name="List Paragraph" w:semiHidden="1" w:uiPriority="34" w:unhideWhenUsed="1" w:qFormat="1"/>
     <w:lsdException w:name="Quote" w:semiHidden="1" w:uiPriority="29" w:unhideWhenUsed="1" w:qFormat="1"/>
@@ -12284,6 +14117,7 @@
     <w:lsdException w:name="Smart Hyperlink" w:semiHidden="1" w:unhideWhenUsed="1"/>
     <w:lsdException w:name="Hashtag" w:semiHidden="1" w:unhideWhenUsed="1"/>
     <w:lsdException w:name="Unresolved Mention" w:semiHidden="1" w:unhideWhenUsed="1"/>
+    <w:lsdException w:name="Smart Link" w:semiHidden="1" w:unhideWhenUsed="1"/>
   </w:latentStyles>
   <w:style w:type="paragraph" w:default="1" w:styleId="Normal">
     <w:name w:val="Normal"/>
@@ -12854,7 +14688,7 @@
 </file>
 
 <file path=word/glossary/document.xml><?xml version="1.0" encoding="utf-8"?>
-<w:glossaryDocument xmlns:wpc="http://schemas.microsoft.com/office/word/2010/wordprocessingCanvas" xmlns:cx="http://schemas.microsoft.com/office/drawing/2014/chartex" xmlns:cx1="http://schemas.microsoft.com/office/drawing/2015/9/8/chartex" xmlns:cx2="http://schemas.microsoft.com/office/drawing/2015/10/21/chartex" xmlns:cx3="http://schemas.microsoft.com/office/drawing/2016/5/9/chartex" xmlns:cx4="http://schemas.microsoft.com/office/drawing/2016/5/10/chartex" xmlns:cx5="http://schemas.microsoft.com/office/drawing/2016/5/11/chartex" xmlns:cx6="http://schemas.microsoft.com/office/drawing/2016/5/12/chartex" xmlns:cx7="http://schemas.microsoft.com/office/drawing/2016/5/13/chartex" xmlns:cx8="http://schemas.microsoft.com/office/drawing/2016/5/14/chartex" xmlns:mc="http://schemas.openxmlformats.org/markup-compatibility/2006" xmlns:aink="http://schemas.microsoft.com/office/drawing/2016/ink" xmlns:am3d="http://schemas.microsoft.com/office/drawing/2017/model3d" xmlns:o="urn:schemas-microsoft-com:office:office" xmlns:r="http://schemas.openxmlformats.org/officeDocument/2006/relationships" xmlns:m="http://schemas.openxmlformats.org/officeDocument/2006/math" xmlns:v="urn:schemas-microsoft-com:vml" xmlns:wp14="http://schemas.microsoft.com/office/word/2010/wordprocessingDrawing" xmlns:wp="http://schemas.openxmlformats.org/drawingml/2006/wordprocessingDrawing" xmlns:w10="urn:schemas-microsoft-com:office:word" xmlns:w="http://schemas.openxmlformats.org/wordprocessingml/2006/main" xmlns:w14="http://schemas.microsoft.com/office/word/2010/wordml" xmlns:w15="http://schemas.microsoft.com/office/word/2012/wordml" xmlns:w16cid="http://schemas.microsoft.com/office/word/2016/wordml/cid" xmlns:w16se="http://schemas.microsoft.com/office/word/2015/wordml/symex" xmlns:wpg="http://schemas.microsoft.com/office/word/2010/wordprocessingGroup" xmlns:wpi="http://schemas.microsoft.com/office/word/2010/wordprocessingInk" xmlns:wne="http://schemas.microsoft.com/office/word/2006/wordml" xmlns:wps="http://schemas.microsoft.com/office/word/2010/wordprocessingShape" mc:Ignorable="w14 w15 w16se w16cid wp14">
+<w:glossaryDocument xmlns:wpc="http://schemas.microsoft.com/office/word/2010/wordprocessingCanvas" xmlns:cx="http://schemas.microsoft.com/office/drawing/2014/chartex" xmlns:cx1="http://schemas.microsoft.com/office/drawing/2015/9/8/chartex" xmlns:cx2="http://schemas.microsoft.com/office/drawing/2015/10/21/chartex" xmlns:cx3="http://schemas.microsoft.com/office/drawing/2016/5/9/chartex" xmlns:cx4="http://schemas.microsoft.com/office/drawing/2016/5/10/chartex" xmlns:cx5="http://schemas.microsoft.com/office/drawing/2016/5/11/chartex" xmlns:cx6="http://schemas.microsoft.com/office/drawing/2016/5/12/chartex" xmlns:cx7="http://schemas.microsoft.com/office/drawing/2016/5/13/chartex" xmlns:cx8="http://schemas.microsoft.com/office/drawing/2016/5/14/chartex" xmlns:mc="http://schemas.openxmlformats.org/markup-compatibility/2006" xmlns:aink="http://schemas.microsoft.com/office/drawing/2016/ink" xmlns:am3d="http://schemas.microsoft.com/office/drawing/2017/model3d" xmlns:o="urn:schemas-microsoft-com:office:office" xmlns:r="http://schemas.openxmlformats.org/officeDocument/2006/relationships" xmlns:m="http://schemas.openxmlformats.org/officeDocument/2006/math" xmlns:v="urn:schemas-microsoft-com:vml" xmlns:wp14="http://schemas.microsoft.com/office/word/2010/wordprocessingDrawing" xmlns:wp="http://schemas.openxmlformats.org/drawingml/2006/wordprocessingDrawing" xmlns:w10="urn:schemas-microsoft-com:office:word" xmlns:w="http://schemas.openxmlformats.org/wordprocessingml/2006/main" xmlns:w14="http://schemas.microsoft.com/office/word/2010/wordml" xmlns:w15="http://schemas.microsoft.com/office/word/2012/wordml" xmlns:w16cex="http://schemas.microsoft.com/office/word/2018/wordml/cex" xmlns:w16cid="http://schemas.microsoft.com/office/word/2016/wordml/cid" xmlns:w16="http://schemas.microsoft.com/office/word/2018/wordml" xmlns:w16sdtdh="http://schemas.microsoft.com/office/word/2020/wordml/sdtdatahash" xmlns:w16se="http://schemas.microsoft.com/office/word/2015/wordml/symex" xmlns:wpg="http://schemas.microsoft.com/office/word/2010/wordprocessingGroup" xmlns:wpi="http://schemas.microsoft.com/office/word/2010/wordprocessingInk" xmlns:wne="http://schemas.microsoft.com/office/word/2006/wordml" xmlns:wps="http://schemas.microsoft.com/office/word/2010/wordprocessingShape" mc:Ignorable="w14 w15 w16se w16cid w16 w16cex w16sdtdh wp14">
   <w:docParts>
     <w:docPart>
       <w:docPartPr>
@@ -12922,7 +14756,7 @@
 </file>
 
 <file path=word/glossary/fontTable.xml><?xml version="1.0" encoding="utf-8"?>
-<w:fonts xmlns:mc="http://schemas.openxmlformats.org/markup-compatibility/2006" xmlns:r="http://schemas.openxmlformats.org/officeDocument/2006/relationships" xmlns:w="http://schemas.openxmlformats.org/wordprocessingml/2006/main" xmlns:w14="http://schemas.microsoft.com/office/word/2010/wordml" xmlns:w15="http://schemas.microsoft.com/office/word/2012/wordml" xmlns:w16cid="http://schemas.microsoft.com/office/word/2016/wordml/cid" xmlns:w16se="http://schemas.microsoft.com/office/word/2015/wordml/symex" mc:Ignorable="w14 w15 w16se w16cid">
+<w:fonts xmlns:mc="http://schemas.openxmlformats.org/markup-compatibility/2006" xmlns:r="http://schemas.openxmlformats.org/officeDocument/2006/relationships" xmlns:w="http://schemas.openxmlformats.org/wordprocessingml/2006/main" xmlns:w14="http://schemas.microsoft.com/office/word/2010/wordml" xmlns:w15="http://schemas.microsoft.com/office/word/2012/wordml" xmlns:w16cex="http://schemas.microsoft.com/office/word/2018/wordml/cex" xmlns:w16cid="http://schemas.microsoft.com/office/word/2016/wordml/cid" xmlns:w16="http://schemas.microsoft.com/office/word/2018/wordml" xmlns:w16sdtdh="http://schemas.microsoft.com/office/word/2020/wordml/sdtdatahash" xmlns:w16se="http://schemas.microsoft.com/office/word/2015/wordml/symex" mc:Ignorable="w14 w15 w16se w16cid w16 w16cex w16sdtdh">
   <w:font w:name="Calibri">
     <w:panose1 w:val="020F0502020204030204"/>
     <w:charset w:val="00"/>
@@ -12999,7 +14833,7 @@
 </file>
 
 <file path=word/glossary/settings.xml><?xml version="1.0" encoding="utf-8"?>
-<w:settings xmlns:mc="http://schemas.openxmlformats.org/markup-compatibility/2006" xmlns:o="urn:schemas-microsoft-com:office:office" xmlns:r="http://schemas.openxmlformats.org/officeDocument/2006/relationships" xmlns:m="http://schemas.openxmlformats.org/officeDocument/2006/math" xmlns:v="urn:schemas-microsoft-com:vml" xmlns:w10="urn:schemas-microsoft-com:office:word" xmlns:w="http://schemas.openxmlformats.org/wordprocessingml/2006/main" xmlns:w14="http://schemas.microsoft.com/office/word/2010/wordml" xmlns:w15="http://schemas.microsoft.com/office/word/2012/wordml" xmlns:w16cid="http://schemas.microsoft.com/office/word/2016/wordml/cid" xmlns:w16se="http://schemas.microsoft.com/office/word/2015/wordml/symex" xmlns:sl="http://schemas.openxmlformats.org/schemaLibrary/2006/main" mc:Ignorable="w14 w15 w16se w16cid">
+<w:settings xmlns:mc="http://schemas.openxmlformats.org/markup-compatibility/2006" xmlns:o="urn:schemas-microsoft-com:office:office" xmlns:r="http://schemas.openxmlformats.org/officeDocument/2006/relationships" xmlns:m="http://schemas.openxmlformats.org/officeDocument/2006/math" xmlns:v="urn:schemas-microsoft-com:vml" xmlns:w10="urn:schemas-microsoft-com:office:word" xmlns:w="http://schemas.openxmlformats.org/wordprocessingml/2006/main" xmlns:w14="http://schemas.microsoft.com/office/word/2010/wordml" xmlns:w15="http://schemas.microsoft.com/office/word/2012/wordml" xmlns:w16cex="http://schemas.microsoft.com/office/word/2018/wordml/cex" xmlns:w16cid="http://schemas.microsoft.com/office/word/2016/wordml/cid" xmlns:w16="http://schemas.microsoft.com/office/word/2018/wordml" xmlns:w16sdtdh="http://schemas.microsoft.com/office/word/2020/wordml/sdtdatahash" xmlns:w16se="http://schemas.microsoft.com/office/word/2015/wordml/symex" xmlns:sl="http://schemas.openxmlformats.org/schemaLibrary/2006/main" mc:Ignorable="w14 w15 w16se w16cid w16 w16cex w16sdtdh">
   <w:view w:val="normal"/>
   <w:defaultTabStop w:val="708"/>
   <w:hyphenationZone w:val="425"/>
@@ -13017,6 +14851,7 @@
     <w:rsidRoot w:val="009B0278"/>
     <w:rsid w:val="00361E76"/>
     <w:rsid w:val="00363FB3"/>
+    <w:rsid w:val="003F6997"/>
     <w:rsid w:val="004C570A"/>
     <w:rsid w:val="005C2097"/>
     <w:rsid w:val="006A1884"/>
@@ -13049,7 +14884,7 @@
 </file>
 
 <file path=word/glossary/styles.xml><?xml version="1.0" encoding="utf-8"?>
-<w:styles xmlns:mc="http://schemas.openxmlformats.org/markup-compatibility/2006" xmlns:r="http://schemas.openxmlformats.org/officeDocument/2006/relationships" xmlns:w="http://schemas.openxmlformats.org/wordprocessingml/2006/main" xmlns:w14="http://schemas.microsoft.com/office/word/2010/wordml" xmlns:w15="http://schemas.microsoft.com/office/word/2012/wordml" xmlns:w16cid="http://schemas.microsoft.com/office/word/2016/wordml/cid" xmlns:w16se="http://schemas.microsoft.com/office/word/2015/wordml/symex" mc:Ignorable="w14 w15 w16se w16cid">
+<w:styles xmlns:mc="http://schemas.openxmlformats.org/markup-compatibility/2006" xmlns:r="http://schemas.openxmlformats.org/officeDocument/2006/relationships" xmlns:w="http://schemas.openxmlformats.org/wordprocessingml/2006/main" xmlns:w14="http://schemas.microsoft.com/office/word/2010/wordml" xmlns:w15="http://schemas.microsoft.com/office/word/2012/wordml" xmlns:w16cex="http://schemas.microsoft.com/office/word/2018/wordml/cex" xmlns:w16cid="http://schemas.microsoft.com/office/word/2016/wordml/cid" xmlns:w16="http://schemas.microsoft.com/office/word/2018/wordml" xmlns:w16sdtdh="http://schemas.microsoft.com/office/word/2020/wordml/sdtdatahash" xmlns:w16se="http://schemas.microsoft.com/office/word/2015/wordml/symex" mc:Ignorable="w14 w15 w16se w16cid w16 w16cex w16sdtdh">
   <w:docDefaults>
     <w:rPrDefault>
       <w:rPr>
@@ -13067,7 +14902,7 @@
       </w:pPr>
     </w:pPrDefault>
   </w:docDefaults>
-  <w:latentStyles w:defLockedState="0" w:defUIPriority="99" w:defSemiHidden="0" w:defUnhideWhenUsed="0" w:defQFormat="0" w:count="375">
+  <w:latentStyles w:defLockedState="0" w:defUIPriority="99" w:defSemiHidden="0" w:defUnhideWhenUsed="0" w:defQFormat="0" w:count="376">
     <w:lsdException w:name="Normal" w:uiPriority="0" w:qFormat="1"/>
     <w:lsdException w:name="heading 1" w:uiPriority="9" w:qFormat="1"/>
     <w:lsdException w:name="heading 2" w:semiHidden="1" w:uiPriority="9" w:unhideWhenUsed="1" w:qFormat="1"/>
@@ -13173,7 +15008,6 @@
     <w:lsdException w:name="HTML Sample" w:semiHidden="1" w:unhideWhenUsed="1"/>
     <w:lsdException w:name="HTML Typewriter" w:semiHidden="1" w:unhideWhenUsed="1"/>
     <w:lsdException w:name="HTML Variable" w:semiHidden="1" w:unhideWhenUsed="1"/>
-    <w:lsdException w:name="Normal Table" w:semiHidden="1" w:unhideWhenUsed="1"/>
     <w:lsdException w:name="annotation subject" w:semiHidden="1" w:unhideWhenUsed="1"/>
     <w:lsdException w:name="No List" w:semiHidden="1" w:unhideWhenUsed="1"/>
     <w:lsdException w:name="Outline List 1" w:semiHidden="1" w:unhideWhenUsed="1"/>
@@ -13220,10 +15054,8 @@
     <w:lsdException w:name="Table Subtle 2" w:semiHidden="1" w:unhideWhenUsed="1"/>
     <w:lsdException w:name="Table Web 1" w:semiHidden="1" w:unhideWhenUsed="1"/>
     <w:lsdException w:name="Table Web 2" w:semiHidden="1" w:unhideWhenUsed="1"/>
-    <w:lsdException w:name="Table Web 3" w:semiHidden="1" w:unhideWhenUsed="1"/>
     <w:lsdException w:name="Balloon Text" w:semiHidden="1" w:unhideWhenUsed="1"/>
     <w:lsdException w:name="Table Grid" w:uiPriority="39"/>
-    <w:lsdException w:name="Table Theme" w:semiHidden="1" w:unhideWhenUsed="1"/>
     <w:lsdException w:name="Placeholder Text" w:semiHidden="1"/>
     <w:lsdException w:name="No Spacing" w:uiPriority="1" w:qFormat="1"/>
     <w:lsdException w:name="Light Shading" w:uiPriority="60"/>
@@ -13443,6 +15275,7 @@
     <w:lsdException w:name="Smart Hyperlink" w:semiHidden="1" w:unhideWhenUsed="1"/>
     <w:lsdException w:name="Hashtag" w:semiHidden="1" w:unhideWhenUsed="1"/>
     <w:lsdException w:name="Unresolved Mention" w:semiHidden="1" w:unhideWhenUsed="1"/>
+    <w:lsdException w:name="Smart Link" w:semiHidden="1" w:unhideWhenUsed="1"/>
   </w:latentStyles>
   <w:style w:type="paragraph" w:default="1" w:styleId="Normal">
     <w:name w:val="Normal"/>
@@ -13517,7 +15350,7 @@
 </file>
 
 <file path=word/glossary/webSettings.xml><?xml version="1.0" encoding="utf-8"?>
-<w:webSettings xmlns:mc="http://schemas.openxmlformats.org/markup-compatibility/2006" xmlns:r="http://schemas.openxmlformats.org/officeDocument/2006/relationships" xmlns:w="http://schemas.openxmlformats.org/wordprocessingml/2006/main" xmlns:w14="http://schemas.microsoft.com/office/word/2010/wordml" xmlns:w15="http://schemas.microsoft.com/office/word/2012/wordml" xmlns:w16cid="http://schemas.microsoft.com/office/word/2016/wordml/cid" xmlns:w16se="http://schemas.microsoft.com/office/word/2015/wordml/symex" mc:Ignorable="w14 w15 w16se w16cid">
+<w:webSettings xmlns:mc="http://schemas.openxmlformats.org/markup-compatibility/2006" xmlns:r="http://schemas.openxmlformats.org/officeDocument/2006/relationships" xmlns:w="http://schemas.openxmlformats.org/wordprocessingml/2006/main" xmlns:w14="http://schemas.microsoft.com/office/word/2010/wordml" xmlns:w15="http://schemas.microsoft.com/office/word/2012/wordml" xmlns:w16cex="http://schemas.microsoft.com/office/word/2018/wordml/cex" xmlns:w16cid="http://schemas.microsoft.com/office/word/2016/wordml/cid" xmlns:w16="http://schemas.microsoft.com/office/word/2018/wordml" xmlns:w16sdtdh="http://schemas.microsoft.com/office/word/2020/wordml/sdtdatahash" xmlns:w16se="http://schemas.microsoft.com/office/word/2015/wordml/symex" mc:Ignorable="w14 w15 w16se w16cid w16 w16cex w16sdtdh">
   <w:optimizeForBrowser/>
   <w:allowPNG/>
 </w:webSettings>

</xml_diff>